<commit_message>
docs(run15): session 2026-06-09, changelog, roadmap v2
</commit_message>
<xml_diff>
--- a/docs/ROADMAP.docx
+++ b/docs/ROADMAP.docx
@@ -7,17 +7,12 @@
         <w:pStyle w:val="Heading1"/>
       </w:pPr>
       <w:r>
-        <w:t>GenAssoc / genomic-variant-classifier — Living Roadmap</w:t>
+        <w:t>GenAssoc / genomic-variant-classifier - Living Roadmap</w:t>
       </w:r>
     </w:p>
     <w:p>
       <w:r>
-        <w:t>Version: 2026-06-08 (v1, re-baselined)</w:t>
-      </w:r>
-    </w:p>
-    <w:p>
-      <w:r>
-        <w:t>Owner: Monzia Moodie</w:t>
+        <w:t>Version: 2026-06-09 (v2)  |  Owner: Monzia Moodie</w:t>
       </w:r>
     </w:p>
     <w:p>
@@ -27,47 +22,17 @@
     </w:p>
     <w:p>
       <w:r>
-        <w:t>Status of this document: authoritative source of truth; supersedes phase</w:t>
+        <w:t>*Authoritative source of truth; supersedes phase language in prior session docs. Updated at the end of every session; Drive copy via rclone genvarcla:.*</w:t>
       </w:r>
     </w:p>
     <w:p>
       <w:r>
-        <w:t>language scattered across prior session docs. To be updated at the END of every</w:t>
-      </w:r>
-    </w:p>
-    <w:p>
-      <w:r>
-        <w:t>session (see Standing Disciplines). Drive copy pushed via rclone genvarcla:.</w:t>
-      </w:r>
-    </w:p>
-    <w:p>
-      <w:r>
-        <w:t>&gt; Maintenance note (honest): this roadmap had drifted out of date — session</w:t>
-      </w:r>
-    </w:p>
-    <w:p>
-      <w:r>
-        <w:t>&gt; work (ESM-2 activation, the split-health audit, the data-source expansion) was</w:t>
-      </w:r>
-    </w:p>
-    <w:p>
-      <w:r>
-        <w:t>&gt; not being folded back in. This re-baseline fixes that and the document is now</w:t>
-      </w:r>
-    </w:p>
-    <w:p>
-      <w:r>
-        <w:t>&gt; the gating artifact, not an afterthought.</w:t>
-      </w:r>
-    </w:p>
-    <w:p>
-      <w:r>
-        <w:t>---</w:t>
+        <w:t>*v2 note: Run 15 completed (full cohort, ESM-2 mechanically active, constraint columns revived, unseen-gene-holdout ablation). Findings folded into the snapshot, data-source registry, and immediate plan below.*</w:t>
       </w:r>
     </w:p>
     <w:p>
       <w:pPr>
-        <w:pStyle w:val="Heading2"/>
+        <w:pStyle w:val="Heading1"/>
       </w:pPr>
       <w:r>
         <w:t>1. Project identity &amp; goals</w:t>
@@ -75,22 +40,7 @@
     </w:p>
     <w:p>
       <w:r>
-        <w:t>A production-grade, multi-modal genomic disease-association program. Current</w:t>
-      </w:r>
-    </w:p>
-    <w:p>
-      <w:r>
-        <w:t>core: an ACMG/AMP-style variant pathogenicity classifier over ~1.7M ClinVar</w:t>
-      </w:r>
-    </w:p>
-    <w:p>
-      <w:r>
-        <w:t>variants (2,488,903 missense in the working cohort), 78 engineered features,</w:t>
-      </w:r>
-    </w:p>
-    <w:p>
-      <w:r>
-        <w:t>an 8-model ensemble + stacking meta-learner + STRING-DB GNN + KAN.</w:t>
+        <w:t>Production-grade multi-modal genomic disease-association program. Core: an ACMG/AMP-style variant pathogenicity classifier over ~1.49M cohort rows (from ~2.49M ClinVar missense), 79 features, 13-model ensemble + stacking meta-learner + STRING-DB GNN + KAN.</w:t>
       </w:r>
     </w:p>
     <w:p>
@@ -100,43 +50,135 @@
     </w:p>
     <w:p>
       <w:pPr>
-        <w:pStyle w:val="ListNumber"/>
+        <w:pStyle w:val="ListBullet"/>
       </w:pPr>
       <w:r>
-        <w:t>Classify variants and draw statistical inferences to disease categories/phenotypes.</w:t>
+        <w:t>Classify variants and infer disease categories/phenotypes.</w:t>
       </w:r>
     </w:p>
     <w:p>
       <w:pPr>
-        <w:pStyle w:val="ListNumber"/>
+        <w:pStyle w:val="ListBullet"/>
       </w:pPr>
       <w:r>
-        <w:t>Empirically measure/compare/validate how different ML algorithms behave on</w:t>
+        <w:t>Empirically measure/compare/validate ML algorithms on large complex data, incl. KAN/GNN/GraphGPS, even at small performance differences.</w:t>
       </w:r>
     </w:p>
     <w:p>
       <w:r>
-        <w:t>large, complex, real-world data — including newer architectures (KAN, GNN, GraphGPS) —</w:t>
+        <w:t>Default stance: implement / keep / study. Never drop models/features on marginal-AUROC grounds.</w:t>
+      </w:r>
+    </w:p>
+    <w:p>
+      <w:pPr>
+        <w:pStyle w:val="Heading1"/>
+      </w:pPr>
+      <w:r>
+        <w:t>2. Phase model</w:t>
       </w:r>
     </w:p>
     <w:p>
       <w:r>
-        <w:t>even when performance differences are small.</w:t>
+        <w:t>| Phase | Name | Scope | Legacy label | State |</w:t>
       </w:r>
     </w:p>
     <w:p>
       <w:r>
-        <w:t>Default stance: implement / keep / study. Never drop models or features on</w:t>
+        <w:t>| --- | --- | --- | --- | --- |</w:t>
       </w:r>
     </w:p>
     <w:p>
       <w:r>
-        <w:t>marginal-AUROC grounds. Data is central; maximize information.</w:t>
+        <w:t>| F | Foundation | Bug-fixed core, ensemble+GNN+KAN, real ClinVar | Phase 1 / Phase 0 | DONE |</w:t>
       </w:r>
     </w:p>
     <w:p>
       <w:r>
-        <w:t>---</w:t>
+        <w:t>| D | Data expansion | Wire sources; activate dead columns; add new sources | Phase 2 (partly) | IN PROGRESS |</w:t>
+      </w:r>
+    </w:p>
+    <w:p>
+      <w:r>
+        <w:t>| P | Performance/infra | Polars layer; Rust inference service | roadmap 3/5 | NOT STARTED |</w:t>
+      </w:r>
+    </w:p>
+    <w:p>
+      <w:r>
+        <w:t>| A | Advanced modeling | Julia training, VAE, Bayesian UQ, GraphGPS | roadmap 4 | NOT STARTED |</w:t>
+      </w:r>
+    </w:p>
+    <w:p>
+      <w:r>
+        <w:t>| X | Productionization | REST API, Docker, clinical eval/report | Phase 2 (API/Docker) | NOT STARTED |</w:t>
+      </w:r>
+    </w:p>
+    <w:p>
+      <w:r>
+        <w:t>*We are in Phase D (data expansion). Foundation is done.*</w:t>
+      </w:r>
+    </w:p>
+    <w:p>
+      <w:pPr>
+        <w:pStyle w:val="Heading1"/>
+      </w:pPr>
+      <w:r>
+        <w:t>3. Current state snapshot (2026-06-09)</w:t>
+      </w:r>
+    </w:p>
+    <w:p>
+      <w:pPr>
+        <w:pStyle w:val="ListBullet"/>
+      </w:pPr>
+      <w:r>
+        <w:t>Run 15 SEALED (commit 032a2ab): Test AUROC 0.9984, Val 0.9983, AUPRC 0.9935/0.9919, MCC 0.9655/0.9614, Brier 0.0069/0.0071. Cohort Train 1,038,974 / Val 146,329 / Test 304,711; 79 features. ~11.5 h on RTX 4090, ~$6.</w:t>
+      </w:r>
+    </w:p>
+    <w:p>
+      <w:pPr>
+        <w:pStyle w:val="ListBullet"/>
+      </w:pPr>
+      <w:r>
+        <w:t>Unseen-gene-holdout ablation: ENSEMBLE_STACKER AUROC 0.9988 on 213,436 rows / 2,407 gene-disjoint genes (C3 falsifier (b) PASS vs 0.95). Strong generalization to unseen genes; the corpus-scope leakage question on n_pathogenic_in_gene remains open (see §5).</w:t>
+      </w:r>
+    </w:p>
+    <w:p>
+      <w:pPr>
+        <w:pStyle w:val="ListBullet"/>
+      </w:pPr>
+      <w:r>
+        <w:t>ESM-2 mechanically active (local UniProt index, no run-time REST, GPU auto-detect; commits 7b267ea/032a2ab) BUT coverage is only ~3,451/~1.49M (HGVSp-parser gap). esm2_delta_norm is ~99.7% zero in the full run; current AUROCs rest on tabular + constraint features.</w:t>
+      </w:r>
+    </w:p>
+    <w:p>
+      <w:pPr>
+        <w:pStyle w:val="ListBullet"/>
+      </w:pPr>
+      <w:r>
+        <w:t>gene_constraint_oe REVIVED (Run-14 all-zero -&gt; Run-15 #2 feature) via loeuf-&gt;oe derivation patch. gnn_score REAL (non-degeneracy gate PASS). cnn_1d (0.85) and kan (0.996) recovered from smoke underfit.</w:t>
+      </w:r>
+    </w:p>
+    <w:p>
+      <w:pPr>
+        <w:pStyle w:val="ListBullet"/>
+      </w:pPr>
+      <w:r>
+        <w:t>AlphaMissense OOM fixed (325b0d2, re-validated): 71.7M rows parsed in ~2 min via cohort-filter-during-parse.</w:t>
+      </w:r>
+    </w:p>
+    <w:p>
+      <w:pPr>
+        <w:pStyle w:val="ListBullet"/>
+      </w:pPr>
+      <w:r>
+        <w:t>Suite: 804 passed / 1 skipped.</w:t>
+      </w:r>
+    </w:p>
+    <w:p>
+      <w:pPr>
+        <w:pStyle w:val="Heading1"/>
+      </w:pPr>
+      <w:r>
+        <w:t>4. Data-source registry</w:t>
       </w:r>
     </w:p>
     <w:p>
@@ -144,82 +186,12 @@
         <w:pStyle w:val="Heading2"/>
       </w:pPr>
       <w:r>
-        <w:t>2. Phase model (PROPOSED canonical — pending Monzia's sign-off)</w:t>
+        <w:t>4A. Wired &amp; healthy</w:t>
       </w:r>
     </w:p>
     <w:p>
       <w:r>
-        <w:t>Prior docs use three conflicting numbering schemes (PHASE_1_ASSESSMENT's</w:t>
-      </w:r>
-    </w:p>
-    <w:p>
-      <w:r>
-        <w:t>"Phase 1 bugfix -&gt; Phase 2 VEP/SpliceAI/AM"; a "Phase 0 foundation" framing; and</w:t>
-      </w:r>
-    </w:p>
-    <w:p>
-      <w:r>
-        <w:t>a "Phase 2 = 7 databases" framing). They cannot all be right. Proposed single</w:t>
-      </w:r>
-    </w:p>
-    <w:p>
-      <w:r>
-        <w:t>scheme, mapping the legacy labels onto it:</w:t>
-      </w:r>
-    </w:p>
-    <w:p>
-      <w:r>
-        <w:t>| Phase | Name | Scope | Legacy label it absorbs | State |</w:t>
-      </w:r>
-    </w:p>
-    <w:p>
-      <w:r>
-        <w:t>|-------|------|-------|-------------------------|-------|</w:t>
-      </w:r>
-    </w:p>
-    <w:p>
-      <w:r>
-        <w:t>| F | Foundation | Bug-fixed core pipeline, 8-model ensemble + GNN + KAN, real ClinVar, run discipline | "Phase 1" (bugfix), "Phase 0" | LARGELY DONE (Run 14/15) |</w:t>
-      </w:r>
-    </w:p>
-    <w:p>
-      <w:r>
-        <w:t>| D | Data expansion | Wire annotation sources; activate dead feature columns; add new sources | "Phase 2 (VEP/SpliceAI/AM)" partly done; "Phase 2 = 7 databases" | IN PROGRESS (this is where we are) |</w:t>
-      </w:r>
-    </w:p>
-    <w:p>
-      <w:r>
-        <w:t>| P | Performance/infra | Polars data layer, Rust inference microservice | roadmap "Phase 3/5" | NOT STARTED |</w:t>
-      </w:r>
-    </w:p>
-    <w:p>
-      <w:r>
-        <w:t>| A | Advanced modeling | Julia custom training, VAE, Bayesian UQ, GraphGPS/GNN opts | roadmap "Phase 4" | NOT STARTED |</w:t>
-      </w:r>
-    </w:p>
-    <w:p>
-      <w:r>
-        <w:t>| X | Productionization | REST API, Docker deploy, clinical eval/report hardening | "Phase 2 (API/Docker)" framing | NOT STARTED |</w:t>
-      </w:r>
-    </w:p>
-    <w:p>
-      <w:r>
-        <w:t>&gt; So the honest answer to "are we still in Phase 1?": the foundation is done; we</w:t>
-      </w:r>
-    </w:p>
-    <w:p>
-      <w:r>
-        <w:t>&gt; are in Phase D (data expansion). The label confusion is exactly why this</w:t>
-      </w:r>
-    </w:p>
-    <w:p>
-      <w:r>
-        <w:t>&gt; table exists. Adjust the names/letters if you prefer; then this is canonical.</w:t>
-      </w:r>
-    </w:p>
-    <w:p>
-      <w:r>
-        <w:t>---</w:t>
+        <w:t>ClinVar (labels+cohort), gnomAD v4 (LOEUF, pLI, AF, mis_z, syn_z, gene_constraint_oe), AlphaMissense, SpliceAI, dbNSFP (SIFT/CADD/REVEL/GERP/PolyPhen), STRING-DB v12 (GNN -&gt; gnn_score, confirmed real), n_pathogenic_in_gene, Reactome (reactome_pathway_count, wired 2026-06-08).</w:t>
       </w:r>
     </w:p>
     <w:p>
@@ -227,179 +199,22 @@
         <w:pStyle w:val="Heading2"/>
       </w:pPr>
       <w:r>
-        <w:t>3. Current state snapshot (2026-06-08)</w:t>
-      </w:r>
-    </w:p>
-    <w:p>
-      <w:pPr>
-        <w:pStyle w:val="ListBullet"/>
-      </w:pPr>
-      <w:r>
-        <w:t>Run 14 sealed (Test AUROC 0.9975, OOF blend 0.9985, KAN OOF 0.9921, $2.17).</w:t>
-      </w:r>
-    </w:p>
-    <w:p>
-      <w:pPr>
-        <w:pStyle w:val="ListBullet"/>
-      </w:pPr>
-      <w:r>
-        <w:t>Run 15 splits exist at outputs/run15_rerun_report/full/splits/ (9 parquets:</w:t>
+        <w:t>4B. Scaffolded but DEAD / partial (Phase D targets)</w:t>
       </w:r>
     </w:p>
     <w:p>
       <w:r>
-        <w:t>X/meta/y x train/val/test; train 1,038,974 / val 146,329 / test 304,711; X=78 cols).</w:t>
-      </w:r>
-    </w:p>
-    <w:p>
-      <w:pPr>
-        <w:pStyle w:val="ListBullet"/>
-      </w:pPr>
-      <w:r>
-        <w:t>ESM-2 activation in flight: batched + device path shipped (5a4d103),</w:t>
+        <w:t>| Source | Dead/partial column(s) | Access | Note |</w:t>
       </w:r>
     </w:p>
     <w:p>
       <w:r>
-        <w:t>equivalence-gated; CPU confirmed compute-bound (38.9 ms/variant at 4 physical</w:t>
+        <w:t>| --- | --- | --- | --- |</w:t>
       </w:r>
     </w:p>
     <w:p>
       <w:r>
-        <w:t>cores; ~31 h full-cohort CPU) -&gt; GPU regen is the chosen path. 18,621/19,383</w:t>
-      </w:r>
-    </w:p>
-    <w:p>
-      <w:r>
-        <w:t>cohort genes (96.1%) prefetched into esm2_cache.sqlite.</w:t>
-      </w:r>
-    </w:p>
-    <w:p>
-      <w:pPr>
-        <w:pStyle w:val="ListBullet"/>
-      </w:pPr>
-      <w:r>
-        <w:t>Split-health audit (scripts/audit_split_feature_health.py): of 96 columns,</w:t>
-      </w:r>
-    </w:p>
-    <w:p>
-      <w:r>
-        <w:t>54 healthy / 42 degenerate. Splits predate the HGVSp/coords step (8696ede)</w:t>
-      </w:r>
-    </w:p>
-    <w:p>
-      <w:r>
-        <w:t>and the ESM-2 device path, so they are stale. gnn_score is HEALTHY here</w:t>
-      </w:r>
-    </w:p>
-    <w:p>
-      <w:r>
-        <w:t>(the Run-14 merge-back zero is not present). Full categorization in</w:t>
-      </w:r>
-    </w:p>
-    <w:p>
-      <w:r>
-        <w:t>docs/SPLIT_HEALTH_2026-06-08.md.</w:t>
-      </w:r>
-    </w:p>
-    <w:p>
-      <w:pPr>
-        <w:pStyle w:val="ListBullet"/>
-      </w:pPr>
-      <w:r>
-        <w:t>Known code anomaly: gene_constraint_oe / gene_is_constrained ALL_ZERO</w:t>
-      </w:r>
-    </w:p>
-    <w:p>
-      <w:r>
-        <w:t>while loeuf/pli_score (same source) are healthy — suspected superseded</w:t>
-      </w:r>
-    </w:p>
-    <w:p>
-      <w:r>
-        <w:t>schema columns. Tracer: scripts/diagnose_constraint_columns.py.</w:t>
-      </w:r>
-    </w:p>
-    <w:p>
-      <w:pPr>
-        <w:pStyle w:val="ListBullet"/>
-      </w:pPr>
-      <w:r>
-        <w:t>Suite: 775 passed / 6 skipped (torch_geometric Windows DLL importorskip).</w:t>
-      </w:r>
-    </w:p>
-    <w:p>
-      <w:r>
-        <w:t>---</w:t>
-      </w:r>
-    </w:p>
-    <w:p>
-      <w:pPr>
-        <w:pStyle w:val="Heading2"/>
-      </w:pPr>
-      <w:r>
-        <w:t>4. Data-source registry (THE answer to "can X be wired?")</w:t>
-      </w:r>
-    </w:p>
-    <w:p>
-      <w:r>
-        <w:t>Honest triage. "Level" = where the signal attaches. "Fit" reflects relevance to</w:t>
-      </w:r>
-    </w:p>
-    <w:p>
-      <w:r>
-        <w:t>*this* variant-pathogenicity feature model, not the resource's general value.</w:t>
-      </w:r>
-    </w:p>
-    <w:p>
-      <w:pPr>
-        <w:pStyle w:val="Heading3"/>
-      </w:pPr>
-      <w:r>
-        <w:t>4A. Wired &amp; healthy (producing signal today)</w:t>
-      </w:r>
-    </w:p>
-    <w:p>
-      <w:r>
-        <w:t>ClinVar (labels + cohort), gnomAD v4 (LOEUF, pLI, AF), AlphaMissense, SpliceAI</w:t>
-      </w:r>
-    </w:p>
-    <w:p>
-      <w:r>
-        <w:t>(splice_ai_score, is_splice), dbNSFP (SIFT, CADD, REVEL, GERP, PolyPhen),</w:t>
-      </w:r>
-    </w:p>
-    <w:p>
-      <w:r>
-        <w:t>STRING-DB v12 (GNN graph -&gt; gnn_score), ClinVar-derived n_pathogenic_in_gene.</w:t>
-      </w:r>
-    </w:p>
-    <w:p>
-      <w:pPr>
-        <w:pStyle w:val="Heading3"/>
-      </w:pPr>
-      <w:r>
-        <w:t>4B. Scaffolded but DEAD — column exists, source not wired (Phase D targets)</w:t>
-      </w:r>
-    </w:p>
-    <w:p>
-      <w:r>
-        <w:t>| Source | Dead column(s) | Access | Note |</w:t>
-      </w:r>
-    </w:p>
-    <w:p>
-      <w:r>
-        <w:t>|--------|----------------|--------|------|</w:t>
-      </w:r>
-    </w:p>
-    <w:p>
-      <w:r>
-        <w:t>| ESM-2 | esm2_delta_norm | local model + cache | UNBLOCKING NOW (GPU regen) |</w:t>
-      </w:r>
-    </w:p>
-    <w:p>
-      <w:r>
-        <w:t>| (schema) | gene_constraint_oe, gene_is_constrained | n/a | vestige; fix via tracer |</w:t>
+        <w:t>| ESM-2 | esm2_delta_norm | local model+index | MECHANICALLY ACTIVE; coverage ~3,451 only -&gt; gated on HGVSp parser |</w:t>
       </w:r>
     </w:p>
     <w:p>
@@ -419,22 +234,27 @@
     </w:p>
     <w:p>
       <w:r>
-        <w:t>| dbSNP / RefSNP | dbsnp_af | free | rsID + common-variant + AF |</w:t>
+        <w:t>| dbSNP/RefSNP | dbsnp_af | free | stub-mode step; activation = data + config |</w:t>
       </w:r>
     </w:p>
     <w:p>
       <w:r>
-        <w:t>| OMIM | omim_* (2) | license (free academic w/ registration) | disease/inheritance |</w:t>
+        <w:t>| AlphaFold structure | alphafold_plddt, solvent_accessibility, secondary_structure_context, dist_to_active_site, has_uniprot_annotation | free (AlphaFold DB) | stub-mode step; activation = data + config |</w:t>
       </w:r>
     </w:p>
     <w:p>
       <w:r>
-        <w:t>| ClinGen | clingen_validity_score | free API | gene-disease validity |</w:t>
+        <w:t>| OMIM | omim_* (2) | free academic w/ reg. | disease/inheritance |</w:t>
       </w:r>
     </w:p>
     <w:p>
       <w:r>
-        <w:t>| FinnGen | finngen_* (3) | free (summary) | population enrichment |</w:t>
+        <w:t>| ClinGen | clingen_validity_score | free API | dtype drift: int vs float across prep/inference - fix before regen |</w:t>
+      </w:r>
+    </w:p>
+    <w:p>
+      <w:r>
+        <w:t>| FinnGen | finngen_* (3) | free summary | population enrichment |</w:t>
       </w:r>
     </w:p>
     <w:p>
@@ -449,17 +269,12 @@
     </w:p>
     <w:p>
       <w:r>
-        <w:t>| Protein structure | alphafold_plddt, solvent_accessibility, secondary_structure_context, dist_to_active_site, has_uniprot_annotation | free (AlphaFold DB) | see 4C |</w:t>
+        <w:t>| EVE | eve_score | free score files | needs score files + HGVSp coords |</w:t>
       </w:r>
     </w:p>
     <w:p>
       <w:r>
-        <w:t>| EVE | eve_score | free score files | needs the score files |</w:t>
-      </w:r>
-    </w:p>
-    <w:p>
-      <w:r>
-        <w:t>| HGMD | hgmd_* (2) | PAID, procurement-blocked | label-leakage rules apply |</w:t>
+        <w:t>| HGMD | hgmd_* (2) | PAID, blocked | label-leakage rules |</w:t>
       </w:r>
     </w:p>
     <w:p>
@@ -468,126 +283,8 @@
       </w:r>
     </w:p>
     <w:p>
-      <w:pPr>
-        <w:pStyle w:val="Heading3"/>
-      </w:pPr>
       <w:r>
-        <w:t>4C. New candidates assessed (incl. your latest list) — honest verdicts</w:t>
-      </w:r>
-    </w:p>
-    <w:p>
-      <w:r>
-        <w:t>| Source | Fit | Level | Access / license (verified) | Effort | Verdict |</w:t>
-      </w:r>
-    </w:p>
-    <w:p>
-      <w:r>
-        <w:t>|--------|-----|-------|------------------------------|--------|---------|</w:t>
-      </w:r>
-    </w:p>
-    <w:p>
-      <w:r>
-        <w:t>| AlphaFold DB | HIGH | residue/protein | free; per-UniProt model with pLDDT; bulk download | Moderate | DO — revives the entire dead structure block (DSSP -&gt; SS + accessibility; UniProt features -&gt; active site) |</w:t>
-      </w:r>
-    </w:p>
-    <w:p>
-      <w:r>
-        <w:t>| RefSNP / dbSNP | HIGH | variant | free | Low | DO — directly fills dbsnp_af + adds common-variant flag |</w:t>
-      </w:r>
-    </w:p>
-    <w:p>
-      <w:r>
-        <w:t>| COSMIC | HIGH | variant/gene | free academic w/ registration; commercial licensed | Moderate | DO (academic) — somatic recurrence/hotspots; treat as feature NOT label (leakage) |</w:t>
-      </w:r>
-    </w:p>
-    <w:p>
-      <w:r>
-        <w:t>| TCGA | MED-HIGH | gene/variant | open tier free via GDC; controlled tier via dbGaP | Moderate | OPTIONAL — somatic recurrence + expression context; controlled parts blocked |</w:t>
-      </w:r>
-    </w:p>
-    <w:p>
-      <w:r>
-        <w:t>| Reactome | MED | gene/pathway | free, open | Low-Med | OPTIONAL — pathway-membership features + GNN edge augmentation |</w:t>
-      </w:r>
-    </w:p>
-    <w:p>
-      <w:r>
-        <w:t>| KEGG | MED | gene/pathway | API free academic; bulk FTP licensed | Low-Med | OPTIONAL — overlaps Reactome; mind bulk license |</w:t>
-      </w:r>
-    </w:p>
-    <w:p>
-      <w:r>
-        <w:t>| BioGRID | MED | gene/interaction | free | Low-Med | OPTIONAL — interaction edges; OVERLAPS STRING (marginal) |</w:t>
-      </w:r>
-    </w:p>
-    <w:p>
-      <w:r>
-        <w:t>| DepMap | MED | gene | free CSV (quarterly, ~1,320+ lines, Chronos/CERES) | Low | OPTIONAL — gene essentiality; ablate vs LOEUF/pLI for redundancy |</w:t>
-      </w:r>
-    </w:p>
-    <w:p>
-      <w:r>
-        <w:t>| CPTAC | MED | gene/protein | processed tables open via cptac pip pkg (CC-BY-NC-ND); raw via dbGaP | High | LATER — cancer proteomics; non-commercial license; heavy MS matrices |</w:t>
-      </w:r>
-    </w:p>
-    <w:p>
-      <w:r>
-        <w:t>| dbGaP | n/a | (gateway) | controlled — needs eRA Commons + DAR + institutional Signing Official; BLOCKED w/o R1 faculty sponsor | n/a | NOT A SOURCE — it is the access gate for TOPMed/controlled-TCGA/CPTAC-protected |</w:t>
-      </w:r>
-    </w:p>
-    <w:p>
-      <w:r>
-        <w:t>| ProteomeXchange | LOW | dataset index | free | High | SKIP for now — federation of MS repos (PRIDE/PeptideAtlas/MassIVE/jPOST); dataset-discovery, not a clean feature; CPTAC covers the useful slice |</w:t>
-      </w:r>
-    </w:p>
-    <w:p>
-      <w:r>
-        <w:t>| SRA / ENA / DDBJ DRA | OUT | raw reads | free | Very high | SKIP — INSDC raw-sequencing archives; not annotation features unless the project pivots to reprocessing raw reads |</w:t>
-      </w:r>
-    </w:p>
-    <w:p>
-      <w:r>
-        <w:t>| SILVA | OUT | rRNA taxonomy | free | n/a | SKIP — ribosomal-RNA / microbial taxonomy DB; not relevant to human variant pathogenicity |</w:t>
-      </w:r>
-    </w:p>
-    <w:p>
-      <w:r>
-        <w:t>Reading of your list: strong direct fits are **AlphaFold DB, RefSNP/dbSNP,</w:t>
-      </w:r>
-    </w:p>
-    <w:p>
-      <w:r>
-        <w:t>COSMIC, TCGA, Reactome/KEGG; BioGRID** is graph augmentation that overlaps</w:t>
-      </w:r>
-    </w:p>
-    <w:p>
-      <w:r>
-        <w:t>STRING; dbGaP is an access prerequisite (and blocked), not a connector;</w:t>
-      </w:r>
-    </w:p>
-    <w:p>
-      <w:r>
-        <w:t>ProteomeXchange/SRA/ENA/DDBJ-DRA/SILVA do not produce variant-pathogenicity</w:t>
-      </w:r>
-    </w:p>
-    <w:p>
-      <w:r>
-        <w:t>features for this model and are out of scope absent a pipeline pivot. Including a</w:t>
-      </w:r>
-    </w:p>
-    <w:p>
-      <w:r>
-        <w:t>source for the "study many features" goal is fine — but raw-read archives and</w:t>
-      </w:r>
-    </w:p>
-    <w:p>
-      <w:r>
-        <w:t>rRNA taxonomy do not yield variant features without a different pipeline.</w:t>
-      </w:r>
-    </w:p>
-    <w:p>
-      <w:r>
-        <w:t>---</w:t>
+        <w:t>*Note: gene_constraint_oe / gene_is_constrained moved OUT of 4B (constraint vestige resolved; oe now healthy and #2 feature).*</w:t>
       </w:r>
     </w:p>
     <w:p>
@@ -595,33 +292,20 @@
         <w:pStyle w:val="Heading2"/>
       </w:pPr>
       <w:r>
-        <w:t>5. Immediate plan</w:t>
+        <w:t>4C. New candidates - verdicts (unchanged from v1)</w:t>
+      </w:r>
+    </w:p>
+    <w:p>
+      <w:r>
+        <w:t>Strong fits: AlphaFold DB (DO), RefSNP/dbSNP (DO), COSMIC (DO, academic; feature NOT label), TCGA (OPTIONAL), Reactome (DONE), KEGG (OPTIONAL, overlaps Reactome). BioGRID overlaps STRING. dbGaP is an access prerequisite (blocked), not a connector. ProteomeXchange / SRA / ENA / DDBJ DRA / SILVA out of scope.</w:t>
       </w:r>
     </w:p>
     <w:p>
       <w:pPr>
-        <w:pStyle w:val="ListNumber"/>
+        <w:pStyle w:val="Heading1"/>
       </w:pPr>
       <w:r>
-        <w:t>Fix the constraint vestige — run diagnose_constraint_columns.py; drop or</w:t>
-      </w:r>
-    </w:p>
-    <w:p>
-      <w:r>
-        <w:t>alias gene_constraint_oe/gene_is_constrained so the regen doesn't reproduce</w:t>
-      </w:r>
-    </w:p>
-    <w:p>
-      <w:r>
-        <w:t>a zero column.</w:t>
-      </w:r>
-    </w:p>
-    <w:p>
-      <w:pPr>
-        <w:pStyle w:val="ListNumber"/>
-      </w:pPr>
-      <w:r>
-        <w:t>Regen strategy decision (open):</w:t>
+        <w:t>5. Immediate plan</w:t>
       </w:r>
     </w:p>
     <w:p>
@@ -629,12 +313,7 @@
         <w:pStyle w:val="ListBullet"/>
       </w:pPr>
       <w:r>
-        <w:t>(A) ESM-2-only regen now — fastest to a Run-15 retrain with ESM-2 signal;</w:t>
-      </w:r>
-    </w:p>
-    <w:p>
-      <w:r>
-        <w:t>a second regen later for new sources.</w:t>
+        <w:t>HGVSp parser (highest leverage, empirically confirmed by Run 15): populate protein_pos/wt_aa/mut_aa across the cohort to lift ESM-2 (and EVE) coverage from ~3,451 to ~1M. Until then ESM-2 carries no real full-run signal.</w:t>
       </w:r>
     </w:p>
     <w:p>
@@ -642,86 +321,36 @@
         <w:pStyle w:val="ListBullet"/>
       </w:pPr>
       <w:r>
-        <w:t>(B) Wire a Phase-D batch first, then one comprehensive regen — e.g.</w:t>
-      </w:r>
-    </w:p>
-    <w:p>
-      <w:r>
-        <w:t>AlphaFold-structure + dbSNP + PhyloP + GTEx + 1KGP (+ optionally DepMap/COSMIC),</w:t>
-      </w:r>
-    </w:p>
-    <w:p>
-      <w:r>
-        <w:t>all banked in one GPU pass. More upfront connector work; avoids paying for the</w:t>
-      </w:r>
-    </w:p>
-    <w:p>
-      <w:r>
-        <w:t>regen twice; serves the maximize-information goal.</w:t>
+        <w:t>n_pathogenic_in_gene computation-scope audit: confirm train-only-per-fold vs corpus-wide; recompute train-only if corpus-wide, to close the leakage question the UGH 0.9988 result left open.</w:t>
       </w:r>
     </w:p>
     <w:p>
       <w:pPr>
-        <w:pStyle w:val="ListNumber"/>
+        <w:pStyle w:val="ListBullet"/>
       </w:pPr>
       <w:r>
-        <w:t>GPU regen (measure-first): prep coords locally (cheap CPU lookups; sequences</w:t>
-      </w:r>
-    </w:p>
-    <w:p>
-      <w:r>
-        <w:t>pre-cached, no UniProt on the box), ship variant frame + esm2_cache.sqlite to a</w:t>
-      </w:r>
-    </w:p>
-    <w:p>
-      <w:r>
-        <w:t>cheap 4090, run a short --device cuda throughput probe and QUOTE the measured</w:t>
-      </w:r>
-    </w:p>
-    <w:p>
-      <w:r>
-        <w:t>number before committing, forward-only regen with incremental checkpointing,</w:t>
-      </w:r>
-    </w:p>
-    <w:p>
-      <w:r>
-        <w:t>rebuild splits, echo y | vastai destroy (separate re-paste block).</w:t>
+        <w:t>Fix clingen_validity_score dtype drift (int in real_data_prep vs float in variant_ensemble) before the next regen.</w:t>
       </w:r>
     </w:p>
     <w:p>
       <w:pPr>
-        <w:pStyle w:val="ListNumber"/>
+        <w:pStyle w:val="ListBullet"/>
       </w:pPr>
       <w:r>
-        <w:t>AFTER check: re-run audit_split_feature_health.py; ESM-2 + the 3 ALL_NULL</w:t>
-      </w:r>
-    </w:p>
-    <w:p>
-      <w:r>
-        <w:t>prerequisites must flip healthy; the 54 healthy must stay healthy.</w:t>
+        <w:t>Remaining Phase-D connectors: activate dbSNP + AlphaFold-structure stub steps (data + config), then build COSMIC / TCGA / KEGG.</w:t>
       </w:r>
     </w:p>
     <w:p>
       <w:pPr>
-        <w:pStyle w:val="ListNumber"/>
+        <w:pStyle w:val="ListBullet"/>
       </w:pPr>
       <w:r>
-        <w:t>ALL-MODELS smoke (tiny --max-train, no --skip, every model incl GNN/KAN)</w:t>
-      </w:r>
-    </w:p>
-    <w:p>
-      <w:r>
-        <w:t>before the Run-15 retrain.</w:t>
-      </w:r>
-    </w:p>
-    <w:p>
-      <w:r>
-        <w:t>---</w:t>
+        <w:t>One comprehensive GPU regen after the accessible public connectors are wired; measure-first probe; ALL-MODELS smoke before any billable retrain.</w:t>
       </w:r>
     </w:p>
     <w:p>
       <w:pPr>
-        <w:pStyle w:val="Heading2"/>
+        <w:pStyle w:val="Heading1"/>
       </w:pPr>
       <w:r>
         <w:t>6. Modeling &amp; infra roadmap</w:t>
@@ -732,17 +361,7 @@
         <w:pStyle w:val="ListBullet"/>
       </w:pPr>
       <w:r>
-        <w:t>Ensemble: RF, XGBoost, LightGBM, SVM, LR, GBM, 1D-CNN, TabularNN + stacking</w:t>
-      </w:r>
-    </w:p>
-    <w:p>
-      <w:r>
-        <w:t>meta-learner; CatBoost; MC-Dropout; Deep Ensemble. Per-model algorithm comparison</w:t>
-      </w:r>
-    </w:p>
-    <w:p>
-      <w:r>
-        <w:t>documented every run.</w:t>
+        <w:t>Ensemble: RF, XGBoost, LightGBM, SVM (nystrom + bagged_rbf), LR, GBM, 1D-CNN, TabularNN + meta-learner; CatBoost; MC-Dropout; Deep Ensemble; KAN. Per-model comparison every run.</w:t>
       </w:r>
     </w:p>
     <w:p>
@@ -750,22 +369,7 @@
         <w:pStyle w:val="ListBullet"/>
       </w:pPr>
       <w:r>
-        <w:t>GNN (Phase D/A): fix-already-confirmed gnn_score healthy in Run-15; opts =</w:t>
-      </w:r>
-    </w:p>
-    <w:p>
-      <w:r>
-        <w:t>bf16 AMP (NOT fp16 on Ada/cc8.9), PyG SparseTensor/CSR, GraphGPS hybrid</w:t>
-      </w:r>
-    </w:p>
-    <w:p>
-      <w:r>
-        <w:t>(GPSConv wrapping GATConv + Performer), Laplacian PE/RWSE, 3-channel STRING</w:t>
-      </w:r>
-    </w:p>
-    <w:p>
-      <w:r>
-        <w:t>weights. GPU-only; 2-epoch probe before any full run.</w:t>
+        <w:t>GNN (Phase D/A): bf16 AMP, PyG SparseTensor/CSR, GraphGPS, Laplacian PE/RWSE, 3-channel STRING weights. GPU-only; 2-epoch probe first.</w:t>
       </w:r>
     </w:p>
     <w:p>
@@ -773,7 +377,7 @@
         <w:pStyle w:val="ListBullet"/>
       </w:pPr>
       <w:r>
-        <w:t>KAN: reinstated (imodelsx, instance-attribute fix). Study vs MLP/trees.</w:t>
+        <w:t>CatBoost GPU-memory hardening (empty_cache between families / expandable_segments / order before torch models).</w:t>
       </w:r>
     </w:p>
     <w:p>
@@ -781,36 +385,15 @@
         <w:pStyle w:val="ListBullet"/>
       </w:pPr>
       <w:r>
-        <w:t>Performance (Phase P): Polars data layer; Rust inference microservice.</w:t>
+        <w:t>Performance (P): Polars; Rust inference service. Advanced (A): Julia, VAE, Bayesian UQ. Productionization (X): REST API, Docker, clinical eval/report.</w:t>
       </w:r>
     </w:p>
     <w:p>
       <w:pPr>
-        <w:pStyle w:val="ListBullet"/>
+        <w:pStyle w:val="Heading1"/>
       </w:pPr>
       <w:r>
-        <w:t>Advanced (Phase A): Julia training, VAE, Bayesian UQ.</w:t>
-      </w:r>
-    </w:p>
-    <w:p>
-      <w:pPr>
-        <w:pStyle w:val="ListBullet"/>
-      </w:pPr>
-      <w:r>
-        <w:t>Productionization (Phase X): REST API, Docker, clinical eval/report.</w:t>
-      </w:r>
-    </w:p>
-    <w:p>
-      <w:r>
-        <w:t>---</w:t>
-      </w:r>
-    </w:p>
-    <w:p>
-      <w:pPr>
-        <w:pStyle w:val="Heading2"/>
-      </w:pPr>
-      <w:r>
-        <w:t>7. Standing disciplines (condensed; full text in session docs)</w:t>
+        <w:t>7. Standing disciplines</w:t>
       </w:r>
     </w:p>
     <w:p>
@@ -826,7 +409,7 @@
         <w:pStyle w:val="ListBullet"/>
       </w:pPr>
       <w:r>
-        <w:t>Measure-first (no time estimates without a probe); ALL-MODELS smoke before training.</w:t>
+        <w:t>Measure-first (no estimates without a probe); ALL-MODELS smoke before training.</w:t>
       </w:r>
     </w:p>
     <w:p>
@@ -834,7 +417,7 @@
         <w:pStyle w:val="ListBullet"/>
       </w:pPr>
       <w:r>
-        <w:t>Incremental checkpointing on long runs; irreversible/cloud cmds in separate re-paste.</w:t>
+        <w:t>Incremental checkpointing; irreversible/cloud cmds in separate re-paste blocks.</w:t>
       </w:r>
     </w:p>
     <w:p>
@@ -850,7 +433,15 @@
         <w:pStyle w:val="ListBullet"/>
       </w:pPr>
       <w:r>
-        <w:t>Document every run (algorithm comparison + living metrics glossary); keep THIS roadmap current.</w:t>
+        <w:t>Background launch over SSH uses &lt; /dev/null; read-only SSH checks use -n -o ConnectTimeout=20 -o BatchMode=yes; single-quoted SSH bodies; single-word grep patterns.</w:t>
+      </w:r>
+    </w:p>
+    <w:p>
+      <w:pPr>
+        <w:pStyle w:val="ListBullet"/>
+      </w:pPr>
+      <w:r>
+        <w:t>Document every run (algorithm comparison + metrics glossary); keep this roadmap current.</w:t>
       </w:r>
     </w:p>
     <w:p>
@@ -862,13 +453,8 @@
       </w:r>
     </w:p>
     <w:p>
-      <w:r>
-        <w:t>---</w:t>
-      </w:r>
-    </w:p>
-    <w:p>
       <w:pPr>
-        <w:pStyle w:val="Heading2"/>
+        <w:pStyle w:val="Heading1"/>
       </w:pPr>
       <w:r>
         <w:t>8. Blockers</w:t>
@@ -879,12 +465,7 @@
         <w:pStyle w:val="ListBullet"/>
       </w:pPr>
       <w:r>
-        <w:t>HGMD Professional — procurement (QIAGEN trial; institutional seat; PI sponsorship).</w:t>
-      </w:r>
-    </w:p>
-    <w:p>
-      <w:r>
-        <w:t>REVEL/VEST4/FATHMM/MutPred2 must NOT be labels if HGMD is a label source.</w:t>
+        <w:t>HGMD Professional - procurement; REVEL/VEST4/FATHMM/MutPred2 not labels if HGMD is a label source.</w:t>
       </w:r>
     </w:p>
     <w:p>
@@ -892,12 +473,7 @@
         <w:pStyle w:val="ListBullet"/>
       </w:pPr>
       <w:r>
-        <w:t>dbGaP / TOPMed / controlled-TCGA / CPTAC-protected — need institutional Signing</w:t>
-      </w:r>
-    </w:p>
-    <w:p>
-      <w:r>
-        <w:t>Official; blocked without R1 faculty sponsor.</w:t>
+        <w:t>dbGaP / TOPMed / controlled-TCGA / CPTAC-protected - need institutional Signing Official; blocked w/o R1 faculty sponsor.</w:t>
       </w:r>
     </w:p>
     <w:p>
@@ -905,17 +481,12 @@
         <w:pStyle w:val="ListBullet"/>
       </w:pPr>
       <w:r>
-        <w:t>EVE — needs score files before eve_score is real.</w:t>
-      </w:r>
-    </w:p>
-    <w:p>
-      <w:r>
-        <w:t>---</w:t>
+        <w:t>EVE - needs score files + HGVSp coords before eve_score is real.</w:t>
       </w:r>
     </w:p>
     <w:p>
       <w:pPr>
-        <w:pStyle w:val="Heading2"/>
+        <w:pStyle w:val="Heading1"/>
       </w:pPr>
       <w:r>
         <w:t>9. Changelog</w:t>
@@ -926,22 +497,15 @@
         <w:pStyle w:val="ListBullet"/>
       </w:pPr>
       <w:r>
-        <w:t>2026-06-08 (v1 re-baseline): roadmap reconstructed; phase model proposed;</w:t>
+        <w:t>2026-06-09 (v2): Run 15 sealed (Test 0.9984 / Val 0.9983 / UGH 0.9988). ESM-2 stall fixed + shipped (local index + GPU), but coverage ~3,451 -&gt; HGVSp parser promoted to top Phase-D item. AlphaMissense OOM re-validated. gene_constraint_oe revived (#2 feature); gnn_score confirmed real; cnn_1d/kan recovered. Infra lessons (SSH stdin-detach, fast-fail flags, poll-bail bug) recorded. clingen dtype drift flagged.</w:t>
       </w:r>
     </w:p>
     <w:p>
+      <w:pPr>
+        <w:pStyle w:val="ListBullet"/>
+      </w:pPr>
       <w:r>
-        <w:t>data-source registry added (incl. AlphaFold/dbSNP/COSMIC/TCGA/Reactome/KEGG/BioGRID/</w:t>
-      </w:r>
-    </w:p>
-    <w:p>
-      <w:r>
-        <w:t>DepMap/CPTAC + out-of-scope SRA/ENA/DDBJ/SILVA/ProteomeXchange + dbGaP clarification);</w:t>
-      </w:r>
-    </w:p>
-    <w:p>
-      <w:r>
-        <w:t>split-health audit + constraint-vestige finding recorded; ESM-2 GPU-regen plan set.</w:t>
+        <w:t>2026-06-08 (v1 re-baseline): roadmap reconstructed; phase model proposed; data-source registry added (incl. out-of-scope determinations + dbGaP clarification); split-health audit + constraint vestige recorded; ESM-2 GPU-regen plan set.</w:t>
       </w:r>
     </w:p>
     <w:sectPr>

</xml_diff>

<commit_message>
docs: consolidate to single living roadmap (archive root verbatim as Appendix A); record 2026-06-10 ESM-2/UniProt/protein-LM decisions
</commit_message>
<xml_diff>
--- a/docs/ROADMAP.docx
+++ b/docs/ROADMAP.docx
@@ -497,6 +497,46 @@
         <w:pStyle w:val="ListBullet"/>
       </w:pPr>
       <w:r>
+        <w:t>2026-06-10: ESM-2 coverage root-caused + gated; UniProt gap measured; protein-LM upgrade decided; roadmap consolidated.</w:t>
+      </w:r>
+    </w:p>
+    <w:p>
+      <w:pPr>
+        <w:pStyle w:val="ListBullet"/>
+      </w:pPr>
+      <w:r>
+        <w:t>ESM-2 ~3,451-of-2.49M coverage cap was a STALE AlphaMissense protein-coord index on the training box -- NOT the HGVSp parser. Local coord index covers 96.6% of missense. Step-10b fail-loud coverage gate shipped (commit 34e125a). Run 16 prereq is an operational coord-index sync, not parser work. SUPERSEDES the Section 4B "gated on HGVSp parser" line and the Section 5 "HGVSp parser (highest leverage)" item: protein_pos/wt_aa/mut_aa are already populated by step 10b from AlphaMissense, and hgvsp_parser.py / protein_coords.py already exist.</w:t>
+      </w:r>
+    </w:p>
+    <w:p>
+      <w:pPr>
+        <w:pStyle w:val="ListBullet"/>
+      </w:pPr>
+      <w:r>
+        <w:t>UniProt gene-symbol gap measured at 0.27% (6,742/2.49M missense; index healthy at 20,190 genes; MYH11/NDE1 PRESENT). "MYH11;NDE1" was a semicolon-joined multi-gene symbol, not a missing gene. Not a blocker; observability patch (aggregate unmatched-gene logging + safe ;-split) planned (Phase 0).</w:t>
+      </w:r>
+    </w:p>
+    <w:p>
+      <w:pPr>
+        <w:pStyle w:val="ListBullet"/>
+      </w:pPr>
+      <w:r>
+        <w:t>Protein-LM upgrade decision (research-backed): switch scoring METHOD embedding-delta -&gt; log-likelihood-ratio (LLR, WT-marginal); switch MODEL esm2_t6_8M -&gt; ESM-2 650M baseline (config-only via ESM2_MODEL_NAME; facebook/{name} mapping confirmed in _load_transformers_model) -&gt; ESM C 600M (Cambrian Non-Commercial License; "Built with ESM" attribution). esm2_delta_norm demoted to SECONDARY; new esm2_llr primary feature (feature count +1, lockstep). ESM3-open / ESM C 6B reserved as future escalation. Cloud: RunPod added alongside Vast.ai (provider-agnostic layer; pin one provider during validation).</w:t>
+      </w:r>
+    </w:p>
+    <w:p>
+      <w:pPr>
+        <w:pStyle w:val="ListBullet"/>
+      </w:pPr>
+      <w:r>
+        <w:t>Roadmap consolidation: the pre-rebaseline repo-root ROADMAP.md archived verbatim into Appendix A and removed from repo root; *.bak_* gitignored; README live-link disambiguated. Single ground-truth living roadmap.</w:t>
+      </w:r>
+    </w:p>
+    <w:p>
+      <w:pPr>
+        <w:pStyle w:val="ListBullet"/>
+      </w:pPr>
+      <w:r>
         <w:t>2026-06-09 (v2): Run 15 sealed (Test 0.9984 / Val 0.9983 / UGH 0.9988). ESM-2 stall fixed + shipped (local index + GPU), but coverage ~3,451 -&gt; HGVSp parser promoted to top Phase-D item. AlphaMissense OOM re-validated. gene_constraint_oe revived (#2 feature); gnn_score confirmed real; cnn_1d/kan recovered. Infra lessons (SSH stdin-detach, fast-fail flags, poll-bail bug) recorded. clingen dtype drift flagged.</w:t>
       </w:r>
     </w:p>
@@ -506,6 +546,779 @@
       </w:pPr>
       <w:r>
         <w:t>2026-06-08 (v1 re-baseline): roadmap reconstructed; phase model proposed; data-source registry added (incl. out-of-scope determinations + dbGaP clarification); split-health audit + constraint vestige recorded; ESM-2 GPU-regen plan set.</w:t>
+      </w:r>
+    </w:p>
+    <w:p>
+      <w:r>
+        <w:t>---</w:t>
+      </w:r>
+    </w:p>
+    <w:p>
+      <w:pPr>
+        <w:pStyle w:val="Heading2"/>
+      </w:pPr>
+      <w:r>
+        <w:t>Appendix A -- Archived pre-rebaseline roadmap (Mar-May 2026, SUPERSEDED)</w:t>
+      </w:r>
+    </w:p>
+    <w:p>
+      <w:r>
+        <w:t>&gt; ARCHIVED HISTORICAL SNAPSHOT. Retained verbatim for the project's running</w:t>
+      </w:r>
+    </w:p>
+    <w:p>
+      <w:r>
+        <w:t>&gt; historical record. This is the repo-root ROADMAP.md that predates the</w:t>
+      </w:r>
+    </w:p>
+    <w:p>
+      <w:r>
+        <w:t>&gt; 2026-06-08 v2 re-baseline. Its metrics (64 features, AUROC 0.9847), feature</w:t>
+      </w:r>
+    </w:p>
+    <w:p>
+      <w:r>
+        <w:t>&gt; counts, repo slug, and phase labels reflect the Mar-May 2026 state and are</w:t>
+      </w:r>
+    </w:p>
+    <w:p>
+      <w:r>
+        <w:t>&gt; NOT current -- the live roadmap is Sections 1-9 above. Frozen; do not edit.</w:t>
+      </w:r>
+    </w:p>
+    <w:p>
+      <w:pPr>
+        <w:pStyle w:val="Heading1"/>
+      </w:pPr>
+      <w:r>
+        <w:t>Genomic Variant Classifier -- Project Roadmap</w:t>
+      </w:r>
+    </w:p>
+    <w:p>
+      <w:r>
+        <w:t>Author: Monzia Moodie</w:t>
+      </w:r>
+    </w:p>
+    <w:p>
+      <w:r>
+        <w:t>Repository: monzia-moodie/genomic-variant-classifier</w:t>
+      </w:r>
+    </w:p>
+    <w:p>
+      <w:r>
+        <w:t>Last updated: March 2026 -- Phase 7/8 complete, Phase 4 in progress</w:t>
+      </w:r>
+    </w:p>
+    <w:p>
+      <w:r>
+        <w:t>---</w:t>
+      </w:r>
+    </w:p>
+    <w:p>
+      <w:pPr>
+        <w:pStyle w:val="Heading2"/>
+      </w:pPr>
+      <w:r>
+        <w:t>Vision</w:t>
+      </w:r>
+    </w:p>
+    <w:p>
+      <w:r>
+        <w:t>A production-grade, multi-modal genomic variant pathogenicity classifier that:</w:t>
+      </w:r>
+    </w:p>
+    <w:p>
+      <w:pPr>
+        <w:pStyle w:val="ListNumber"/>
+      </w:pPr>
+      <w:r>
+        <w:t>Achieves clinically actionable AUROC &gt;= 0.90 on held-out ClinVar data</w:t>
+      </w:r>
+    </w:p>
+    <w:p>
+      <w:pPr>
+        <w:pStyle w:val="ListNumber"/>
+      </w:pPr>
+      <w:r>
+        <w:t>Provides calibrated uncertainty estimates for Variants of Uncertain Significance (VUS)</w:t>
+      </w:r>
+    </w:p>
+    <w:p>
+      <w:pPr>
+        <w:pStyle w:val="ListNumber"/>
+      </w:pPr>
+      <w:r>
+        <w:t>Integrates population-level WGS controls alongside disease cohort data</w:t>
+      </w:r>
+    </w:p>
+    <w:p>
+      <w:pPr>
+        <w:pStyle w:val="ListNumber"/>
+      </w:pPr>
+      <w:r>
+        <w:t>Serves predictions via a REST API with Docker deployment</w:t>
+      </w:r>
+    </w:p>
+    <w:p>
+      <w:pPr>
+        <w:pStyle w:val="ListNumber"/>
+      </w:pPr>
+      <w:r>
+        <w:t>Benchmarks multiple ML algorithm families to rigorously compare their</w:t>
+      </w:r>
+    </w:p>
+    <w:p>
+      <w:r>
+        <w:t>effectiveness on large-scale genomic data</w:t>
+      </w:r>
+    </w:p>
+    <w:p>
+      <w:r>
+        <w:t>---</w:t>
+      </w:r>
+    </w:p>
+    <w:p>
+      <w:pPr>
+        <w:pStyle w:val="Heading2"/>
+      </w:pPr>
+      <w:r>
+        <w:t>Current State (March 2026)</w:t>
+      </w:r>
+    </w:p>
+    <w:p>
+      <w:r>
+        <w:t>| Item                                                                   | Status                    |</w:t>
+      </w:r>
+    </w:p>
+    <w:p>
+      <w:r>
+        <w:t>| ---------------------------------------------------------------------- | ------------------------- |</w:t>
+      </w:r>
+    </w:p>
+    <w:p>
+      <w:r>
+        <w:t>| 64-feature tabular ensemble (LightGBM, XGBoost, RF, GBM, LR)          | Done                  |</w:t>
+      </w:r>
+    </w:p>
+    <w:p>
+      <w:r>
+        <w:t>| Holdout AUROC (gene-stratified, 154K variants)                         | 0.9847                |</w:t>
+      </w:r>
+    </w:p>
+    <w:p>
+      <w:r>
+        <w:t>| RNA splice pipeline (MaxEntScan; 4 features)                           | Done                  |</w:t>
+      </w:r>
+    </w:p>
+    <w:p>
+      <w:r>
+        <w:t>| Protein structure pipeline (AlphaFold/UniProt; 4 features)             | Done                  |</w:t>
+      </w:r>
+    </w:p>
+    <w:p>
+      <w:r>
+        <w:t>| FastAPI REST service (/predict, /batch, /health, /gene, /rsid, /info)  | Done                  |</w:t>
+      </w:r>
+    </w:p>
+    <w:p>
+      <w:r>
+        <w:t>| X-API-Key auth + slowapi rate limiting                                 | Done                  |</w:t>
+      </w:r>
+    </w:p>
+    <w:p>
+      <w:r>
+        <w:t>| Structured JSON logging + Prometheus /metrics                          | Done                  |</w:t>
+      </w:r>
+    </w:p>
+    <w:p>
+      <w:r>
+        <w:t>| Multi-stage Dockerfile + docker-compose (api / trainer / monitoring)   | Done                  |</w:t>
+      </w:r>
+    </w:p>
+    <w:p>
+      <w:r>
+        <w:t>| GitHub Actions CI (lockfile check, pytest, docker build)               | Done                  |</w:t>
+      </w:r>
+    </w:p>
+    <w:p>
+      <w:r>
+        <w:t>| Docker image pushed to GHCR                                            | Done -- v2.0.0        |</w:t>
+      </w:r>
+    </w:p>
+    <w:p>
+      <w:r>
+        <w:t>| Conformal prediction intervals (scripts/conformal_prediction.py)       | Done                  |</w:t>
+      </w:r>
+    </w:p>
+    <w:p>
+      <w:r>
+        <w:t>| External validation script (scripts/validate_external.py)             | Done                  |</w:t>
+      </w:r>
+    </w:p>
+    <w:p>
+      <w:r>
+        <w:t>| Calibration analysis (scripts/calibration_analysis.py)                | Done                  |</w:t>
+      </w:r>
+    </w:p>
+    <w:p>
+      <w:r>
+        <w:t>| METHODS.md (publication-ready methods section)                         | Done                  |</w:t>
+      </w:r>
+    </w:p>
+    <w:p>
+      <w:r>
+        <w:t>| dbSNP index parquet (2.87M ClinVar-matched rs-IDs)                     | Done                  |</w:t>
+      </w:r>
+    </w:p>
+    <w:p>
+      <w:r>
+        <w:t>| ESM-2 connector (src/genomic_variant_classifier/data/esm2.py)                                     | Done -- ready for retrain |</w:t>
+      </w:r>
+    </w:p>
+    <w:p>
+      <w:r>
+        <w:t>| MC Dropout / Deep Ensemble uncertainty (src/genomic_variant_classifier/models/mc_dropout.py)      | Done                  |</w:t>
+      </w:r>
+    </w:p>
+    <w:p>
+      <w:r>
+        <w:t>| KAN classifier (src/genomic_variant_classifier/models/kan.py)                                     | Done                  |</w:t>
+      </w:r>
+    </w:p>
+    <w:p>
+      <w:r>
+        <w:t>| Algorithm benchmark framework (src/genomic_variant_classifier/evaluation/benchmark.py)            | Done                  |</w:t>
+      </w:r>
+    </w:p>
+    <w:p>
+      <w:r>
+        <w:t>| Model retrain incorporating Phase 4 features                           | Pending data + compute    |</w:t>
+      </w:r>
+    </w:p>
+    <w:p>
+      <w:r>
+        <w:t>---</w:t>
+      </w:r>
+    </w:p>
+    <w:p>
+      <w:pPr>
+        <w:pStyle w:val="Heading2"/>
+      </w:pPr>
+      <w:r>
+        <w:t>Phase 4 -- Algorithm Expansion and Benchmarking</w:t>
+      </w:r>
+    </w:p>
+    <w:p>
+      <w:r>
+        <w:t>Goal: Rigorous comparison of ML families; add ESM-2 and uncertainty features.</w:t>
+      </w:r>
+    </w:p>
+    <w:p>
+      <w:pPr>
+        <w:pStyle w:val="Heading3"/>
+      </w:pPr>
+      <w:r>
+        <w:t>4A -- ESM-2 Sequence Embeddings</w:t>
+      </w:r>
+    </w:p>
+    <w:p>
+      <w:pPr>
+        <w:pStyle w:val="ListBullet"/>
+      </w:pPr>
+      <w:r>
+        <w:t>[x] src/genomic_variant_classifier/data/esm2.py connector -- HuggingFace transformers backend, SQLite cache</w:t>
+      </w:r>
+    </w:p>
+    <w:p>
+      <w:pPr>
+        <w:pStyle w:val="ListBullet"/>
+      </w:pPr>
+      <w:r>
+        <w:t>[x] esm2_delta_norm added to PHASE_4_FEATURES (ready for next retrain)</w:t>
+      </w:r>
+    </w:p>
+    <w:p>
+      <w:pPr>
+        <w:pStyle w:val="ListBullet"/>
+      </w:pPr>
+      <w:r>
+        <w:t>[ ] Install transformers torch in training environment and run annotation</w:t>
+      </w:r>
+    </w:p>
+    <w:p>
+      <w:pPr>
+        <w:pStyle w:val="ListBullet"/>
+      </w:pPr>
+      <w:r>
+        <w:t>[ ] Retrain ensemble with 65-feature set; measure AUROC lift (+0.03-0.06 expected)</w:t>
+      </w:r>
+    </w:p>
+    <w:p>
+      <w:r>
+        <w:t>Expected AUROC lift: +0.03-0.06 on missense variants.</w:t>
+      </w:r>
+    </w:p>
+    <w:p>
+      <w:r>
+        <w:t>Install: pip install transformers torch</w:t>
+      </w:r>
+    </w:p>
+    <w:p>
+      <w:pPr>
+        <w:pStyle w:val="Heading3"/>
+      </w:pPr>
+      <w:r>
+        <w:t>4B -- KAN (Kolmogorov-Arnold Network)</w:t>
+      </w:r>
+    </w:p>
+    <w:p>
+      <w:pPr>
+        <w:pStyle w:val="ListBullet"/>
+      </w:pPr>
+      <w:r>
+        <w:t>[x] src/genomic_variant_classifier/models/kan.py -- pykan / efficient-kan backends; MLP fallback</w:t>
+      </w:r>
+    </w:p>
+    <w:p>
+      <w:pPr>
+        <w:pStyle w:val="ListBullet"/>
+      </w:pPr>
+      <w:r>
+        <w:t>[x] sklearn-compatible interface; plot_edge_functions() for interpretability</w:t>
+      </w:r>
+    </w:p>
+    <w:p>
+      <w:pPr>
+        <w:pStyle w:val="ListBullet"/>
+      </w:pPr>
+      <w:r>
+        <w:t>[ ] Run in benchmark framework; compare OOF AUROC against MLP</w:t>
+      </w:r>
+    </w:p>
+    <w:p>
+      <w:r>
+        <w:t>Install: pip install pykan</w:t>
+      </w:r>
+    </w:p>
+    <w:p>
+      <w:pPr>
+        <w:pStyle w:val="Heading3"/>
+      </w:pPr>
+      <w:r>
+        <w:t>4C -- Bayesian Uncertainty Quantification</w:t>
+      </w:r>
+    </w:p>
+    <w:p>
+      <w:pPr>
+        <w:pStyle w:val="ListBullet"/>
+      </w:pPr>
+      <w:r>
+        <w:t>[x] src/genomic_variant_classifier/models/mc_dropout.py -- MCDropoutWrapper + DeepEnsembleWrapper</w:t>
+      </w:r>
+    </w:p>
+    <w:p>
+      <w:pPr>
+        <w:pStyle w:val="ListBullet"/>
+      </w:pPr>
+      <w:r>
+        <w:t>[x] Uncertainty decomposition: epistemic (variance) + aleatoric (entropy)</w:t>
+      </w:r>
+    </w:p>
+    <w:p>
+      <w:pPr>
+        <w:pStyle w:val="ListBullet"/>
+      </w:pPr>
+      <w:r>
+        <w:t>[x] annotate_uncertainty() helper for DataFrame annotation</w:t>
+      </w:r>
+    </w:p>
+    <w:p>
+      <w:pPr>
+        <w:pStyle w:val="ListBullet"/>
+      </w:pPr>
+      <w:r>
+        <w:t>[ ] Run DeepEnsembleWrapper(LightGBM, n_members=5) on holdout; measure ECE improvement</w:t>
+      </w:r>
+    </w:p>
+    <w:p>
+      <w:pPr>
+        <w:pStyle w:val="ListBullet"/>
+      </w:pPr>
+      <w:r>
+        <w:t>[ ] Annotate VUS subset with uncertainty flags; export for clinical review</w:t>
+      </w:r>
+    </w:p>
+    <w:p>
+      <w:pPr>
+        <w:pStyle w:val="Heading3"/>
+      </w:pPr>
+      <w:r>
+        <w:t>4D -- GNN over Protein-Protein Interaction Network</w:t>
+      </w:r>
+    </w:p>
+    <w:p>
+      <w:pPr>
+        <w:pStyle w:val="ListBullet"/>
+      </w:pPr>
+      <w:r>
+        <w:t>[x] src/genomic_variant_classifier/models/gnn.py -- GAT convolutions over STRING DB graph</w:t>
+      </w:r>
+    </w:p>
+    <w:p>
+      <w:pPr>
+        <w:pStyle w:val="ListBullet"/>
+      </w:pPr>
+      <w:r>
+        <w:t>[ ] Wire STRING DB edge weights into GNN training (currently uses uniform weights)</w:t>
+      </w:r>
+    </w:p>
+    <w:p>
+      <w:pPr>
+        <w:pStyle w:val="ListBullet"/>
+      </w:pPr>
+      <w:r>
+        <w:t>[ ] Late fusion: concat GNN gene embedding with TABULAR_FEATURES before stacking</w:t>
+      </w:r>
+    </w:p>
+    <w:p>
+      <w:pPr>
+        <w:pStyle w:val="Heading3"/>
+      </w:pPr>
+      <w:r>
+        <w:t>4E -- Algorithm Comparison Framework</w:t>
+      </w:r>
+    </w:p>
+    <w:p>
+      <w:pPr>
+        <w:pStyle w:val="ListBullet"/>
+      </w:pPr>
+      <w:r>
+        <w:t>[x] src/genomic_variant_classifier/evaluation/benchmark.py -- cross-validated benchmark across all families</w:t>
+      </w:r>
+    </w:p>
+    <w:p>
+      <w:pPr>
+        <w:pStyle w:val="ListBullet"/>
+      </w:pPr>
+      <w:r>
+        <w:t>[x] Metrics: AUROC, AUPRC, Brier, ECE, train time, inference latency, memory</w:t>
+      </w:r>
+    </w:p>
+    <w:p>
+      <w:pPr>
+        <w:pStyle w:val="ListBullet"/>
+      </w:pPr>
+      <w:r>
+        <w:t>[ ] Run full benchmark on ClinVar holdout</w:t>
+      </w:r>
+    </w:p>
+    <w:p>
+      <w:pPr>
+        <w:pStyle w:val="ListBullet"/>
+      </w:pPr>
+      <w:r>
+        <w:t>[ ] Produce comparison table for METHODS.md / manuscript</w:t>
+      </w:r>
+    </w:p>
+    <w:p>
+      <w:r>
+        <w:t>Run:</w:t>
+      </w:r>
+    </w:p>
+    <w:p>
+      <w:r>
+        <w:rPr>
+          <w:rFonts w:ascii="Consolas" w:hAnsi="Consolas"/>
+        </w:rPr>
+        <w:t>python -m genomic_variant_classifier.evaluation.benchmark \</w:t>
+        <w:br/>
+        <w:t xml:space="preserve">    --parquet data/processed/clinvar_grch38.parquet \</w:t>
+        <w:br/>
+        <w:t xml:space="preserve">    --output  outputs/benchmark \</w:t>
+        <w:br/>
+        <w:t xml:space="preserve">    --n-folds 5</w:t>
+      </w:r>
+    </w:p>
+    <w:p>
+      <w:r>
+        <w:t>---</w:t>
+      </w:r>
+    </w:p>
+    <w:p>
+      <w:pPr>
+        <w:pStyle w:val="Heading2"/>
+      </w:pPr>
+      <w:r>
+        <w:t>Phase 3 -- Data Expansion</w:t>
+      </w:r>
+    </w:p>
+    <w:p>
+      <w:pPr>
+        <w:pStyle w:val="Heading3"/>
+      </w:pPr>
+      <w:r>
+        <w:t>3A -- Population Controls</w:t>
+      </w:r>
+    </w:p>
+    <w:p>
+      <w:r>
+        <w:t>| Source                      | Data           | Status                                          |</w:t>
+      </w:r>
+    </w:p>
+    <w:p>
+      <w:r>
+        <w:t>| --------------------------- | -------------- | ----------------------------------------------- |</w:t>
+      </w:r>
+    </w:p>
+    <w:p>
+      <w:r>
+        <w:t>| 1000 Genomes Project (IGSR) | 2,504 WGS      | data/external/1000genomes/ empty -- pending   |</w:t>
+      </w:r>
+    </w:p>
+    <w:p>
+      <w:r>
+        <w:t>| gnomAD v4.1 exomes          | ~730M variants | Done (filtered parquet)                         |</w:t>
+      </w:r>
+    </w:p>
+    <w:p>
+      <w:r>
+        <w:t>population_1kg_af added to PHASE_4_FEATURES; pending data download.</w:t>
+      </w:r>
+    </w:p>
+    <w:p>
+      <w:pPr>
+        <w:pStyle w:val="Heading3"/>
+      </w:pPr>
+      <w:r>
+        <w:t>3B -- Disease Cohorts (Controlled Access)</w:t>
+      </w:r>
+    </w:p>
+    <w:p>
+      <w:r>
+        <w:t>Apply for these in parallel -- each takes 2-8 weeks for approval.</w:t>
+      </w:r>
+    </w:p>
+    <w:p>
+      <w:r>
+        <w:t>| Source                          | Data                                    | Application                      | Priority    |</w:t>
+      </w:r>
+    </w:p>
+    <w:p>
+      <w:r>
+        <w:t>| ------------------------------- | --------------------------------------- | -------------------------------- | ----------- |</w:t>
+      </w:r>
+    </w:p>
+    <w:p>
+      <w:r>
+        <w:t>| dbGaP / NCBI                    | TOPMed (300K WGS), CMG rare disease     | eRA Commons + institutional      | High        |</w:t>
+      </w:r>
+    </w:p>
+    <w:p>
+      <w:r>
+        <w:t>| EGA                             | European cancer + rare disease WGS      | Data Access Agreement            | High        |</w:t>
+      </w:r>
+    </w:p>
+    <w:p>
+      <w:r>
+        <w:t>| CMG (Centers for Mendelian Genomics) | High-quality rare disease trios    | Via dbGaP / AnVIL                | High        |</w:t>
+      </w:r>
+    </w:p>
+    <w:p>
+      <w:r>
+        <w:t>| UK Biobank                      | 470K WES + 200K WGS                     | Formal application               | Medium-high |</w:t>
+      </w:r>
+    </w:p>
+    <w:p>
+      <w:r>
+        <w:t>| All of Us                       | 250K+ WGS diverse ancestry              | Researcher Workbench (free)      | Medium      |</w:t>
+      </w:r>
+    </w:p>
+    <w:p>
+      <w:pPr>
+        <w:pStyle w:val="Heading3"/>
+      </w:pPr>
+      <w:r>
+        <w:t>3C -- Pending Downloads</w:t>
+      </w:r>
+    </w:p>
+    <w:p>
+      <w:r>
+        <w:t>| File                    | Size     | Source                              | Status  |</w:t>
+      </w:r>
+    </w:p>
+    <w:p>
+      <w:r>
+        <w:t>| ----------------------- | -------- | ----------------------------------- | ------- |</w:t>
+      </w:r>
+    </w:p>
+    <w:p>
+      <w:r>
+        <w:t>| dbNSFP4.7a.zip          | ~30 GB   | Google Drive (registration required) | Pending |</w:t>
+      </w:r>
+    </w:p>
+    <w:p>
+      <w:r>
+        <w:t>| 1000G VCF chr*.vcf.gz   | ~100 GB  | IGSR portal (free)                  | Pending |</w:t>
+      </w:r>
+    </w:p>
+    <w:p>
+      <w:r>
+        <w:t>| SpliceAI scored VCF     | 27 GB    | On Drive                            | Done    |</w:t>
+      </w:r>
+    </w:p>
+    <w:p>
+      <w:r>
+        <w:t>---</w:t>
+      </w:r>
+    </w:p>
+    <w:p>
+      <w:pPr>
+        <w:pStyle w:val="Heading2"/>
+      </w:pPr>
+      <w:r>
+        <w:t>Phase 5 -- Clinical Validation and Deployment</w:t>
+      </w:r>
+    </w:p>
+    <w:p>
+      <w:pPr>
+        <w:pStyle w:val="ListBullet"/>
+      </w:pPr>
+      <w:r>
+        <w:t>[ ] Prospective validation on gene panels (BRCA1/2, TP53, PTEN, ATM)</w:t>
+      </w:r>
+    </w:p>
+    <w:p>
+      <w:pPr>
+        <w:pStyle w:val="ListBullet"/>
+      </w:pPr>
+      <w:r>
+        <w:t>[ ] Comparison against ClinVar star-rating on expert-reviewed variants</w:t>
+      </w:r>
+    </w:p>
+    <w:p>
+      <w:pPr>
+        <w:pStyle w:val="ListBullet"/>
+      </w:pPr>
+      <w:r>
+        <w:t>[ ] Model card: training data, known limitations, ancestry coverage</w:t>
+      </w:r>
+    </w:p>
+    <w:p>
+      <w:pPr>
+        <w:pStyle w:val="ListBullet"/>
+      </w:pPr>
+      <w:r>
+        <w:t>[ ] Manuscript draft: multi-modal genomic variant classifier with algorithm benchmarking</w:t>
+      </w:r>
+    </w:p>
+    <w:p>
+      <w:r>
+        <w:t>---</w:t>
+      </w:r>
+    </w:p>
+    <w:p>
+      <w:pPr>
+        <w:pStyle w:val="Heading2"/>
+      </w:pPr>
+      <w:r>
+        <w:t>Feature Roadmap</w:t>
+      </w:r>
+    </w:p>
+    <w:p>
+      <w:r>
+        <w:t>Live (64 features -- current model):</w:t>
+      </w:r>
+    </w:p>
+    <w:p>
+      <w:r>
+        <w:t>see TABULAR_FEATURES in src/genomic_variant_classifier/models/variant_ensemble.py</w:t>
+      </w:r>
+    </w:p>
+    <w:p>
+      <w:r>
+        <w:t>PHASE_4_FEATURES (pending retrain):</w:t>
+      </w:r>
+    </w:p>
+    <w:p>
+      <w:r>
+        <w:rPr>
+          <w:rFonts w:ascii="Consolas" w:hAnsi="Consolas"/>
+        </w:rPr>
+        <w:t>esm2_delta_norm       -- ESM-2 embedding L2 distance (wt vs. mut); ~+0.03-0.06 AUROC</w:t>
+        <w:br/>
+        <w:t>population_1kg_af     -- 1000 Genomes allele frequency</w:t>
+        <w:br/>
+        <w:t>uncertainty_epistemic -- Deep Ensemble epistemic uncertainty (inference-time)</w:t>
+        <w:br/>
+        <w:t>uncertainty_aleatoric -- Deep Ensemble aleatoric uncertainty (inference-time)</w:t>
+      </w:r>
+    </w:p>
+    <w:p>
+      <w:r>
+        <w:t>---</w:t>
+      </w:r>
+    </w:p>
+    <w:p>
+      <w:pPr>
+        <w:pStyle w:val="Heading2"/>
+      </w:pPr>
+      <w:r>
+        <w:t>Complexity Reference</w:t>
+      </w:r>
+    </w:p>
+    <w:p>
+      <w:r>
+        <w:t>| Algorithm                | Training           | Genomic scale                  |</w:t>
+      </w:r>
+    </w:p>
+    <w:p>
+      <w:r>
+        <w:t>| ------------------------ | ------------------ | ------------------------------ |</w:t>
+      </w:r>
+    </w:p>
+    <w:p>
+      <w:r>
+        <w:t>| GBTs (XGBoost/LightGBM)  | O(I\*n\*d\*log n)  | Excellent                      |</w:t>
+      </w:r>
+    </w:p>
+    <w:p>
+      <w:r>
+        <w:t>| MLP / KAN                | O(n\*L\*H^2[\*G])  | Good                           |</w:t>
+      </w:r>
+    </w:p>
+    <w:p>
+      <w:r>
+        <w:t>| ESM-2 (frozen inference) | N/A                | Excellent                      |</w:t>
+      </w:r>
+    </w:p>
+    <w:p>
+      <w:r>
+        <w:t>| GNN (sparse PPI)         | O(G\*(V+E)\*d)     | Excellent -- independent of n  |</w:t>
+      </w:r>
+    </w:p>
+    <w:p>
+      <w:r>
+        <w:t>| Deep Ensemble (M members)| O(M \* base)       | Good                           |</w:t>
+      </w:r>
+    </w:p>
+    <w:p>
+      <w:r>
+        <w:t>| SVM (RBF)                | O(n^2)             | INFEASIBLE above ~100K samples |</w:t>
+      </w:r>
+    </w:p>
+    <w:p>
+      <w:r>
+        <w:t>SVM is excluded from all production runs (n &gt; 100K).</w:t>
+      </w:r>
+    </w:p>
+    <w:p>
+      <w:r>
+        <w:t>---</w:t>
+      </w:r>
+    </w:p>
+    <w:p>
+      <w:r>
+        <w:t>*This roadmap is a living document. Update after each phase gate.*</w:t>
       </w:r>
     </w:p>
     <w:sectPr>

</xml_diff>

<commit_message>
phase0: shared gene-symbol resolution helper; wire esm2/eve/protein_pipeline; aggregate missing-gene logging; fix eve case-drift; roadmap 4B/5 status
</commit_message>
<xml_diff>
--- a/docs/ROADMAP.docx
+++ b/docs/ROADMAP.docx
@@ -214,7 +214,7 @@
     </w:p>
     <w:p>
       <w:r>
-        <w:t>| ESM-2 | esm2_delta_norm | local model+index | MECHANICALLY ACTIVE; coverage ~3,451 only -&gt; gated on HGVSp parser |</w:t>
+        <w:t>| ESM-2 | esm2_delta_norm | local model+index | code-FIXED 2026-06-10: the ~3,451 cap was a STALE protein-coord index (gate 34e125a; local ceiling 96.6%); gene-resolution hardened (Phase 0); realizes ~2.4M scores after the Run 16 coord-sync; LLR + 650M/ESM C migration in progress |</w:t>
       </w:r>
     </w:p>
     <w:p>
@@ -313,7 +313,7 @@
         <w:pStyle w:val="ListBullet"/>
       </w:pPr>
       <w:r>
-        <w:t>HGVSp parser (highest leverage, empirically confirmed by Run 15): populate protein_pos/wt_aa/mut_aa across the cohort to lift ESM-2 (and EVE) coverage from ~3,451 to ~1M. Until then ESM-2 carries no real full-run signal.</w:t>
+        <w:t>ESM-2 coverage (RESOLVED 2026-06-10): the ~3,451 cap was a stale AlphaMissense protein-coord index on the training box, not an HGVSp-parser gap (protein_pos/wt_aa/mut_aa are populated by step 10b; hgvsp_parser.py / protein_coords.py already exist). Coverage gate shipped (34e125a; local ceiling 96.6%); Run 16 prereq is an operational coord-index sync. Method/model migration to LLR + ESM-2 650M -&gt; ESM C 600M now in progress (Phase 1).</w:t>
       </w:r>
     </w:p>
     <w:p>

</xml_diff>

<commit_message>
phase1: ESM-2 650M LLR scorer (annotate_llr, WT/masked-marginal) + esm2_llr feature wired 79->80 (signed, no-clip); CPU sign/index gate PASS; harness slice + contract green (862 passed); docs
</commit_message>
<xml_diff>
--- a/docs/ROADMAP.docx
+++ b/docs/ROADMAP.docx
@@ -40,7 +40,7 @@
     </w:p>
     <w:p>
       <w:r>
-        <w:t>Production-grade multi-modal genomic disease-association program. Core: an ACMG/AMP-style variant pathogenicity classifier over ~1.49M cohort rows (from ~2.49M ClinVar missense), 79 features, 13-model ensemble + stacking meta-learner + STRING-DB GNN + KAN.</w:t>
+        <w:t>Production-grade multi-modal genomic disease-association program. Core: an ACMG/AMP-style variant pathogenicity classifier over ~1.49M cohort rows (from ~2.49M ClinVar missense), 80 features, 13-model ensemble + stacking meta-learner + STRING-DB GNN + KAN.</w:t>
       </w:r>
     </w:p>
     <w:p>
@@ -122,7 +122,7 @@
         <w:pStyle w:val="Heading1"/>
       </w:pPr>
       <w:r>
-        <w:t>3. Current state snapshot (2026-06-09)</w:t>
+        <w:t>3. Current state snapshot (2026-06-10)</w:t>
       </w:r>
     </w:p>
     <w:p>
@@ -170,7 +170,7 @@
         <w:pStyle w:val="ListBullet"/>
       </w:pPr>
       <w:r>
-        <w:t>Suite: 804 passed / 1 skipped.</w:t>
+        <w:t>Suite: 862 passed / 1 skipped (2026-06-10, post Phase-0/1 gene-resolution + ESM-2 LLR wiring; features 79 -&gt; 80).</w:t>
       </w:r>
     </w:p>
     <w:p>
@@ -214,7 +214,7 @@
     </w:p>
     <w:p>
       <w:r>
-        <w:t>| ESM-2 | esm2_delta_norm | local model+index | code-FIXED 2026-06-10: the ~3,451 cap was a STALE protein-coord index (gate 34e125a; local ceiling 96.6%); gene-resolution hardened (Phase 0); realizes ~2.4M scores after the Run 16 coord-sync; LLR + 650M/ESM C migration in progress |</w:t>
+        <w:t>| ESM-2 | esm2_delta_norm (secondary), esm2_llr (primary, NEW) | local model+index | Phase 1 DONE 2026-06-10: esm2_llr LLR scorer (EsmForMaskedLM logits head; WT-marginal default, masked opt-in) + feature wired (79-&gt;80 lockstep; SIGNED, NOT clipped). CPU sign/index gate PASS; sign != class (continuous). Realizes after Run 16 coord-sync with esm2_model_name=esm2_t33_650M_UR50D. ESM C 600M = Phase 2 |</w:t>
       </w:r>
     </w:p>
     <w:p>
@@ -530,6 +530,22 @@
       </w:pPr>
       <w:r>
         <w:t>Roadmap consolidation: the pre-rebaseline repo-root ROADMAP.md archived verbatim into Appendix A and removed from repo root; *.bak_* gitignored; README live-link disambiguated. Single ground-truth living roadmap.</w:t>
+      </w:r>
+    </w:p>
+    <w:p>
+      <w:pPr>
+        <w:pStyle w:val="ListBullet"/>
+      </w:pPr>
+      <w:r>
+        <w:t>Phase 0 (commit fd5e293): shared gene_symbols.py resolution helper wired into esm2/eve/protein_pipeline; aggregate missing-gene logging; fixed a real eve case-drift bug; safe ;-join recovery. Suite 849 passed.</w:t>
+      </w:r>
+    </w:p>
+    <w:p>
+      <w:pPr>
+        <w:pStyle w:val="ListBullet"/>
+      </w:pPr>
+      <w:r>
+        <w:t>Phase 1: ESM-2 650M LLR scorer (annotate_llr; EsmForMaskedLM logits head; WT-marginal default, masked opt-in) + esm2_llr feature wired (TABULAR_FEATURES 79-&gt;80, both assembly sites, SIGNED/NOT clipped; INFERENCE_FEATURE_COLUMNS auto-derived). CPU sign/index gate PASS (TP53 hotspots negative; benign P72R less negative). CALIBRATION: LLR sign != class -&gt; continuous feature (no hard cutoff). Harness reference slice populates esm2_llr (live, NOT allowlisted). Suite 862 passed / 1 skipped. Model default stays 8M; regen sets esm2_model_name=esm2_t33_650M_UR50D (visible in step-16b log).</w:t>
       </w:r>
     </w:p>
     <w:p>
@@ -1244,7 +1260,9 @@
         <w:rPr>
           <w:rFonts w:ascii="Consolas" w:hAnsi="Consolas"/>
         </w:rPr>
-        <w:t>esm2_delta_norm       -- ESM-2 embedding L2 distance (wt vs. mut); ~+0.03-0.06 AUROC</w:t>
+        <w:t>esm2_delta_norm       -- ESM-2 embedding L2 distance (wt vs. mut); ~+0.03-0.06 AUROC (SECONDARY)</w:t>
+        <w:br/>
+        <w:t>esm2_llr              -- ESM-2 650M log-likelihood-ratio (logit[mut]-logit[wt]); SIGNED, negative=damaging; CONTINUOUS (sign != class; benign TP53 P72R also negative ~-6.09); WT-marginal default / masked opt-in (PRIMARY)</w:t>
         <w:br/>
         <w:t>population_1kg_af     -- 1000 Genomes allele frequency</w:t>
         <w:br/>

</xml_diff>

<commit_message>
docs(session): 2026-06-10 agent-layer repair -- 13 operational; routes to docs/ canonicals
</commit_message>
<xml_diff>
--- a/docs/ROADMAP.docx
+++ b/docs/ROADMAP.docx
@@ -1337,6 +1337,125 @@
     <w:p>
       <w:r>
         <w:t>*This roadmap is a living document. Update after each phase gate.*</w:t>
+      </w:r>
+    </w:p>
+    <w:p>
+      <w:pPr>
+        <w:pStyle w:val="Heading2"/>
+      </w:pPr>
+      <w:r>
+        <w:t>Backlog additions -- 2026-06-10 (agent layer)</w:t>
+      </w:r>
+    </w:p>
+    <w:p>
+      <w:pPr>
+        <w:pStyle w:val="ListBullet"/>
+      </w:pPr>
+      <w:r>
+        <w:t>Populate drift-agent reference baselines (moves the 8 drift agents from</w:t>
+      </w:r>
+    </w:p>
+    <w:p>
+      <w:r>
+        <w:t>awaiting_baseline -&gt; active detection). Per agent, supply its inputs:</w:t>
+      </w:r>
+    </w:p>
+    <w:p>
+      <w:pPr>
+        <w:pStyle w:val="ListBullet"/>
+      </w:pPr>
+      <w:r>
+        <w:t>SchemaDriftMonitorAgent: expected schema baseline (expected_dtypes + hash) + current matrix.</w:t>
+      </w:r>
+    </w:p>
+    <w:p>
+      <w:pPr>
+        <w:pStyle w:val="ListBullet"/>
+      </w:pPr>
+      <w:r>
+        <w:t>ConceptDriftMonitorAgent: NannyML CBPE estimated AUROC + BBSE p-value.</w:t>
+      </w:r>
+    </w:p>
+    <w:p>
+      <w:pPr>
+        <w:pStyle w:val="ListBullet"/>
+      </w:pPr>
+      <w:r>
+        <w:t>LabelShiftMonitorAgent: reference confusion matrix + p_train + a prediction-log window.</w:t>
+      </w:r>
+    </w:p>
+    <w:p>
+      <w:pPr>
+        <w:pStyle w:val="ListBullet"/>
+      </w:pPr>
+      <w:r>
+        <w:t>CalibrationDriftMonitorAgent: labeled predictions with per-class posteriors + baseline ECE.</w:t>
+      </w:r>
+    </w:p>
+    <w:p>
+      <w:pPr>
+        <w:pStyle w:val="ListBullet"/>
+      </w:pPr>
+      <w:r>
+        <w:t>InfrastructureDriftMonitorAgent: pinned packages + expected DAG hash + golden set + replay.</w:t>
+      </w:r>
+    </w:p>
+    <w:p>
+      <w:pPr>
+        <w:pStyle w:val="ListBullet"/>
+      </w:pPr>
+      <w:r>
+        <w:t>FairnessSubgroupMonitorAgent: per-stratum p_train + predictions + axis columns.</w:t>
+      </w:r>
+    </w:p>
+    <w:p>
+      <w:pPr>
+        <w:pStyle w:val="ListBullet"/>
+      </w:pPr>
+      <w:r>
+        <w:t>AdversarialSubmissionMonitorAgent: weekly ClinVar submission feeds + baselines.</w:t>
+      </w:r>
+    </w:p>
+    <w:p>
+      <w:pPr>
+        <w:pStyle w:val="ListBullet"/>
+      </w:pPr>
+      <w:r>
+        <w:t>AnnotationPolicyMonitorAgent: SVI publication feed + ClinVar review-status deltas + submitter history.</w:t>
+      </w:r>
+    </w:p>
+    <w:p>
+      <w:r>
+        <w:t>Note: data/reference/ recorded absent on 2026-05-07 -- create it first.</w:t>
+      </w:r>
+    </w:p>
+    <w:p>
+      <w:pPr>
+        <w:pStyle w:val="ListBullet"/>
+      </w:pPr>
+      <w:r>
+        <w:t>README registry-table precision (optional): rename the 8 detector rows to the registered</w:t>
+      </w:r>
+    </w:p>
+    <w:p>
+      <w:r>
+        <w:t>*MonitorAgent wrapper class names.</w:t>
+      </w:r>
+    </w:p>
+    <w:p>
+      <w:pPr>
+        <w:pStyle w:val="ListBullet"/>
+      </w:pPr>
+      <w:r>
+        <w:t>alibi-detect: install only if a future detector imports it (none do today).</w:t>
+      </w:r>
+    </w:p>
+    <w:p>
+      <w:pPr>
+        <w:pStyle w:val="ListBullet"/>
+      </w:pPr>
+      <w:r>
+        <w:t>Ref: docs/incidents/INCIDENT_2026-06-10_agent_layer_regression.md.</w:t>
       </w:r>
     </w:p>
     <w:sectPr>

</xml_diff>

<commit_message>
docs(session): 2026-06-11 CI fix + schema-drift activation and preflight gate; drift-wiring findings + remediation backlog
</commit_message>
<xml_diff>
--- a/docs/ROADMAP.docx
+++ b/docs/ROADMAP.docx
@@ -1456,6 +1456,233 @@
       </w:pPr>
       <w:r>
         <w:t>Ref: docs/incidents/INCIDENT_2026-06-10_agent_layer_regression.md.</w:t>
+      </w:r>
+    </w:p>
+    <w:p>
+      <w:pPr>
+        <w:pStyle w:val="Heading2"/>
+      </w:pPr>
+      <w:r>
+        <w:t>Backlog additions -- 2026-06-11 (drift wiring + schema gate)</w:t>
+      </w:r>
+    </w:p>
+    <w:p>
+      <w:r>
+        <w:t>**Delivered this session (first delivery against the 2026-06-10 "Populate drift-agent reference</w:t>
+      </w:r>
+    </w:p>
+    <w:p>
+      <w:r>
+        <w:t>baselines" item):** SchemaDriftMonitorAgent now has a versioned baseline</w:t>
+      </w:r>
+    </w:p>
+    <w:p>
+      <w:r>
+        <w:t>(data/reference/schema/schema_baseline.json, 78 cols / all float64), a from_baseline loader,</w:t>
+      </w:r>
+    </w:p>
+    <w:p>
+      <w:r>
+        <w:t>and a standalone preflight gate (scripts/run_schema_drift_check.py, exit 0/2/3). The schema agent</w:t>
+      </w:r>
+    </w:p>
+    <w:p>
+      <w:r>
+        <w:t>is the worked example; the other seven drift agents still await their reference inputs.</w:t>
+      </w:r>
+    </w:p>
+    <w:p>
+      <w:pPr>
+        <w:pStyle w:val="Heading3"/>
+      </w:pPr>
+      <w:r>
+        <w:t>Drift-wiring findings (recorded 2026-06-11)</w:t>
+      </w:r>
+    </w:p>
+    <w:p>
+      <w:pPr>
+        <w:pStyle w:val="ListBullet"/>
+      </w:pPr>
+      <w:r>
+        <w:t>The eight agent-layer drift MonitorAgents are registered in Orchestrator._register_agents but</w:t>
+      </w:r>
+    </w:p>
+    <w:p>
+      <w:r>
+        <w:t>invoked by nothing (absent from PIPELINE_DEFINITIONS; run_agents.py --pipeline full runs only</w:t>
+      </w:r>
+    </w:p>
+    <w:p>
+      <w:r>
+        <w:t>the four framework agents).</w:t>
+      </w:r>
+    </w:p>
+    <w:p>
+      <w:pPr>
+        <w:pStyle w:val="ListBullet"/>
+      </w:pPr>
+      <w:r>
+        <w:t>.github/workflows/drift_monitor.yml is effectively inert: GDrive download is a stub, so the job</w:t>
+      </w:r>
+    </w:p>
+    <w:p>
+      <w:r>
+        <w:t>skips via "No reference splits available"; it also points at the stale</w:t>
+      </w:r>
+    </w:p>
+    <w:p>
+      <w:r>
+        <w:t>outputs/phase2_with_gnomad/splits/ path (pre-Run-15).</w:t>
+      </w:r>
+    </w:p>
+    <w:p>
+      <w:pPr>
+        <w:pStyle w:val="ListBullet"/>
+      </w:pPr>
+      <w:r>
+        <w:t>scripts/run_drift_monitor.py covers distributional (PSI/KS/MMD) + label drift but NOT</w:t>
+      </w:r>
+    </w:p>
+    <w:p>
+      <w:r>
+        <w:t>schema/column/dtype drift. The new gate is additive.</w:t>
+      </w:r>
+    </w:p>
+    <w:p>
+      <w:pPr>
+        <w:pStyle w:val="Heading3"/>
+      </w:pPr>
+      <w:r>
+        <w:t>Proposed action items (NOT done -- deliberate design decisions for a future session)</w:t>
+      </w:r>
+    </w:p>
+    <w:p>
+      <w:pPr>
+        <w:pStyle w:val="ListBullet"/>
+      </w:pPr>
+      <w:r>
+        <w:t>[ ] Pipeline-wire the drift agents. Add a drift key to PIPELINE_DEFINITIONS listing the</w:t>
+      </w:r>
+    </w:p>
+    <w:p>
+      <w:r>
+        <w:t>eight MonitorAgents, reachable via run_agents.py --pipeline drift. They are registered but</w:t>
+      </w:r>
+    </w:p>
+    <w:p>
+      <w:r>
+        <w:t>currently unreachable from any CLI path.</w:t>
+      </w:r>
+    </w:p>
+    <w:p>
+      <w:pPr>
+        <w:pStyle w:val="ListBullet"/>
+      </w:pPr>
+      <w:r>
+        <w:t>[ ] Fix drift_monitor.yml. Repoint the stale outputs/phase2_with_gnomad/splits/ -&gt;</w:t>
+      </w:r>
+    </w:p>
+    <w:p>
+      <w:r>
+        <w:t>outputs/run15_rerun_report/full/splits/, and replace the GDrive-download stub (a no-op that</w:t>
+      </w:r>
+    </w:p>
+    <w:p>
+      <w:r>
+        <w:t>makes the monthly job skip) with a real fetch or an honest hard-skip that is logged, not silent.</w:t>
+      </w:r>
+    </w:p>
+    <w:p>
+      <w:pPr>
+        <w:pStyle w:val="ListBullet"/>
+      </w:pPr>
+      <w:r>
+        <w:t>[ ] Add the schema gate as a drift_monitor.yml step. Run scripts/run_schema_drift_check.py</w:t>
+      </w:r>
+    </w:p>
+    <w:p>
+      <w:r>
+        <w:t>(exit-2 gates the job) so schema drift -- which run_drift_monitor.py does not cover -- is checked</w:t>
+      </w:r>
+    </w:p>
+    <w:p>
+      <w:r>
+        <w:t>monthly alongside PSI/label drift.</w:t>
+      </w:r>
+    </w:p>
+    <w:p>
+      <w:pPr>
+        <w:pStyle w:val="ListBullet"/>
+      </w:pPr>
+      <w:r>
+        <w:t>[ ] Reconcile the two parallel drift systems. The agent-layer drift agents and the</w:t>
+      </w:r>
+    </w:p>
+    <w:p>
+      <w:r>
+        <w:t>src/monitoring/ + run_drift_monitor.py system overlap conceptually; consolidate into one</w:t>
+      </w:r>
+    </w:p>
+    <w:p>
+      <w:r>
+        <w:t>documented entrypoint so "drift monitoring" has a single source of truth.</w:t>
+      </w:r>
+    </w:p>
+    <w:p>
+      <w:pPr>
+        <w:pStyle w:val="Heading3"/>
+      </w:pPr>
+      <w:r>
+        <w:t>Feature-count reconciliation (TO VERIFY -- not asserted)</w:t>
+      </w:r>
+    </w:p>
+    <w:p>
+      <w:pPr>
+        <w:pStyle w:val="ListBullet"/>
+      </w:pPr>
+      <w:r>
+        <w:t>[ ] Reconcile the 64 / 78 / 79 spread: notes say 79; on-disk X_train is 78 (verified green</w:t>
+      </w:r>
+    </w:p>
+    <w:p>
+      <w:r>
+        <w:t>by the gate); this ROADMAP still says "Live (64 features)". Identifier/label/target columns live in</w:t>
+      </w:r>
+    </w:p>
+    <w:p>
+      <w:r>
+        <w:t>meta_*, separate from the 78 X_* features. Settle the canonical count.</w:t>
+      </w:r>
+    </w:p>
+    <w:p>
+      <w:pPr>
+        <w:pStyle w:val="ListBullet"/>
+      </w:pPr>
+      <w:r>
+        <w:t>[ ] Verify whether af_1kg_afr/amr/eas/eur/sas (present in the 78-col X_train per the gate diff)</w:t>
+      </w:r>
+    </w:p>
+    <w:p>
+      <w:r>
+        <w:t>are populated or placeholder-zero, and reconcile against population_1kg_af being listed under</w:t>
+      </w:r>
+    </w:p>
+    <w:p>
+      <w:r>
+        <w:t>PHASE_4_FEATURES (pending).</w:t>
+      </w:r>
+    </w:p>
+    <w:p>
+      <w:pPr>
+        <w:pStyle w:val="ListBullet"/>
+      </w:pPr>
+      <w:r>
+        <w:t>Ref: docs/sessions/SESSION_2026-06-11_ci-and-schema-gate.md;</w:t>
+      </w:r>
+    </w:p>
+    <w:p>
+      <w:r>
+        <w:t>docs/incidents/INCIDENT_2026-06-11_ci-optional-deps.md.</w:t>
       </w:r>
     </w:p>
     <w:sectPr>

</xml_diff>

<commit_message>
docs: close 2026-06-11 PM session (ESM-2 650M LLR fix + train.py wiring)
Session note, CHANGELOG, ROADMAP delta, regenerated ROADMAP.docx for 98c8fa3 (LLR windowing) and 473a861 (train.py ESM-2 flags). Records the Run 16 launch contract and open blockers (CNN meta_train, schema refresh 78->79, doc drift).
</commit_message>
<xml_diff>
--- a/docs/ROADMAP.docx
+++ b/docs/ROADMAP.docx
@@ -1683,6 +1683,181 @@
     <w:p>
       <w:r>
         <w:t>docs/incidents/INCIDENT_2026-06-11_ci-optional-deps.md.</w:t>
+      </w:r>
+    </w:p>
+    <w:p>
+      <w:r>
+        <w:t>&lt;!-- docs-close: ecd0474 esm2-llr+train-wiring --&gt;</w:t>
+      </w:r>
+    </w:p>
+    <w:p>
+      <w:pPr>
+        <w:pStyle w:val="Heading2"/>
+      </w:pPr>
+      <w:r>
+        <w:t>ROADMAP delta -- 2026-06-11 (PM)</w:t>
+      </w:r>
+    </w:p>
+    <w:p>
+      <w:pPr>
+        <w:pStyle w:val="Heading3"/>
+      </w:pPr>
+      <w:r>
+        <w:t>Done</w:t>
+      </w:r>
+    </w:p>
+    <w:p>
+      <w:pPr>
+        <w:pStyle w:val="ListBullet"/>
+      </w:pPr>
+      <w:r>
+        <w:t>[x] ESM-2 LLR long-protein OOM fixed via windowing (1db43f1)</w:t>
+      </w:r>
+    </w:p>
+    <w:p>
+      <w:pPr>
+        <w:pStyle w:val="ListBullet"/>
+      </w:pPr>
+      <w:r>
+        <w:t>[x] ESM-2 650M activation validated on real data (CPU probe GREEN)</w:t>
+      </w:r>
+    </w:p>
+    <w:p>
+      <w:pPr>
+        <w:pStyle w:val="ListBullet"/>
+      </w:pPr>
+      <w:r>
+        <w:t>[x] DECISION resolved: ESM-2 650M for Run 16 (ESM C 600M = later A/B)</w:t>
+      </w:r>
+    </w:p>
+    <w:p>
+      <w:pPr>
+        <w:pStyle w:val="ListBullet"/>
+      </w:pPr>
+      <w:r>
+        <w:t>[x] train.py ESM-2 wiring: model + offline index + cache + device flags (ecd0474)</w:t>
+      </w:r>
+    </w:p>
+    <w:p>
+      <w:pPr>
+        <w:pStyle w:val="ListBullet"/>
+      </w:pPr>
+      <w:r>
+        <w:t>[x] metrics annotation_sources provenance extended (esm2/finngen/dbnsfp)</w:t>
+      </w:r>
+    </w:p>
+    <w:p>
+      <w:pPr>
+        <w:pStyle w:val="Heading3"/>
+      </w:pPr>
+      <w:r>
+        <w:t>Run 16 launch contract (preflight MUST Test-Path each)</w:t>
+      </w:r>
+    </w:p>
+    <w:p>
+      <w:pPr>
+        <w:pStyle w:val="ListBullet"/>
+      </w:pPr>
+      <w:r>
+        <w:t>--esm2-model esm2_t33_650M_UR50D</w:t>
+      </w:r>
+    </w:p>
+    <w:p>
+      <w:pPr>
+        <w:pStyle w:val="ListBullet"/>
+      </w:pPr>
+      <w:r>
+        <w:t>--esm2-uniprot-index data\external\uniprot\uniprot_human_reviewed.parquet</w:t>
+      </w:r>
+    </w:p>
+    <w:p>
+      <w:pPr>
+        <w:pStyle w:val="ListBullet"/>
+      </w:pPr>
+      <w:r>
+        <w:t>--alphamissense &lt;AlphaMissense scores path&gt;</w:t>
+      </w:r>
+    </w:p>
+    <w:p>
+      <w:pPr>
+        <w:pStyle w:val="Heading3"/>
+      </w:pPr>
+      <w:r>
+        <w:t>Open -- blocking Run 16</w:t>
+      </w:r>
+    </w:p>
+    <w:p>
+      <w:pPr>
+        <w:pStyle w:val="ListBullet"/>
+      </w:pPr>
+      <w:r>
+        <w:t>[ ] CNN train-sequence NotImplementedError: verify cohort fasta_seq density; plumb</w:t>
+      </w:r>
+    </w:p>
+    <w:p>
+      <w:r>
+        <w:t>meta_train (Option-B-wide) or keep CNN on placeholder seqs (INCIDENT_2026-05-30).</w:t>
+      </w:r>
+    </w:p>
+    <w:p>
+      <w:pPr>
+        <w:pStyle w:val="ListBullet"/>
+      </w:pPr>
+      <w:r>
+        <w:t>[ ] ONE preflight script (3 mandatory paths + instance/SSH/key vars, validated).</w:t>
+      </w:r>
+    </w:p>
+    <w:p>
+      <w:pPr>
+        <w:pStyle w:val="ListBullet"/>
+      </w:pPr>
+      <w:r>
+        <w:t>[ ] Standing run gates: all-models smoke, full suite green, zero known bugs.</w:t>
+      </w:r>
+    </w:p>
+    <w:p>
+      <w:pPr>
+        <w:pStyle w:val="Heading3"/>
+      </w:pPr>
+      <w:r>
+        <w:t>Open -- post-regen / parallel</w:t>
+      </w:r>
+    </w:p>
+    <w:p>
+      <w:pPr>
+        <w:pStyle w:val="ListBullet"/>
+      </w:pPr>
+      <w:r>
+        <w:t>[ ] Schema baseline refresh 78 -&gt; 79 (esm2_llr newly live).</w:t>
+      </w:r>
+    </w:p>
+    <w:p>
+      <w:pPr>
+        <w:pStyle w:val="ListBullet"/>
+      </w:pPr>
+      <w:r>
+        <w:t>[ ] EVE activation (EVE_scores_ASM acquisition) -- separate data track.</w:t>
+      </w:r>
+    </w:p>
+    <w:p>
+      <w:pPr>
+        <w:pStyle w:val="ListBullet"/>
+      </w:pPr>
+      <w:r>
+        <w:t>[ ] Doc drift: AnnotationConfig docstring 17 vs code 18 steps (Reactome already runs);</w:t>
+      </w:r>
+    </w:p>
+    <w:p>
+      <w:r>
+        <w:t>reconcile per-step log labels (15/16, 16/17, 17/17, 18/18).</w:t>
+      </w:r>
+    </w:p>
+    <w:p>
+      <w:pPr>
+        <w:pStyle w:val="ListBullet"/>
+      </w:pPr>
+      <w:r>
+        <w:t>[ ] Hygiene: non-ASCII em-dash in real_data_prep.py esm2_delta_norm comment.</w:t>
       </w:r>
     </w:p>
     <w:sectPr>

</xml_diff>

<commit_message>
docs: close 2026-06-11 (late PM) CNN + RNA-delta activation session
CHANGELOG + session log + ROADMAP delta for 1c0523b (1D-CNN on real ref/alt delta windows) and f19b609 (maxentscan_delta; EXPECTED_TABULAR_FEATURE_COUNT 80->81). Supersedes the resolved CNN-NotImplementedError open item and the stale 'schema baseline refresh 78->79' line (now: regenerate from post-Run-16 X_train at 81). Records the load-bearing --clinvar ref/alt-cohort launch-contract requirement, the always-donor MaxEntScan follow-up, and the new run-gate that every feature must appear populated in the correctness-harness reference slice. ROADMAP.docx regenerated.

Both feature commits already on origin/main; full suite 893 passed / 6 skipped.
</commit_message>
<xml_diff>
--- a/docs/ROADMAP.docx
+++ b/docs/ROADMAP.docx
@@ -1858,6 +1858,189 @@
       </w:pPr>
       <w:r>
         <w:t>[ ] Hygiene: non-ASCII em-dash in real_data_prep.py esm2_delta_norm comment.</w:t>
+      </w:r>
+    </w:p>
+    <w:p>
+      <w:pPr>
+        <w:pStyle w:val="Heading2"/>
+      </w:pPr>
+      <w:r>
+        <w:t>ROADMAP delta -- 2026-06-11 (late PM, CNN + RNA activation)</w:t>
+      </w:r>
+    </w:p>
+    <w:p>
+      <w:pPr>
+        <w:pStyle w:val="Heading3"/>
+      </w:pPr>
+      <w:r>
+        <w:t>Done</w:t>
+      </w:r>
+    </w:p>
+    <w:p>
+      <w:pPr>
+        <w:pStyle w:val="ListBullet"/>
+      </w:pPr>
+      <w:r>
+        <w:t>[x] 1D-CNN activated on real [fasta_seq_ref, fasta_seq_alt] delta windows; train-side via the</w:t>
+      </w:r>
+    </w:p>
+    <w:p>
+      <w:r>
+        <w:t>persisted meta_train.parquet (gene-split-aligned to X_train); NotImplementedError removed</w:t>
+      </w:r>
+    </w:p>
+    <w:p>
+      <w:r>
+        <w:t>(fb12c0f). SUPERSEDES the "Open -- blocking Run 16" item "CNN train-sequence</w:t>
+      </w:r>
+    </w:p>
+    <w:p>
+      <w:r>
+        <w:t>NotImplementedError ... (INCIDENT_2026-05-30)".</w:t>
+      </w:r>
+    </w:p>
+    <w:p>
+      <w:pPr>
+        <w:pStyle w:val="ListBullet"/>
+      </w:pPr>
+      <w:r>
+        <w:t>[x] RNA MaxEntScan activated: maxentscan_delta = score(alt) - score(ref), a NEW</w:t>
+      </w:r>
+    </w:p>
+    <w:p>
+      <w:r>
+        <w:t>variant-specific splice-disruption feature. The MaxEntScan source moves from Section 4B</w:t>
+      </w:r>
+    </w:p>
+    <w:p>
+      <w:r>
+        <w:t>(Scaffolded but DEAD/partial) to LIVE. maxentscan_score keeps its meaning (ref-window score).</w:t>
+      </w:r>
+    </w:p>
+    <w:p>
+      <w:r>
+        <w:t>EXPECTED_TABULAR_FEATURE_COUNT 80 -&gt; 81 (e3bcd79).</w:t>
+      </w:r>
+    </w:p>
+    <w:p>
+      <w:pPr>
+        <w:pStyle w:val="Heading3"/>
+      </w:pPr>
+      <w:r>
+        <w:t>Run 16 launch contract -- ADDITION (preflight MUST Test-Path)</w:t>
+      </w:r>
+    </w:p>
+    <w:p>
+      <w:pPr>
+        <w:pStyle w:val="ListBullet"/>
+      </w:pPr>
+      <w:r>
+        <w:t>--clinvar data\processed\clinvar_grch38_clean_seq.parquet  (the ref/alt cohort). Without it</w:t>
+      </w:r>
+    </w:p>
+    <w:p>
+      <w:r>
+        <w:t>BOTH the CNN and maxentscan_delta degrade to inert: _load_and_label preserves input columns,</w:t>
+      </w:r>
+    </w:p>
+    <w:p>
+      <w:r>
+        <w:t>but real_data_prep never adds fasta_seq* itself, so the ref/alt windows exist on the frame</w:t>
+      </w:r>
+    </w:p>
+    <w:p>
+      <w:r>
+        <w:t>ONLY if the input cohort carries them. Joins the existing --esm2-model esm2_t33_650M_UR50D,</w:t>
+      </w:r>
+    </w:p>
+    <w:p>
+      <w:r>
+        <w:t>--esm2-uniprot-index, and --alphamissense requirements.</w:t>
+      </w:r>
+    </w:p>
+    <w:p>
+      <w:pPr>
+        <w:pStyle w:val="Heading3"/>
+      </w:pPr>
+      <w:r>
+        <w:t>Open -- post-regen / parallel (updated)</w:t>
+      </w:r>
+    </w:p>
+    <w:p>
+      <w:pPr>
+        <w:pStyle w:val="ListBullet"/>
+      </w:pPr>
+      <w:r>
+        <w:t>[ ] Schema baseline refresh: regenerate data/reference/schema/schema_baseline.json from the</w:t>
+      </w:r>
+    </w:p>
+    <w:p>
+      <w:r>
+        <w:t>post-Run-16 X_train. Target = EXPECTED_TABULAR_FEATURE_COUNT (now 81: +esm2_llr +maxentscan_delta</w:t>
+      </w:r>
+    </w:p>
+    <w:p>
+      <w:r>
+        <w:t>vs the sealed-78 baseline). SUPERSEDES the earlier "Schema baseline refresh 78 -&gt; 79" line. The</w:t>
+      </w:r>
+    </w:p>
+    <w:p>
+      <w:r>
+        <w:t>pre-existing 78/79/80 spread (Feature-count reconciliation, TO VERIFY) reconciles AT this regen</w:t>
+      </w:r>
+    </w:p>
+    <w:p>
+      <w:r>
+        <w:t>by diffing actual X_train columns against TABULAR_FEATURES -- not asserted here.</w:t>
+      </w:r>
+    </w:p>
+    <w:p>
+      <w:pPr>
+        <w:pStyle w:val="ListBullet"/>
+      </w:pPr>
+      <w:r>
+        <w:t>[ ] Always-donor MaxEntScan selection bug: donor/acceptor choice is bounds-based (always donor</w:t>
+      </w:r>
+    </w:p>
+    <w:p>
+      <w:r>
+        <w:t>for a 101bp window), so maxentscan_delta measures a donor perturbation even for acceptor-region</w:t>
+      </w:r>
+    </w:p>
+    <w:p>
+      <w:r>
+        <w:t>variants. Biology-correct selection (drive from dist_to_donor/dist_to_acceptor) is the next RNA</w:t>
+      </w:r>
+    </w:p>
+    <w:p>
+      <w:r>
+        <w:t>item. Does NOT block Run 16.</w:t>
+      </w:r>
+    </w:p>
+    <w:p>
+      <w:pPr>
+        <w:pStyle w:val="Heading3"/>
+      </w:pPr>
+      <w:r>
+        <w:t>Standing discipline -- ADDITION</w:t>
+      </w:r>
+    </w:p>
+    <w:p>
+      <w:pPr>
+        <w:pStyle w:val="ListBullet"/>
+      </w:pPr>
+      <w:r>
+        <w:t>Every new tabular feature must appear, POPULATED (non-zero / non-degenerate), in the</w:t>
+      </w:r>
+    </w:p>
+    <w:p>
+      <w:r>
+        <w:t>correctness-harness reference slice (build_reference_slice). This session the harness stage-5</w:t>
+      </w:r>
+    </w:p>
+    <w:p>
+      <w:r>
+        <w:t>silent-zero tripwire was the ONLY gate that caught a feature added without its slice entry.</w:t>
       </w:r>
     </w:p>
     <w:sectPr>

</xml_diff>

<commit_message>
docs: record CI ESM-2 Hub-flake incident + resolution
INCIDENT_2026-06-12 + CHANGELOG + ROADMAP delta for the flaky live ESM-2 download (4a57773 test skip-guard + ci.yml offline/maxfail hardening). Adds two standing gates: run the suite under an empty offline HF cache before trusting green; CI uses --maxfail=5 instead of -x. ROADMAP.docx regenerated.
</commit_message>
<xml_diff>
--- a/docs/ROADMAP.docx
+++ b/docs/ROADMAP.docx
@@ -2041,6 +2041,110 @@
     <w:p>
       <w:r>
         <w:t>silent-zero tripwire was the ONLY gate that caught a feature added without its slice entry.</w:t>
+      </w:r>
+    </w:p>
+    <w:p>
+      <w:pPr>
+        <w:pStyle w:val="Heading2"/>
+      </w:pPr>
+      <w:r>
+        <w:t>ROADMAP delta -- 2026-06-12 (CI ESM-2 Hub flake resolved)</w:t>
+      </w:r>
+    </w:p>
+    <w:p>
+      <w:pPr>
+        <w:pStyle w:val="Heading3"/>
+      </w:pPr>
+      <w:r>
+        <w:t>Done</w:t>
+      </w:r>
+    </w:p>
+    <w:p>
+      <w:pPr>
+        <w:pStyle w:val="ListBullet"/>
+      </w:pPr>
+      <w:r>
+        <w:t>[x] CI restored to green. test_llr_long_protein_scores_finite_without_oom was loading</w:t>
+      </w:r>
+    </w:p>
+    <w:p>
+      <w:r>
+        <w:t>the real ESM-2 8M from HF Hub; CI (no cache, 429) flaked red while local (cached) passed.</w:t>
+      </w:r>
+    </w:p>
+    <w:p>
+      <w:r>
+        <w:t>fee2e63 skip-guards the live load; ci.yml now forces HF offline and uses --maxfail=5.</w:t>
+      </w:r>
+    </w:p>
+    <w:p>
+      <w:r>
+        <w:t>See docs/incidents/INCIDENT_2026-06-12_ci-esm2-hub-flake.md.</w:t>
+      </w:r>
+    </w:p>
+    <w:p>
+      <w:pPr>
+        <w:pStyle w:val="Heading3"/>
+      </w:pPr>
+      <w:r>
+        <w:t>Standing disciplines -- ADDITIONS</w:t>
+      </w:r>
+    </w:p>
+    <w:p>
+      <w:pPr>
+        <w:pStyle w:val="ListBullet"/>
+      </w:pPr>
+      <w:r>
+        <w:t>Offline-suite gate: before trusting "suite green", run tests/unit under an empty offline</w:t>
+      </w:r>
+    </w:p>
+    <w:p>
+      <w:r>
+        <w:t>HF cache (HF_HOME=&lt;empty&gt;, HF_HUB_OFFLINE=1, TRANSFORMERS_OFFLINE=1). Anything that ERRORS</w:t>
+      </w:r>
+    </w:p>
+    <w:p>
+      <w:r>
+        <w:t>(vs passes/skips) is a network-coupled test to guard. Local-green != CI-green for any test</w:t>
+      </w:r>
+    </w:p>
+    <w:p>
+      <w:r>
+        <w:t>that loads an ESM-2 model (the local cache hides the dependency).</w:t>
+      </w:r>
+    </w:p>
+    <w:p>
+      <w:pPr>
+        <w:pStyle w:val="ListBullet"/>
+      </w:pPr>
+      <w:r>
+        <w:t>CI surfaces failures broadly: pytest -x replaced by --maxfail=5 so a break is not reported</w:t>
+      </w:r>
+    </w:p>
+    <w:p>
+      <w:r>
+        <w:t>as a single isolated failure with the rest of the suite hidden.</w:t>
+      </w:r>
+    </w:p>
+    <w:p>
+      <w:pPr>
+        <w:pStyle w:val="Heading3"/>
+      </w:pPr>
+      <w:r>
+        <w:t>Note (unchanged, benign)</w:t>
+      </w:r>
+    </w:p>
+    <w:p>
+      <w:pPr>
+        <w:pStyle w:val="ListBullet"/>
+      </w:pPr>
+      <w:r>
+        <w:t>0xc0000139 torch_scatter/torch_sparse dumps during collection are the known-benign</w:t>
+      </w:r>
+    </w:p>
+    <w:p>
+      <w:r>
+        <w:t>importorskip path (missing PyG C-extensions on the CPU box); suite exit stays 0.</w:t>
       </w:r>
     </w:p>
     <w:sectPr>

</xml_diff>

<commit_message>
docs: record protein-coord index corruption + repair; add hardened coverage probe
probe v1 re-run after deleting the cache rebuilt the protein-coord index from a 50k sample, overwriting the full 17.8MB index with a 0.29MB one; a regen would have loaded it and aborted at the coverage gate (~1% full-cohort coverage -- the Run-15 ESM-2 silent-zero class). probe v2 is read-only by default, size-checks the cache (full ~18MB), and only rebuilds the FULL index via --rebuild-full. Rebuilt: 18.64MB, full-cohort coverage 0.9665 (2,405,448/2,488,889 missense). Confirms --alphamissense=TSV is correct for Run 16.

INCIDENT_2026-06-12_protein-coord-index-corruption.md + CHANGELOG + ROADMAP delta.
</commit_message>
<xml_diff>
--- a/docs/ROADMAP.docx
+++ b/docs/ROADMAP.docx
@@ -2145,6 +2145,76 @@
     <w:p>
       <w:r>
         <w:t>importorskip path (missing PyG C-extensions on the CPU box); suite exit stays 0.</w:t>
+      </w:r>
+    </w:p>
+    <w:p>
+      <w:r>
+        <w:t>&lt;!-- roadmap-delta: protein-coord-rebuild 2026-06-12 --&gt;</w:t>
+      </w:r>
+    </w:p>
+    <w:p>
+      <w:pPr>
+        <w:pStyle w:val="Heading2"/>
+      </w:pPr>
+      <w:r>
+        <w:t>ROADMAP delta -- 2026-06-12 (protein-coord index repair + Run-16 input contract)</w:t>
+      </w:r>
+    </w:p>
+    <w:p>
+      <w:pPr>
+        <w:pStyle w:val="ListBullet"/>
+      </w:pPr>
+      <w:r>
+        <w:t>Protein-coord index rebuilt full-cohort: 18.64 MB, 0.9665 coverage (ESM-2 ready).</w:t>
+      </w:r>
+    </w:p>
+    <w:p>
+      <w:pPr>
+        <w:pStyle w:val="ListBullet"/>
+      </w:pPr>
+      <w:r>
+        <w:t>Run-16 launch contract (mandatory flags): --clinvar clean_seq cohort (ref/alt);</w:t>
+      </w:r>
+    </w:p>
+    <w:p>
+      <w:r>
+        <w:t>--esm2-model esm2_t33_650M_UR50D; --esm2-uniprot-index uniprot_human_reviewed.parquet;</w:t>
+      </w:r>
+    </w:p>
+    <w:p>
+      <w:r>
+        <w:t>--alphamissense data/external/alphamissense/AlphaMissense_hg38.tsv.gz (TSV, NOT the</w:t>
+      </w:r>
+    </w:p>
+    <w:p>
+      <w:r>
+        <w:t>scores parquet); --gnomad-constraint data/external/gnomad/gnomad.v4.1.constraint_metrics.tsv.</w:t>
+      </w:r>
+    </w:p>
+    <w:p>
+      <w:pPr>
+        <w:pStyle w:val="ListBullet"/>
+      </w:pPr>
+      <w:r>
+        <w:t>Data staging: ship the 18.64 MB protein-coord index to Vast.ai co-located with the</w:t>
+      </w:r>
+    </w:p>
+    <w:p>
+      <w:r>
+        <w:t>--alphamissense dir so the regen loads it (no 613 MB TSV re-scan).</w:t>
+      </w:r>
+    </w:p>
+    <w:p>
+      <w:pPr>
+        <w:pStyle w:val="ListBullet"/>
+      </w:pPr>
+      <w:r>
+        <w:t>Open: decouple the protein-coord source from --alphamissense (elegant fix removing</w:t>
+      </w:r>
+    </w:p>
+    <w:p>
+      <w:r>
+        <w:t>the scores-parquet-vs-TSV trap); fold a coverage/size check into the preflight.</w:t>
       </w:r>
     </w:p>
     <w:sectPr>

</xml_diff>

<commit_message>
docs: close 2026-06-12 Run-16 smoke-gate session (gate cleared)
SESSION + CHANGELOG + ROADMAP deltas for the session that cleared the Run-16 all-models smoke: gnomAD-constraint wiring + preflight #5, ReviewStatus re-augment + preflight #6, AlphaMissense 16 GiB cache OOM (move-aside + ship-TSV), UTF-8 stdio + ASCII-clean variant_ensemble. Complete --fast smoke (724s): 13 models, 81 features, ENSEMBLE_STACKER test AUROC 0.9934. Watch-items recorded: cnn_1d ~0.5 / kan ~0.74 at smoke scale; gene-level top features (gene-disjoint splits + cross-fold leakage); AlphaFold-structure stub. ROADMAP.docx regenerated.

Commits referenced: 487c413, 45b5fe1, eb5ad30, 2edb533, e072eeb.
</commit_message>
<xml_diff>
--- a/docs/ROADMAP.docx
+++ b/docs/ROADMAP.docx
@@ -2215,6 +2215,109 @@
     <w:p>
       <w:r>
         <w:t>the scores-parquet-vs-TSV trap); fold a coverage/size check into the preflight.</w:t>
+      </w:r>
+    </w:p>
+    <w:p>
+      <w:r>
+        <w:t>&lt;!-- roadmap-delta: run16-smoke-gate 2026-06-12 --&gt;</w:t>
+      </w:r>
+    </w:p>
+    <w:p>
+      <w:pPr>
+        <w:pStyle w:val="Heading2"/>
+      </w:pPr>
+      <w:r>
+        <w:t>ROADMAP delta -- 2026-06-12 (Run-16 smoke gate cleared)</w:t>
+      </w:r>
+    </w:p>
+    <w:p>
+      <w:pPr>
+        <w:pStyle w:val="ListBullet"/>
+      </w:pPr>
+      <w:r>
+        <w:t>Run-16 all-models smoke: COMPLETE end-to-end (724s); ENSEMBLE_STACKER test AUROC 0.9934.</w:t>
+      </w:r>
+    </w:p>
+    <w:p>
+      <w:r>
+        <w:t>The --fast smoke is the authoritative gate; the input preflight (now 6 checks) is a fast</w:t>
+      </w:r>
+    </w:p>
+    <w:p>
+      <w:r>
+        <w:t>necessary pre-screen only.</w:t>
+      </w:r>
+    </w:p>
+    <w:p>
+      <w:pPr>
+        <w:pStyle w:val="ListBullet"/>
+      </w:pPr>
+      <w:r>
+        <w:t>Run-16 launch contract (mandatory data-feeding flags): --clinvar clinvar_grch38_clean_seq</w:t>
+      </w:r>
+    </w:p>
+    <w:p>
+      <w:r>
+        <w:t>(ref/alt + ReviewStatus); --esm2-model esm2_t33_650M_UR50D; `--esm2-uniprot-index</w:t>
+      </w:r>
+    </w:p>
+    <w:p>
+      <w:r>
+        <w:t>uniprot_human_reviewed.parquet; --alphamissense AlphaMissense_hg38.tsv.gz` (TSV, NOT the</w:t>
+      </w:r>
+    </w:p>
+    <w:p>
+      <w:r>
+        <w:t>scores parquet -- the parquet cache OOMs at 16 GiB); `--gnomad-constraint</w:t>
+      </w:r>
+    </w:p>
+    <w:p>
+      <w:r>
+        <w:t>gnomad.v4.1.constraint_metrics.tsv`.</w:t>
+      </w:r>
+    </w:p>
+    <w:p>
+      <w:pPr>
+        <w:pStyle w:val="ListBullet"/>
+      </w:pPr>
+      <w:r>
+        <w:t>Data staging: ship the TSV (not the 740 MB scores cache) + the 18.64 MB protein-coord index</w:t>
+      </w:r>
+    </w:p>
+    <w:p>
+      <w:r>
+        <w:t>co-located under data/external/alphamissense/.</w:t>
+      </w:r>
+    </w:p>
+    <w:p>
+      <w:pPr>
+        <w:pStyle w:val="ListBullet"/>
+      </w:pPr>
+      <w:r>
+        <w:t>Open decisions: production optional flags (--gnomad allele-freq, --uniprot, --dbnsfp-path,</w:t>
+      </w:r>
+    </w:p>
+    <w:p>
+      <w:r>
+        <w:t>--lovd-path, --finngen-path) + paths; optional AlphaMissense cohort-filtered cache read;</w:t>
+      </w:r>
+    </w:p>
+    <w:p>
+      <w:r>
+        <w:t>optional decouple of protein-coord source from --alphamissense.</w:t>
+      </w:r>
+    </w:p>
+    <w:p>
+      <w:pPr>
+        <w:pStyle w:val="ListBullet"/>
+      </w:pPr>
+      <w:r>
+        <w:t>Watch (full regen): cnn_1d (~0.5) and kan (~0.74) at scale; gene-disjoint splits + cross-fold</w:t>
+      </w:r>
+    </w:p>
+    <w:p>
+      <w:r>
+        <w:t>count leakage on gene-level features; AlphaFold-structure stub (pLDDT=50.0 default).</w:t>
       </w:r>
     </w:p>
     <w:sectPr>

</xml_diff>

<commit_message>
docs(session): close 2026-06-12 Run-16b -- smoke gate, schema re-seal, source finalization
SESSION doc + CHANGELOG/ROADMAP deltas. Run 16 tabular launch-ready (schema 81, flag set frozen); Run 17 committed scope (1KGP Track A + leakage-free GNN Track B) per docs/roadmap/RUN17_SCOPE.md.
</commit_message>
<xml_diff>
--- a/docs/ROADMAP.docx
+++ b/docs/ROADMAP.docx
@@ -2318,6 +2318,70 @@
     <w:p>
       <w:r>
         <w:t>count leakage on gene-level features; AlphaFold-structure stub (pLDDT=50.0 default).</w:t>
+      </w:r>
+    </w:p>
+    <w:p>
+      <w:pPr>
+        <w:pStyle w:val="Heading2"/>
+      </w:pPr>
+      <w:r>
+        <w:t>2026-06-12 -- Run 16 launch-ready; Run 17 scope committed</w:t>
+      </w:r>
+    </w:p>
+    <w:p>
+      <w:r>
+        <w:t>Run 16 (tabular): VALIDATED + launch-ready. Flag set frozen</w:t>
+      </w:r>
+    </w:p>
+    <w:p>
+      <w:r>
+        <w:t>(docs/launch/LAUNCH_CONTRACT_run16.md). Schema sealed at 81 (run16b-smoke). gnn_score,</w:t>
+      </w:r>
+    </w:p>
+    <w:p>
+      <w:r>
+        <w:t>af_1kg_*, and uniprot features dormant-by-design (sealed, will activate later).</w:t>
+      </w:r>
+    </w:p>
+    <w:p>
+      <w:r>
+        <w:t>Run 17 (COMMITTED, not deferred -- docs/roadmap/RUN17_SCOPE.md):</w:t>
+      </w:r>
+    </w:p>
+    <w:p>
+      <w:pPr>
+        <w:pStyle w:val="ListBullet"/>
+      </w:pPr>
+      <w:r>
+        <w:t>Track A: 1000 Genomes AF -- build_1kg_parquet.py + --kg-path + validate AF-fill;</w:t>
+      </w:r>
+    </w:p>
+    <w:p>
+      <w:r>
+        <w:t>resolve af_1kg_* per-population stubs (wire or formally retire).</w:t>
+      </w:r>
+    </w:p>
+    <w:p>
+      <w:pPr>
+        <w:pStyle w:val="ListBullet"/>
+      </w:pPr>
+      <w:r>
+        <w:t>Track B: STRING-DB GNN -- gnn_score live + LEAKAGE-FREE via gene-disjoint cross-fitting,</w:t>
+      </w:r>
+    </w:p>
+    <w:p>
+      <w:r>
+        <w:t>held-out-gene no-leak check, WITH/WITHOUT ablation.</w:t>
+      </w:r>
+    </w:p>
+    <w:p>
+      <w:r>
+        <w:t>Both gated by full-scale feature-population audit + schema drift-check + gene-disjoint</w:t>
+      </w:r>
+    </w:p>
+    <w:p>
+      <w:r>
+        <w:t>integrity verification before Run 17 trains.</w:t>
       </w:r>
     </w:p>
     <w:sectPr>

</xml_diff>

<commit_message>
docs: ROADMAP.docx fallback renders GFM tables as real Word tables
make_roadmap_docx.py python-docx fallback was emitting markdown tables as literal "| ... |"
paragraphs (committed ROADMAP.docx had 0 Word tables / 297 literal pipes; pandoc not on PATH).
Fallback now detects GFM table blocks (header + separator + body) and builds real Word tables
(Table Grid, bold header). Validated: 7 tables, matching the pandoc path. pandoc path + main()
untouched. Regenerated ROADMAP.docx from the post-PAR-fix ROADMAP.md.
</commit_message>
<xml_diff>
--- a/docs/ROADMAP.docx
+++ b/docs/ROADMAP.docx
@@ -77,41 +77,347 @@
         <w:t>2. Phase model</w:t>
       </w:r>
     </w:p>
-    <w:p>
-      <w:r>
-        <w:t>| Phase | Name | Scope | Legacy label | State |</w:t>
-      </w:r>
-    </w:p>
-    <w:p>
-      <w:r>
-        <w:t>| --- | --- | --- | --- | --- |</w:t>
-      </w:r>
-    </w:p>
-    <w:p>
-      <w:r>
-        <w:t>| F | Foundation | Bug-fixed core, ensemble+GNN+KAN, real ClinVar | Phase 1 / Phase 0 | DONE |</w:t>
-      </w:r>
-    </w:p>
-    <w:p>
-      <w:r>
-        <w:t>| D | Data expansion | Wire sources; activate dead columns; add new sources | Phase 2 (partly) | IN PROGRESS |</w:t>
-      </w:r>
-    </w:p>
-    <w:p>
-      <w:r>
-        <w:t>| P | Performance/infra | Polars layer; Rust inference service | roadmap 3/5 | NOT STARTED |</w:t>
-      </w:r>
-    </w:p>
-    <w:p>
-      <w:r>
-        <w:t>| A | Advanced modeling | Julia training, VAE, Bayesian UQ, GraphGPS | roadmap 4 | NOT STARTED |</w:t>
-      </w:r>
-    </w:p>
-    <w:p>
-      <w:r>
-        <w:t>| X | Productionization | REST API, Docker, clinical eval/report | Phase 2 (API/Docker) | NOT STARTED |</w:t>
-      </w:r>
-    </w:p>
+    <w:tbl>
+      <w:tblPr>
+        <w:tblStyle w:val="TableGrid"/>
+        <w:tblW w:type="auto" w:w="0"/>
+        <w:tblLook w:firstColumn="1" w:firstRow="1" w:lastColumn="0" w:lastRow="0" w:noHBand="0" w:noVBand="1" w:val="04A0"/>
+      </w:tblPr>
+      <w:tblGrid>
+        <w:gridCol w:w="1728"/>
+        <w:gridCol w:w="1728"/>
+        <w:gridCol w:w="1728"/>
+        <w:gridCol w:w="1728"/>
+        <w:gridCol w:w="1728"/>
+      </w:tblGrid>
+      <w:tr>
+        <w:tc>
+          <w:tcPr>
+            <w:tcW w:type="dxa" w:w="1728"/>
+          </w:tcPr>
+          <w:p>
+            <w:r>
+              <w:rPr>
+                <w:b/>
+              </w:rPr>
+              <w:t>Phase</w:t>
+            </w:r>
+          </w:p>
+        </w:tc>
+        <w:tc>
+          <w:tcPr>
+            <w:tcW w:type="dxa" w:w="1728"/>
+          </w:tcPr>
+          <w:p>
+            <w:r>
+              <w:rPr>
+                <w:b/>
+              </w:rPr>
+              <w:t>Name</w:t>
+            </w:r>
+          </w:p>
+        </w:tc>
+        <w:tc>
+          <w:tcPr>
+            <w:tcW w:type="dxa" w:w="1728"/>
+          </w:tcPr>
+          <w:p>
+            <w:r>
+              <w:rPr>
+                <w:b/>
+              </w:rPr>
+              <w:t>Scope</w:t>
+            </w:r>
+          </w:p>
+        </w:tc>
+        <w:tc>
+          <w:tcPr>
+            <w:tcW w:type="dxa" w:w="1728"/>
+          </w:tcPr>
+          <w:p>
+            <w:r>
+              <w:rPr>
+                <w:b/>
+              </w:rPr>
+              <w:t>Legacy label</w:t>
+            </w:r>
+          </w:p>
+        </w:tc>
+        <w:tc>
+          <w:tcPr>
+            <w:tcW w:type="dxa" w:w="1728"/>
+          </w:tcPr>
+          <w:p>
+            <w:r>
+              <w:rPr>
+                <w:b/>
+              </w:rPr>
+              <w:t>State</w:t>
+            </w:r>
+          </w:p>
+        </w:tc>
+      </w:tr>
+      <w:tr>
+        <w:tc>
+          <w:tcPr>
+            <w:tcW w:type="dxa" w:w="1728"/>
+          </w:tcPr>
+          <w:p>
+            <w:r>
+              <w:t>F</w:t>
+            </w:r>
+          </w:p>
+        </w:tc>
+        <w:tc>
+          <w:tcPr>
+            <w:tcW w:type="dxa" w:w="1728"/>
+          </w:tcPr>
+          <w:p>
+            <w:r>
+              <w:t>Foundation</w:t>
+            </w:r>
+          </w:p>
+        </w:tc>
+        <w:tc>
+          <w:tcPr>
+            <w:tcW w:type="dxa" w:w="1728"/>
+          </w:tcPr>
+          <w:p>
+            <w:r>
+              <w:t>Bug-fixed core, ensemble+GNN+KAN, real ClinVar</w:t>
+            </w:r>
+          </w:p>
+        </w:tc>
+        <w:tc>
+          <w:tcPr>
+            <w:tcW w:type="dxa" w:w="1728"/>
+          </w:tcPr>
+          <w:p>
+            <w:r>
+              <w:t>Phase 1 / Phase 0</w:t>
+            </w:r>
+          </w:p>
+        </w:tc>
+        <w:tc>
+          <w:tcPr>
+            <w:tcW w:type="dxa" w:w="1728"/>
+          </w:tcPr>
+          <w:p>
+            <w:r>
+              <w:t>DONE</w:t>
+            </w:r>
+          </w:p>
+        </w:tc>
+      </w:tr>
+      <w:tr>
+        <w:tc>
+          <w:tcPr>
+            <w:tcW w:type="dxa" w:w="1728"/>
+          </w:tcPr>
+          <w:p>
+            <w:r>
+              <w:t>D</w:t>
+            </w:r>
+          </w:p>
+        </w:tc>
+        <w:tc>
+          <w:tcPr>
+            <w:tcW w:type="dxa" w:w="1728"/>
+          </w:tcPr>
+          <w:p>
+            <w:r>
+              <w:t>Data expansion</w:t>
+            </w:r>
+          </w:p>
+        </w:tc>
+        <w:tc>
+          <w:tcPr>
+            <w:tcW w:type="dxa" w:w="1728"/>
+          </w:tcPr>
+          <w:p>
+            <w:r>
+              <w:t>Wire sources; activate dead columns; add new sources</w:t>
+            </w:r>
+          </w:p>
+        </w:tc>
+        <w:tc>
+          <w:tcPr>
+            <w:tcW w:type="dxa" w:w="1728"/>
+          </w:tcPr>
+          <w:p>
+            <w:r>
+              <w:t>Phase 2 (partly)</w:t>
+            </w:r>
+          </w:p>
+        </w:tc>
+        <w:tc>
+          <w:tcPr>
+            <w:tcW w:type="dxa" w:w="1728"/>
+          </w:tcPr>
+          <w:p>
+            <w:r>
+              <w:t>IN PROGRESS</w:t>
+            </w:r>
+          </w:p>
+        </w:tc>
+      </w:tr>
+      <w:tr>
+        <w:tc>
+          <w:tcPr>
+            <w:tcW w:type="dxa" w:w="1728"/>
+          </w:tcPr>
+          <w:p>
+            <w:r>
+              <w:t>P</w:t>
+            </w:r>
+          </w:p>
+        </w:tc>
+        <w:tc>
+          <w:tcPr>
+            <w:tcW w:type="dxa" w:w="1728"/>
+          </w:tcPr>
+          <w:p>
+            <w:r>
+              <w:t>Performance/infra</w:t>
+            </w:r>
+          </w:p>
+        </w:tc>
+        <w:tc>
+          <w:tcPr>
+            <w:tcW w:type="dxa" w:w="1728"/>
+          </w:tcPr>
+          <w:p>
+            <w:r>
+              <w:t>Polars layer; Rust inference service</w:t>
+            </w:r>
+          </w:p>
+        </w:tc>
+        <w:tc>
+          <w:tcPr>
+            <w:tcW w:type="dxa" w:w="1728"/>
+          </w:tcPr>
+          <w:p>
+            <w:r>
+              <w:t>roadmap 3/5</w:t>
+            </w:r>
+          </w:p>
+        </w:tc>
+        <w:tc>
+          <w:tcPr>
+            <w:tcW w:type="dxa" w:w="1728"/>
+          </w:tcPr>
+          <w:p>
+            <w:r>
+              <w:t>NOT STARTED</w:t>
+            </w:r>
+          </w:p>
+        </w:tc>
+      </w:tr>
+      <w:tr>
+        <w:tc>
+          <w:tcPr>
+            <w:tcW w:type="dxa" w:w="1728"/>
+          </w:tcPr>
+          <w:p>
+            <w:r>
+              <w:t>A</w:t>
+            </w:r>
+          </w:p>
+        </w:tc>
+        <w:tc>
+          <w:tcPr>
+            <w:tcW w:type="dxa" w:w="1728"/>
+          </w:tcPr>
+          <w:p>
+            <w:r>
+              <w:t>Advanced modeling</w:t>
+            </w:r>
+          </w:p>
+        </w:tc>
+        <w:tc>
+          <w:tcPr>
+            <w:tcW w:type="dxa" w:w="1728"/>
+          </w:tcPr>
+          <w:p>
+            <w:r>
+              <w:t>Julia training, VAE, Bayesian UQ, GraphGPS</w:t>
+            </w:r>
+          </w:p>
+        </w:tc>
+        <w:tc>
+          <w:tcPr>
+            <w:tcW w:type="dxa" w:w="1728"/>
+          </w:tcPr>
+          <w:p>
+            <w:r>
+              <w:t>roadmap 4</w:t>
+            </w:r>
+          </w:p>
+        </w:tc>
+        <w:tc>
+          <w:tcPr>
+            <w:tcW w:type="dxa" w:w="1728"/>
+          </w:tcPr>
+          <w:p>
+            <w:r>
+              <w:t>NOT STARTED</w:t>
+            </w:r>
+          </w:p>
+        </w:tc>
+      </w:tr>
+      <w:tr>
+        <w:tc>
+          <w:tcPr>
+            <w:tcW w:type="dxa" w:w="1728"/>
+          </w:tcPr>
+          <w:p>
+            <w:r>
+              <w:t>X</w:t>
+            </w:r>
+          </w:p>
+        </w:tc>
+        <w:tc>
+          <w:tcPr>
+            <w:tcW w:type="dxa" w:w="1728"/>
+          </w:tcPr>
+          <w:p>
+            <w:r>
+              <w:t>Productionization</w:t>
+            </w:r>
+          </w:p>
+        </w:tc>
+        <w:tc>
+          <w:tcPr>
+            <w:tcW w:type="dxa" w:w="1728"/>
+          </w:tcPr>
+          <w:p>
+            <w:r>
+              <w:t>REST API, Docker, clinical eval/report</w:t>
+            </w:r>
+          </w:p>
+        </w:tc>
+        <w:tc>
+          <w:tcPr>
+            <w:tcW w:type="dxa" w:w="1728"/>
+          </w:tcPr>
+          <w:p>
+            <w:r>
+              <w:t>Phase 2 (API/Docker)</w:t>
+            </w:r>
+          </w:p>
+        </w:tc>
+        <w:tc>
+          <w:tcPr>
+            <w:tcW w:type="dxa" w:w="1728"/>
+          </w:tcPr>
+          <w:p>
+            <w:r>
+              <w:t>NOT STARTED</w:t>
+            </w:r>
+          </w:p>
+        </w:tc>
+      </w:tr>
+    </w:tbl>
     <w:p>
       <w:r>
         <w:t>*We are in Phase D (data expansion). Foundation is done.*</w:t>
@@ -138,7 +444,7 @@
         <w:pStyle w:val="ListBullet"/>
       </w:pPr>
       <w:r>
-        <w:t>Unseen-gene-holdout ablation: ENSEMBLE_STACKER AUROC 0.9988 on 213,436 rows / 2,407 gene-disjoint genes (C3 falsifier (b) PASS vs 0.95). Strong generalization to unseen genes; the corpus-scope leakage question on n_pathogenic_in_gene remains open (see §5).</w:t>
+        <w:t>Unseen-gene-holdout ablation: ENSEMBLE_STACKER AUROC 0.9988 on 213,436 rows / 2,407 gene-disjoint genes (C3 falsifier (b) PASS vs 0.95). Strong generalization to unseen genes; the corpus-scope leakage question on n_pathogenic_in_gene RESOLVED 2026-06-13 (train-only at L1 689787f + L2 6b38985; lone-feature probe 0.7181 -&gt; ~0.50) (see §5).</w:t>
       </w:r>
     </w:p>
     <w:p>
@@ -202,86 +508,661 @@
         <w:t>4B. Scaffolded but DEAD / partial (Phase D targets)</w:t>
       </w:r>
     </w:p>
-    <w:p>
-      <w:r>
-        <w:t>| Source | Dead/partial column(s) | Access | Note |</w:t>
-      </w:r>
-    </w:p>
-    <w:p>
-      <w:r>
-        <w:t>| --- | --- | --- | --- |</w:t>
-      </w:r>
-    </w:p>
-    <w:p>
-      <w:r>
-        <w:t>| ESM-2 | esm2_delta_norm (secondary), esm2_llr (primary, NEW) | local model+index | Phase 1 DONE 2026-06-10: esm2_llr LLR scorer (EsmForMaskedLM logits head; WT-marginal default, masked opt-in) + feature wired (79-&gt;80 lockstep; SIGNED, NOT clipped). CPU sign/index gate PASS; sign != class (continuous). Realizes after Run 16 coord-sync with esm2_model_name=esm2_t33_650M_UR50D. ESM C 600M = Phase 2 |</w:t>
-      </w:r>
-    </w:p>
-    <w:p>
-      <w:r>
-        <w:t>| PhyloP | phylop_score | free bigWig | conservation |</w:t>
-      </w:r>
-    </w:p>
-    <w:p>
-      <w:r>
-        <w:t>| GTEx | gtex_* (6) | free | eQTL/expression |</w:t>
-      </w:r>
-    </w:p>
-    <w:p>
-      <w:r>
-        <w:t>| 1000 Genomes | af_1kg_* (5) | free VCF | population AF |</w:t>
-      </w:r>
-    </w:p>
-    <w:p>
-      <w:r>
-        <w:t>| dbSNP/RefSNP | dbsnp_af | free | stub-mode step; activation = data + config |</w:t>
-      </w:r>
-    </w:p>
-    <w:p>
-      <w:r>
-        <w:t>| AlphaFold structure | alphafold_plddt, solvent_accessibility, secondary_structure_context, dist_to_active_site, has_uniprot_annotation | free (AlphaFold DB) | stub-mode step; activation = data + config |</w:t>
-      </w:r>
-    </w:p>
-    <w:p>
-      <w:r>
-        <w:t>| OMIM | omim_* (2) | free academic w/ reg. | disease/inheritance |</w:t>
-      </w:r>
-    </w:p>
-    <w:p>
-      <w:r>
-        <w:t>| ClinGen | clingen_validity_score | free API | dtype drift: int vs float across prep/inference - fix before regen |</w:t>
-      </w:r>
-    </w:p>
-    <w:p>
-      <w:r>
-        <w:t>| FinnGen | finngen_* (3) | free summary | population enrichment |</w:t>
-      </w:r>
-    </w:p>
-    <w:p>
-      <w:r>
-        <w:t>| MaxEntScan | maxentscan_score | free tool | splice strength |</w:t>
-      </w:r>
-    </w:p>
-    <w:p>
-      <w:r>
-        <w:t>| VEP | codon_position, exon_number | free tool | coding context |</w:t>
-      </w:r>
-    </w:p>
-    <w:p>
-      <w:r>
-        <w:t>| EVE | eve_score | free score files | needs score files + HGVSp coords |</w:t>
-      </w:r>
-    </w:p>
-    <w:p>
-      <w:r>
-        <w:t>| HGMD | hgmd_* (2) | PAID, blocked | label-leakage rules |</w:t>
-      </w:r>
-    </w:p>
-    <w:p>
-      <w:r>
-        <w:t>| LOVD | lovd_variant_class | free | tiny coverage |</w:t>
-      </w:r>
-    </w:p>
+    <w:tbl>
+      <w:tblPr>
+        <w:tblStyle w:val="TableGrid"/>
+        <w:tblW w:type="auto" w:w="0"/>
+        <w:tblLook w:firstColumn="1" w:firstRow="1" w:lastColumn="0" w:lastRow="0" w:noHBand="0" w:noVBand="1" w:val="04A0"/>
+      </w:tblPr>
+      <w:tblGrid>
+        <w:gridCol w:w="2160"/>
+        <w:gridCol w:w="2160"/>
+        <w:gridCol w:w="2160"/>
+        <w:gridCol w:w="2160"/>
+      </w:tblGrid>
+      <w:tr>
+        <w:tc>
+          <w:tcPr>
+            <w:tcW w:type="dxa" w:w="2160"/>
+          </w:tcPr>
+          <w:p>
+            <w:r>
+              <w:rPr>
+                <w:b/>
+              </w:rPr>
+              <w:t>Source</w:t>
+            </w:r>
+          </w:p>
+        </w:tc>
+        <w:tc>
+          <w:tcPr>
+            <w:tcW w:type="dxa" w:w="2160"/>
+          </w:tcPr>
+          <w:p>
+            <w:r>
+              <w:rPr>
+                <w:b/>
+              </w:rPr>
+              <w:t>Dead/partial column(s)</w:t>
+            </w:r>
+          </w:p>
+        </w:tc>
+        <w:tc>
+          <w:tcPr>
+            <w:tcW w:type="dxa" w:w="2160"/>
+          </w:tcPr>
+          <w:p>
+            <w:r>
+              <w:rPr>
+                <w:b/>
+              </w:rPr>
+              <w:t>Access</w:t>
+            </w:r>
+          </w:p>
+        </w:tc>
+        <w:tc>
+          <w:tcPr>
+            <w:tcW w:type="dxa" w:w="2160"/>
+          </w:tcPr>
+          <w:p>
+            <w:r>
+              <w:rPr>
+                <w:b/>
+              </w:rPr>
+              <w:t>Note</w:t>
+            </w:r>
+          </w:p>
+        </w:tc>
+      </w:tr>
+      <w:tr>
+        <w:tc>
+          <w:tcPr>
+            <w:tcW w:type="dxa" w:w="2160"/>
+          </w:tcPr>
+          <w:p>
+            <w:r>
+              <w:t>ESM-2</w:t>
+            </w:r>
+          </w:p>
+        </w:tc>
+        <w:tc>
+          <w:tcPr>
+            <w:tcW w:type="dxa" w:w="2160"/>
+          </w:tcPr>
+          <w:p>
+            <w:r>
+              <w:t>esm2_delta_norm (secondary), esm2_llr (primary, NEW)</w:t>
+            </w:r>
+          </w:p>
+        </w:tc>
+        <w:tc>
+          <w:tcPr>
+            <w:tcW w:type="dxa" w:w="2160"/>
+          </w:tcPr>
+          <w:p>
+            <w:r>
+              <w:t>local model+index</w:t>
+            </w:r>
+          </w:p>
+        </w:tc>
+        <w:tc>
+          <w:tcPr>
+            <w:tcW w:type="dxa" w:w="2160"/>
+          </w:tcPr>
+          <w:p>
+            <w:r>
+              <w:t>Phase 1 DONE 2026-06-10: esm2_llr LLR scorer (EsmForMaskedLM logits head; WT-marginal default, masked opt-in) + feature wired (79-&gt;80 lockstep; SIGNED, NOT clipped). CPU sign/index gate PASS; sign != class (continuous). Realizes after Run 16 coord-sync with esm2_model_name=esm2_t33_650M_UR50D. ESM C 600M = Phase 2</w:t>
+            </w:r>
+          </w:p>
+        </w:tc>
+      </w:tr>
+      <w:tr>
+        <w:tc>
+          <w:tcPr>
+            <w:tcW w:type="dxa" w:w="2160"/>
+          </w:tcPr>
+          <w:p>
+            <w:r>
+              <w:t>PhyloP</w:t>
+            </w:r>
+          </w:p>
+        </w:tc>
+        <w:tc>
+          <w:tcPr>
+            <w:tcW w:type="dxa" w:w="2160"/>
+          </w:tcPr>
+          <w:p>
+            <w:r>
+              <w:t>phylop_score</w:t>
+            </w:r>
+          </w:p>
+        </w:tc>
+        <w:tc>
+          <w:tcPr>
+            <w:tcW w:type="dxa" w:w="2160"/>
+          </w:tcPr>
+          <w:p>
+            <w:r>
+              <w:t>free bigWig</w:t>
+            </w:r>
+          </w:p>
+        </w:tc>
+        <w:tc>
+          <w:tcPr>
+            <w:tcW w:type="dxa" w:w="2160"/>
+          </w:tcPr>
+          <w:p>
+            <w:r>
+              <w:t>conservation</w:t>
+            </w:r>
+          </w:p>
+        </w:tc>
+      </w:tr>
+      <w:tr>
+        <w:tc>
+          <w:tcPr>
+            <w:tcW w:type="dxa" w:w="2160"/>
+          </w:tcPr>
+          <w:p>
+            <w:r>
+              <w:t>GTEx</w:t>
+            </w:r>
+          </w:p>
+        </w:tc>
+        <w:tc>
+          <w:tcPr>
+            <w:tcW w:type="dxa" w:w="2160"/>
+          </w:tcPr>
+          <w:p>
+            <w:r>
+              <w:t>gtex_* (6)</w:t>
+            </w:r>
+          </w:p>
+        </w:tc>
+        <w:tc>
+          <w:tcPr>
+            <w:tcW w:type="dxa" w:w="2160"/>
+          </w:tcPr>
+          <w:p>
+            <w:r>
+              <w:t>free</w:t>
+            </w:r>
+          </w:p>
+        </w:tc>
+        <w:tc>
+          <w:tcPr>
+            <w:tcW w:type="dxa" w:w="2160"/>
+          </w:tcPr>
+          <w:p>
+            <w:r>
+              <w:t>eQTL/expression</w:t>
+            </w:r>
+          </w:p>
+        </w:tc>
+      </w:tr>
+      <w:tr>
+        <w:tc>
+          <w:tcPr>
+            <w:tcW w:type="dxa" w:w="2160"/>
+          </w:tcPr>
+          <w:p>
+            <w:r>
+              <w:t>1000 Genomes</w:t>
+            </w:r>
+          </w:p>
+        </w:tc>
+        <w:tc>
+          <w:tcPr>
+            <w:tcW w:type="dxa" w:w="2160"/>
+          </w:tcPr>
+          <w:p>
+            <w:r>
+              <w:t>af_1kg_* (5)</w:t>
+            </w:r>
+          </w:p>
+        </w:tc>
+        <w:tc>
+          <w:tcPr>
+            <w:tcW w:type="dxa" w:w="2160"/>
+          </w:tcPr>
+          <w:p>
+            <w:r>
+              <w:t>free VCF</w:t>
+            </w:r>
+          </w:p>
+        </w:tc>
+        <w:tc>
+          <w:tcPr>
+            <w:tcW w:type="dxa" w:w="2160"/>
+          </w:tcPr>
+          <w:p>
+            <w:r>
+              <w:t>population AF -- ACTIVE 2026-06-15: kg_grch38_af.parquet built (chr1-22 + X, 437,668 variants = ~9.9% cohort; 5 super-pops non-zero); activate via --kg. chrY/MT structurally absent from the 1000G high-coverage panel (404-confirmed) -&gt; 3,191 Y + 3,124 MT cohort variants get af_1kg=0; gnomAD Y/MT allele_freq RESOLVED 2026-06-16 (PAR X-&gt;Y fix): Y 1047/3155, MT 2731/3124</w:t>
+            </w:r>
+          </w:p>
+        </w:tc>
+      </w:tr>
+      <w:tr>
+        <w:tc>
+          <w:tcPr>
+            <w:tcW w:type="dxa" w:w="2160"/>
+          </w:tcPr>
+          <w:p>
+            <w:r>
+              <w:t>dbSNP/RefSNP</w:t>
+            </w:r>
+          </w:p>
+        </w:tc>
+        <w:tc>
+          <w:tcPr>
+            <w:tcW w:type="dxa" w:w="2160"/>
+          </w:tcPr>
+          <w:p>
+            <w:r>
+              <w:t>dbsnp_af</w:t>
+            </w:r>
+          </w:p>
+        </w:tc>
+        <w:tc>
+          <w:tcPr>
+            <w:tcW w:type="dxa" w:w="2160"/>
+          </w:tcPr>
+          <w:p>
+            <w:r>
+              <w:t>free</w:t>
+            </w:r>
+          </w:p>
+        </w:tc>
+        <w:tc>
+          <w:tcPr>
+            <w:tcW w:type="dxa" w:w="2160"/>
+          </w:tcPr>
+          <w:p>
+            <w:r>
+              <w:t>stub-mode step; activation = data + config</w:t>
+            </w:r>
+          </w:p>
+        </w:tc>
+      </w:tr>
+      <w:tr>
+        <w:tc>
+          <w:tcPr>
+            <w:tcW w:type="dxa" w:w="2160"/>
+          </w:tcPr>
+          <w:p>
+            <w:r>
+              <w:t>AlphaFold structure</w:t>
+            </w:r>
+          </w:p>
+        </w:tc>
+        <w:tc>
+          <w:tcPr>
+            <w:tcW w:type="dxa" w:w="2160"/>
+          </w:tcPr>
+          <w:p>
+            <w:r>
+              <w:t>alphafold_plddt, solvent_accessibility, secondary_structure_context, dist_to_active_site, has_uniprot_annotation</w:t>
+            </w:r>
+          </w:p>
+        </w:tc>
+        <w:tc>
+          <w:tcPr>
+            <w:tcW w:type="dxa" w:w="2160"/>
+          </w:tcPr>
+          <w:p>
+            <w:r>
+              <w:t>free (AlphaFold DB)</w:t>
+            </w:r>
+          </w:p>
+        </w:tc>
+        <w:tc>
+          <w:tcPr>
+            <w:tcW w:type="dxa" w:w="2160"/>
+          </w:tcPr>
+          <w:p>
+            <w:r>
+              <w:t>stub-mode step; activation = data + config</w:t>
+            </w:r>
+          </w:p>
+        </w:tc>
+      </w:tr>
+      <w:tr>
+        <w:tc>
+          <w:tcPr>
+            <w:tcW w:type="dxa" w:w="2160"/>
+          </w:tcPr>
+          <w:p>
+            <w:r>
+              <w:t>OMIM</w:t>
+            </w:r>
+          </w:p>
+        </w:tc>
+        <w:tc>
+          <w:tcPr>
+            <w:tcW w:type="dxa" w:w="2160"/>
+          </w:tcPr>
+          <w:p>
+            <w:r>
+              <w:t>omim_* (2)</w:t>
+            </w:r>
+          </w:p>
+        </w:tc>
+        <w:tc>
+          <w:tcPr>
+            <w:tcW w:type="dxa" w:w="2160"/>
+          </w:tcPr>
+          <w:p>
+            <w:r>
+              <w:t>free academic w/ reg.</w:t>
+            </w:r>
+          </w:p>
+        </w:tc>
+        <w:tc>
+          <w:tcPr>
+            <w:tcW w:type="dxa" w:w="2160"/>
+          </w:tcPr>
+          <w:p>
+            <w:r>
+              <w:t>disease/inheritance</w:t>
+            </w:r>
+          </w:p>
+        </w:tc>
+      </w:tr>
+      <w:tr>
+        <w:tc>
+          <w:tcPr>
+            <w:tcW w:type="dxa" w:w="2160"/>
+          </w:tcPr>
+          <w:p>
+            <w:r>
+              <w:t>ClinGen</w:t>
+            </w:r>
+          </w:p>
+        </w:tc>
+        <w:tc>
+          <w:tcPr>
+            <w:tcW w:type="dxa" w:w="2160"/>
+          </w:tcPr>
+          <w:p>
+            <w:r>
+              <w:t>clingen_validity_score</w:t>
+            </w:r>
+          </w:p>
+        </w:tc>
+        <w:tc>
+          <w:tcPr>
+            <w:tcW w:type="dxa" w:w="2160"/>
+          </w:tcPr>
+          <w:p>
+            <w:r>
+              <w:t>free API</w:t>
+            </w:r>
+          </w:p>
+        </w:tc>
+        <w:tc>
+          <w:tcPr>
+            <w:tcW w:type="dxa" w:w="2160"/>
+          </w:tcPr>
+          <w:p>
+            <w:r>
+              <w:t>dtype drift: int vs float across prep/inference - fix before regen</w:t>
+            </w:r>
+          </w:p>
+        </w:tc>
+      </w:tr>
+      <w:tr>
+        <w:tc>
+          <w:tcPr>
+            <w:tcW w:type="dxa" w:w="2160"/>
+          </w:tcPr>
+          <w:p>
+            <w:r>
+              <w:t>FinnGen</w:t>
+            </w:r>
+          </w:p>
+        </w:tc>
+        <w:tc>
+          <w:tcPr>
+            <w:tcW w:type="dxa" w:w="2160"/>
+          </w:tcPr>
+          <w:p>
+            <w:r>
+              <w:t>finngen_* (3)</w:t>
+            </w:r>
+          </w:p>
+        </w:tc>
+        <w:tc>
+          <w:tcPr>
+            <w:tcW w:type="dxa" w:w="2160"/>
+          </w:tcPr>
+          <w:p>
+            <w:r>
+              <w:t>free summary</w:t>
+            </w:r>
+          </w:p>
+        </w:tc>
+        <w:tc>
+          <w:tcPr>
+            <w:tcW w:type="dxa" w:w="2160"/>
+          </w:tcPr>
+          <w:p>
+            <w:r>
+              <w:t>population enrichment</w:t>
+            </w:r>
+          </w:p>
+        </w:tc>
+      </w:tr>
+      <w:tr>
+        <w:tc>
+          <w:tcPr>
+            <w:tcW w:type="dxa" w:w="2160"/>
+          </w:tcPr>
+          <w:p>
+            <w:r>
+              <w:t>MaxEntScan</w:t>
+            </w:r>
+          </w:p>
+        </w:tc>
+        <w:tc>
+          <w:tcPr>
+            <w:tcW w:type="dxa" w:w="2160"/>
+          </w:tcPr>
+          <w:p>
+            <w:r>
+              <w:t>maxentscan_score</w:t>
+            </w:r>
+          </w:p>
+        </w:tc>
+        <w:tc>
+          <w:tcPr>
+            <w:tcW w:type="dxa" w:w="2160"/>
+          </w:tcPr>
+          <w:p>
+            <w:r>
+              <w:t>free tool</w:t>
+            </w:r>
+          </w:p>
+        </w:tc>
+        <w:tc>
+          <w:tcPr>
+            <w:tcW w:type="dxa" w:w="2160"/>
+          </w:tcPr>
+          <w:p>
+            <w:r>
+              <w:t>splice strength</w:t>
+            </w:r>
+          </w:p>
+        </w:tc>
+      </w:tr>
+      <w:tr>
+        <w:tc>
+          <w:tcPr>
+            <w:tcW w:type="dxa" w:w="2160"/>
+          </w:tcPr>
+          <w:p>
+            <w:r>
+              <w:t>VEP</w:t>
+            </w:r>
+          </w:p>
+        </w:tc>
+        <w:tc>
+          <w:tcPr>
+            <w:tcW w:type="dxa" w:w="2160"/>
+          </w:tcPr>
+          <w:p>
+            <w:r>
+              <w:t>codon_position, exon_number</w:t>
+            </w:r>
+          </w:p>
+        </w:tc>
+        <w:tc>
+          <w:tcPr>
+            <w:tcW w:type="dxa" w:w="2160"/>
+          </w:tcPr>
+          <w:p>
+            <w:r>
+              <w:t>free tool</w:t>
+            </w:r>
+          </w:p>
+        </w:tc>
+        <w:tc>
+          <w:tcPr>
+            <w:tcW w:type="dxa" w:w="2160"/>
+          </w:tcPr>
+          <w:p>
+            <w:r>
+              <w:t>coding context</w:t>
+            </w:r>
+          </w:p>
+        </w:tc>
+      </w:tr>
+      <w:tr>
+        <w:tc>
+          <w:tcPr>
+            <w:tcW w:type="dxa" w:w="2160"/>
+          </w:tcPr>
+          <w:p>
+            <w:r>
+              <w:t>EVE</w:t>
+            </w:r>
+          </w:p>
+        </w:tc>
+        <w:tc>
+          <w:tcPr>
+            <w:tcW w:type="dxa" w:w="2160"/>
+          </w:tcPr>
+          <w:p>
+            <w:r>
+              <w:t>eve_score</w:t>
+            </w:r>
+          </w:p>
+        </w:tc>
+        <w:tc>
+          <w:tcPr>
+            <w:tcW w:type="dxa" w:w="2160"/>
+          </w:tcPr>
+          <w:p>
+            <w:r>
+              <w:t>free score files</w:t>
+            </w:r>
+          </w:p>
+        </w:tc>
+        <w:tc>
+          <w:tcPr>
+            <w:tcW w:type="dxa" w:w="2160"/>
+          </w:tcPr>
+          <w:p>
+            <w:r>
+              <w:t>needs score files + HGVSp coords</w:t>
+            </w:r>
+          </w:p>
+        </w:tc>
+      </w:tr>
+      <w:tr>
+        <w:tc>
+          <w:tcPr>
+            <w:tcW w:type="dxa" w:w="2160"/>
+          </w:tcPr>
+          <w:p>
+            <w:r>
+              <w:t>HGMD</w:t>
+            </w:r>
+          </w:p>
+        </w:tc>
+        <w:tc>
+          <w:tcPr>
+            <w:tcW w:type="dxa" w:w="2160"/>
+          </w:tcPr>
+          <w:p>
+            <w:r>
+              <w:t>hgmd_* (2)</w:t>
+            </w:r>
+          </w:p>
+        </w:tc>
+        <w:tc>
+          <w:tcPr>
+            <w:tcW w:type="dxa" w:w="2160"/>
+          </w:tcPr>
+          <w:p>
+            <w:r>
+              <w:t>PAID, blocked</w:t>
+            </w:r>
+          </w:p>
+        </w:tc>
+        <w:tc>
+          <w:tcPr>
+            <w:tcW w:type="dxa" w:w="2160"/>
+          </w:tcPr>
+          <w:p>
+            <w:r>
+              <w:t>label-leakage rules</w:t>
+            </w:r>
+          </w:p>
+        </w:tc>
+      </w:tr>
+      <w:tr>
+        <w:tc>
+          <w:tcPr>
+            <w:tcW w:type="dxa" w:w="2160"/>
+          </w:tcPr>
+          <w:p>
+            <w:r>
+              <w:t>LOVD</w:t>
+            </w:r>
+          </w:p>
+        </w:tc>
+        <w:tc>
+          <w:tcPr>
+            <w:tcW w:type="dxa" w:w="2160"/>
+          </w:tcPr>
+          <w:p>
+            <w:r>
+              <w:t>lovd_variant_class</w:t>
+            </w:r>
+          </w:p>
+        </w:tc>
+        <w:tc>
+          <w:tcPr>
+            <w:tcW w:type="dxa" w:w="2160"/>
+          </w:tcPr>
+          <w:p>
+            <w:r>
+              <w:t>free</w:t>
+            </w:r>
+          </w:p>
+        </w:tc>
+        <w:tc>
+          <w:tcPr>
+            <w:tcW w:type="dxa" w:w="2160"/>
+          </w:tcPr>
+          <w:p>
+            <w:r>
+              <w:t>tiny coverage</w:t>
+            </w:r>
+          </w:p>
+        </w:tc>
+      </w:tr>
+    </w:tbl>
     <w:p>
       <w:r>
         <w:t>*Note: gene_constraint_oe / gene_is_constrained moved OUT of 4B (constraint vestige resolved; oe now healthy and #2 feature).*</w:t>
@@ -321,7 +1202,7 @@
         <w:pStyle w:val="ListBullet"/>
       </w:pPr>
       <w:r>
-        <w:t>n_pathogenic_in_gene computation-scope audit: confirm train-only-per-fold vs corpus-wide; recompute train-only if corpus-wide, to close the leakage question the UGH 0.9988 result left open.</w:t>
+        <w:t>n_pathogenic_in_gene computation-scope audit (RESOLVED 2026-06-13): was corpus-wide; recomputed train-only at Level 1 (data prep, 689787f) and Level 2 (stacking OOF, 6b38985). Lone-feature probe 0.7181 -&gt; ~0.50; leaky vs leak-free inner-OOF 0.7755 vs 0.6633. Run-17 Gate-A leakage decision CLOSED.</w:t>
       </w:r>
     </w:p>
     <w:p>
@@ -329,7 +1210,7 @@
         <w:pStyle w:val="ListBullet"/>
       </w:pPr>
       <w:r>
-        <w:t>Fix clingen_validity_score dtype drift (int in real_data_prep vs float in variant_ensemble) before the next regen.</w:t>
+        <w:t>clingen_validity_score dtype drift (RESOLVED 2026-06-13): both builders cast to float (variant_ensemble.engineer_features and real_data_prep._engineer_features, the latter with a "match inference builder" comment); verified aligned -- no regen blocker remains.</w:t>
       </w:r>
     </w:p>
     <w:p>
@@ -345,6 +1226,38 @@
         <w:pStyle w:val="ListBullet"/>
       </w:pPr>
       <w:r>
+        <w:t>Heterogeneous-KG modeling track (2026-06-13): hetero-GNN ENGINE done (models/hetero_gnn.py, HeteroConv multi-relation gene graph, 54158f7) + KG edge-connectors done (data/kg_edges.py co-membership primitive + Reactome/KEGG/GO/OMIM/ClinGen adapters, 8c19f9b). SCORER + SCHEMA DONE 2026-06-13: HeteroGNNScorer (547e2dc, mirrors GNNScorer; torch-free assembly + PyG train/score) and hetero_gnn_score landed as the 82nd feature (Option A -- SEPARATE from gnn_score to preserve the homogeneous-vs-heterogeneous comparison; EXPECTED_TABULAR_FEATURE_COUNT 81-&gt;82, both builders lockstep, reactome stays last; contract green, suite 1000). EVAL-OVERWRITE DONE 2026-06-14 (a54ef38): run_phase2_eval --hetero-gnn + --kg-edges source:path builds HeteroGNNScorer from STRING interacts_with + KG relations and overwrites hetero_gnn_score per split (opt-in; until run with the flag it stays the 0.5 default, mirroring gnn_score). ONLY REMAINING (Run-17): schema_baseline regen 81-&gt;82 from the real matrix.</w:t>
+      </w:r>
+    </w:p>
+    <w:p>
+      <w:pPr>
+        <w:pStyle w:val="ListBullet"/>
+      </w:pPr>
+      <w:r>
+        <w:t>af_1kg_* ACTIVE (2026-06-15): kg_grch38_af.parquet built chr1-22 + X (437,668 variants, 6.7 MB) via build_1kg_parquet.py per-chr shards + merge; activate via --kg. chrY/MT not in the 1000G high-coverage panel (404-confirmed -&gt; af_1kg=0 for 3,191 Y + 3,124 MT cohort variants; gnomAD Y/MT allele_freq RESOLVED 2026-06-16). WIRED 2026-06-13 (a0ce407).</w:t>
+      </w:r>
+    </w:p>
+    <w:p>
+      <w:pPr>
+        <w:pStyle w:val="ListBullet"/>
+      </w:pPr>
+      <w:r>
+        <w:t>gnomAD Y/MT allele_freq ACTIVE (2026-06-16): PAR canonicalisation fix -- gnomAD reports PAR variants on X, ClinVar on Y; y_key() remaps PAR1 X-&gt;Y identical + PAR2 X-98,813,480 + MSY pass-through. build_gnomad_ymt_af.py merges Y/MT frequencies into gnomad_v4_exomes.parquet: Y 1047/3155 (33% = honest gnomAD ceiling; remainder = gnomAD-uncalled Y positions + 264 na:na structural), MT 2731/3124 (87%). Commit 112967d.</w:t>
+      </w:r>
+    </w:p>
+    <w:p>
+      <w:pPr>
+        <w:pStyle w:val="ListBullet"/>
+      </w:pPr>
+      <w:r>
+        <w:t>LiteratureScout broadened (2026-06-13, a42e723 + a9c0326): provenance (authors/publication_date/journal across PubMed/bioRxiv/ClinGen/Zenodo) + new Zenodo source (_fetch_zenodo) + PubMed queries 11-&gt;19 / keywords 32-&gt;46 into architecture/methodology gaps + journal allow-list relevance boost. +8 tests.</w:t>
+      </w:r>
+    </w:p>
+    <w:p>
+      <w:pPr>
+        <w:pStyle w:val="ListBullet"/>
+      </w:pPr>
+      <w:r>
         <w:t>One comprehensive GPU regen after the accessible public connectors are wired; measure-first probe; ALL-MODELS smoke before any billable retrain.</w:t>
       </w:r>
     </w:p>
@@ -497,6 +1410,118 @@
         <w:pStyle w:val="ListBullet"/>
       </w:pPr>
       <w:r>
+        <w:t>2026-06-13 (session 2, pandas-3.0 future-proofing &amp; agent hardening): four commits; full suite 924 -&gt; 956 passed / 6 skipped, zero new warnings.</w:t>
+      </w:r>
+    </w:p>
+    <w:p>
+      <w:pPr>
+        <w:pStyle w:val="ListBullet"/>
+      </w:pPr>
+      <w:r>
+        <w:t>Null-safe, pandas-version-stable variant/merge key construction (commit 36348fd): module-level _variant_key() maps missing alleles to a "" sentinel BEFORE astype(str), and the gnomAD merge keys now match the SpliceAI fillna("") pattern. Byte-identical keys validated under pandas 2.3.3 AND 3.0.2. DEFENSE-IN-DEPTH only: the clean-cohort guard (real_data_prep.py L378-390, INCIDENT_2026-05-31) already raises on null ref/alt, so the 3.0 key-collapse was already mitigated in production; this removes reliance on that guard. +4 tests.</w:t>
+      </w:r>
+    </w:p>
+    <w:p>
+      <w:pPr>
+        <w:pStyle w:val="ListBullet"/>
+      </w:pPr>
+      <w:r>
+        <w:t>VersionMonitorAgent extended to watch Python + ALL installed packages + the PyG companion ABI (commit 8ff2310): _check_python (running vs latest patch/series/EOL via endoflife.date), _check_dependencies (pip list --outdated; _is_major_bump flags major jumps e.g. pandas 2-&gt;3), _check_pyg_abi (import-tests torch_scatter/torch_sparse, catching the OSError / 0xc0000139 ABI break it previously missed). 5 -&gt; 8 watch targets; all new state under literature_scout.*; no roster/coordinator change. +13 tests. First live run: pandas 2.3.3 -&gt; 3.0.3 flagged [deps:major] (migration now self-monitoring); torch 2.11 -&gt; 2.12 correctly NOT major; pyg_abi_alert empty (companions absent post-fix); 99 outdated / 19 major bumps.</w:t>
+      </w:r>
+    </w:p>
+    <w:p>
+      <w:pPr>
+        <w:pStyle w:val="ListBullet"/>
+      </w:pPr>
+      <w:r>
+        <w:t>dtype-family-aware schema gate (commit 37d60be): _dtype_family() collapses the string family (object/string/str/pyarrow variants) to one token and is IDENTITY for every numeric dtype; wired into hash_schema + detect + the pandera schema. object&lt;-&gt;pandas-3.0 string no longer reads as drift, while float64&lt;-&gt;int64 is still RED. The committed baseline (81x float64) hashes IDENTICALLY -&gt; NO rebuild. Validated end-to-end under real pandas 2.3.3 + pandera 0.31.1. +5 tests. data/agent_state.json gitignored (runtime state).</w:t>
+      </w:r>
+    </w:p>
+    <w:p>
+      <w:pPr>
+        <w:pStyle w:val="ListBullet"/>
+      </w:pPr>
+      <w:r>
+        <w:t>FINDING -- neither named "pandas-3.0 blocker" is actually live: (a) the variant-key collapse is clean-cohort-guard-mitigated; (b) the schema baseline is 81/81 float64, so the object-&gt;string flip cannot occur on the current matrix. Both fixes are defense-in-depth, NOT live-bug fixes; this corrects the earlier "unmitigated blocker" framing. pandas stays PINNED at 2.3.3; the migration is future scope, now agent-monitored.</w:t>
+      </w:r>
+    </w:p>
+    <w:p>
+      <w:pPr>
+        <w:pStyle w:val="ListBullet"/>
+      </w:pPr>
+      <w:r>
+        <w:t>RESOLVES the two "Carried" items from the 2026-06-13 (variance mask) entry below: (a) test_ablate_gnn now PASSES locally (3 passed) after uninstalling the mismatched torch_scatter 2.1.2+pt25cu124 / torch_sparse wheels -&gt; PyG falls back to native scatter (ENV-ONLY, no commit; the Vast.ai GPU box keeps its CUDA companions); now guarded by the VersionMonitorAgent pyg_abi watch so it cannot silently recur. (b) the .fillna downcasting FutureWarning was fixed in commit 4d56423 (@_suppress_fillna_downcast on both feature builders; suite warnings 220 -&gt; 41).</w:t>
+      </w:r>
+    </w:p>
+    <w:p>
+      <w:pPr>
+        <w:pStyle w:val="ListBullet"/>
+      </w:pPr>
+      <w:r>
+        <w:t>Run 17 pre-flight gate authored (commit 94bf6ae; docs/runs/RUN17_SCOPE.md): activates gnn_score (--string-db auto) + af_1kg_* (--kg &lt;1000G Phase-3 AF parquet&gt;) via scripts/run_phase2_eval.py (NOT train.py). Corrected flag discrepancies: the real flag is --kg (a parquet), not --kg-path (a VCF). VALUE activation only -&gt; 81-col schema + hash unchanged; no baseline rebuild.</w:t>
+      </w:r>
+    </w:p>
+    <w:p>
+      <w:pPr>
+        <w:pStyle w:val="ListBullet"/>
+      </w:pPr>
+      <w:r>
+        <w:t>FINDING -- schema baseline provenance + DEFAULT_MATRIX footgun: the committed schema_baseline.json was captured from models/smoke_run16b/splits/X_train.parquet (run16b-smoke, 81 cols) and is GREEN against that matrix; it is RED against outputs/run15_rerun_report/full/splits/X_train.parquet, which is STALE (78 cols; predates esm2_llr / maxentscan_delta / reactome_pathway_count). build_schema_baseline.py DEFAULT_MATRIX still points at the stale run15 path, so a no-arg rebuild would regress 81 -&gt; 78. Fixed in a follow-up (--matrix required + column-count regression guard).</w:t>
+      </w:r>
+    </w:p>
+    <w:p>
+      <w:pPr>
+        <w:pStyle w:val="ListBullet"/>
+      </w:pPr>
+      <w:r>
+        <w:t>RESOLVED &lt;DECISION&gt; (2026-06-13): n_pathogenic_in_gene is now train-only at Level 1 (689787f) and Level 2 (6b38985); the Run-17 Gate-A leakage decision is CLOSED. Lone-feature probe 0.7181 -&gt; ~0.50; leaky vs leak-free inner-OOF 0.7755 vs 0.6633.</w:t>
+      </w:r>
+    </w:p>
+    <w:p>
+      <w:pPr>
+        <w:pStyle w:val="ListBullet"/>
+      </w:pPr>
+      <w:r>
+        <w:t>2026-06-13: neural variance mask landed (commit 5de7806); 81-&gt;51 schema trim attempted then REVERTED.</w:t>
+      </w:r>
+    </w:p>
+    <w:p>
+      <w:pPr>
+        <w:pStyle w:val="ListBullet"/>
+      </w:pPr>
+      <w:r>
+        <w:t>Run 16 census: 37/81 matrix columns constant on the gene-disjoint test split (29 unpopulated/stub/blocked, codon_position == protein_pos, plus deferred gnn_score / af_1kg_* / sparse-real is_mitochondrial / lovd_variant_class).</w:t>
+      </w:r>
+    </w:p>
+    <w:p>
+      <w:pPr>
+        <w:pStyle w:val="ListBullet"/>
+      </w:pPr>
+      <w:r>
+        <w:t>Attempted to relocate 30 columns TABULAR_FEATURES -&gt; PHASE_2_FEATURES (81-&gt;51), unifying both feature builders on a fail-loud select. Unit-green (contract + test_api at 51/80) but the full suite raised 40 failures across 10 files. Those are the deliberate Phase-4 contract (fully-promoted schema + connector-&gt;matrix wiring + safe defaults; the *_in_tabular_features / *_flows_into_feature_matrix / phase_2_is_empty tests are silent-failure guards). REVERTED; schema stays 81-col.</w:t>
+      </w:r>
+    </w:p>
+    <w:p>
+      <w:pPr>
+        <w:pStyle w:val="ListBullet"/>
+      </w:pPr>
+      <w:r>
+        <w:t>Learned: a constant column is a data-availability state, not dead code. The real risk (constant neural inputs) is handled in the MODEL layer: TabularNNClassifier learns a fit-time variance mask (var&gt;0) applied at predict, inherited by mc_dropout/deep_ensemble; cnn_1d/trees/LR/CatBoost/KAN untouched. No schema/contract/inference/schema-baseline change; backward-compatible with pre-mask pickles; no OOF leakage (per-fold recompute). Suite 924 passed / 6 skipped, zero new warnings. See docs/design/neural_variance_mask.md and docs/sessions/SESSION_2026-06-13_feature-trim-and-variance-mask.md.</w:t>
+      </w:r>
+    </w:p>
+    <w:p>
+      <w:pPr>
+        <w:pStyle w:val="ListBullet"/>
+      </w:pPr>
+      <w:r>
+        <w:t>Carried: test_ablate_gnn skips locally on torch_scatter/torch_sparse 0xc0000139 (GNN coverage absent on the Windows box) -- confirm runnable before Run 17 activates gnn_score; pandas .fillna downcasting FutureWarning in variant_ensemble.py wants an explicit cast.</w:t>
+      </w:r>
+    </w:p>
+    <w:p>
+      <w:pPr>
+        <w:pStyle w:val="ListBullet"/>
+      </w:pPr>
+      <w:r>
         <w:t>2026-06-10: ESM-2 coverage root-caused + gated; UniProt gap measured; protein-LM upgrade decided; roadmap consolidated.</w:t>
       </w:r>
     </w:p>
@@ -701,116 +1726,485 @@
         <w:t>Current State (March 2026)</w:t>
       </w:r>
     </w:p>
-    <w:p>
-      <w:r>
-        <w:t>| Item                                                                   | Status                    |</w:t>
-      </w:r>
-    </w:p>
-    <w:p>
-      <w:r>
-        <w:t>| ---------------------------------------------------------------------- | ------------------------- |</w:t>
-      </w:r>
-    </w:p>
-    <w:p>
-      <w:r>
-        <w:t>| 64-feature tabular ensemble (LightGBM, XGBoost, RF, GBM, LR)          | Done                  |</w:t>
-      </w:r>
-    </w:p>
-    <w:p>
-      <w:r>
-        <w:t>| Holdout AUROC (gene-stratified, 154K variants)                         | 0.9847                |</w:t>
-      </w:r>
-    </w:p>
-    <w:p>
-      <w:r>
-        <w:t>| RNA splice pipeline (MaxEntScan; 4 features)                           | Done                  |</w:t>
-      </w:r>
-    </w:p>
-    <w:p>
-      <w:r>
-        <w:t>| Protein structure pipeline (AlphaFold/UniProt; 4 features)             | Done                  |</w:t>
-      </w:r>
-    </w:p>
-    <w:p>
-      <w:r>
-        <w:t>| FastAPI REST service (/predict, /batch, /health, /gene, /rsid, /info)  | Done                  |</w:t>
-      </w:r>
-    </w:p>
-    <w:p>
-      <w:r>
-        <w:t>| X-API-Key auth + slowapi rate limiting                                 | Done                  |</w:t>
-      </w:r>
-    </w:p>
-    <w:p>
-      <w:r>
-        <w:t>| Structured JSON logging + Prometheus /metrics                          | Done                  |</w:t>
-      </w:r>
-    </w:p>
-    <w:p>
-      <w:r>
-        <w:t>| Multi-stage Dockerfile + docker-compose (api / trainer / monitoring)   | Done                  |</w:t>
-      </w:r>
-    </w:p>
-    <w:p>
-      <w:r>
-        <w:t>| GitHub Actions CI (lockfile check, pytest, docker build)               | Done                  |</w:t>
-      </w:r>
-    </w:p>
-    <w:p>
-      <w:r>
-        <w:t>| Docker image pushed to GHCR                                            | Done -- v2.0.0        |</w:t>
-      </w:r>
-    </w:p>
-    <w:p>
-      <w:r>
-        <w:t>| Conformal prediction intervals (scripts/conformal_prediction.py)       | Done                  |</w:t>
-      </w:r>
-    </w:p>
-    <w:p>
-      <w:r>
-        <w:t>| External validation script (scripts/validate_external.py)             | Done                  |</w:t>
-      </w:r>
-    </w:p>
-    <w:p>
-      <w:r>
-        <w:t>| Calibration analysis (scripts/calibration_analysis.py)                | Done                  |</w:t>
-      </w:r>
-    </w:p>
-    <w:p>
-      <w:r>
-        <w:t>| METHODS.md (publication-ready methods section)                         | Done                  |</w:t>
-      </w:r>
-    </w:p>
-    <w:p>
-      <w:r>
-        <w:t>| dbSNP index parquet (2.87M ClinVar-matched rs-IDs)                     | Done                  |</w:t>
-      </w:r>
-    </w:p>
-    <w:p>
-      <w:r>
-        <w:t>| ESM-2 connector (src/genomic_variant_classifier/data/esm2.py)                                     | Done -- ready for retrain |</w:t>
-      </w:r>
-    </w:p>
-    <w:p>
-      <w:r>
-        <w:t>| MC Dropout / Deep Ensemble uncertainty (src/genomic_variant_classifier/models/mc_dropout.py)      | Done                  |</w:t>
-      </w:r>
-    </w:p>
-    <w:p>
-      <w:r>
-        <w:t>| KAN classifier (src/genomic_variant_classifier/models/kan.py)                                     | Done                  |</w:t>
-      </w:r>
-    </w:p>
-    <w:p>
-      <w:r>
-        <w:t>| Algorithm benchmark framework (src/genomic_variant_classifier/evaluation/benchmark.py)            | Done                  |</w:t>
-      </w:r>
-    </w:p>
-    <w:p>
-      <w:r>
-        <w:t>| Model retrain incorporating Phase 4 features                           | Pending data + compute    |</w:t>
-      </w:r>
-    </w:p>
+    <w:tbl>
+      <w:tblPr>
+        <w:tblStyle w:val="TableGrid"/>
+        <w:tblW w:type="auto" w:w="0"/>
+        <w:tblLook w:firstColumn="1" w:firstRow="1" w:lastColumn="0" w:lastRow="0" w:noHBand="0" w:noVBand="1" w:val="04A0"/>
+      </w:tblPr>
+      <w:tblGrid>
+        <w:gridCol w:w="4320"/>
+        <w:gridCol w:w="4320"/>
+      </w:tblGrid>
+      <w:tr>
+        <w:tc>
+          <w:tcPr>
+            <w:tcW w:type="dxa" w:w="4320"/>
+          </w:tcPr>
+          <w:p>
+            <w:r>
+              <w:rPr>
+                <w:b/>
+              </w:rPr>
+              <w:t>Item</w:t>
+            </w:r>
+          </w:p>
+        </w:tc>
+        <w:tc>
+          <w:tcPr>
+            <w:tcW w:type="dxa" w:w="4320"/>
+          </w:tcPr>
+          <w:p>
+            <w:r>
+              <w:rPr>
+                <w:b/>
+              </w:rPr>
+              <w:t>Status</w:t>
+            </w:r>
+          </w:p>
+        </w:tc>
+      </w:tr>
+      <w:tr>
+        <w:tc>
+          <w:tcPr>
+            <w:tcW w:type="dxa" w:w="4320"/>
+          </w:tcPr>
+          <w:p>
+            <w:r>
+              <w:t>64-feature tabular ensemble (LightGBM, XGBoost, RF, GBM, LR)</w:t>
+            </w:r>
+          </w:p>
+        </w:tc>
+        <w:tc>
+          <w:tcPr>
+            <w:tcW w:type="dxa" w:w="4320"/>
+          </w:tcPr>
+          <w:p>
+            <w:r>
+              <w:t>Done</w:t>
+            </w:r>
+          </w:p>
+        </w:tc>
+      </w:tr>
+      <w:tr>
+        <w:tc>
+          <w:tcPr>
+            <w:tcW w:type="dxa" w:w="4320"/>
+          </w:tcPr>
+          <w:p>
+            <w:r>
+              <w:t>Holdout AUROC (gene-stratified, 154K variants)</w:t>
+            </w:r>
+          </w:p>
+        </w:tc>
+        <w:tc>
+          <w:tcPr>
+            <w:tcW w:type="dxa" w:w="4320"/>
+          </w:tcPr>
+          <w:p>
+            <w:r>
+              <w:t>0.9847</w:t>
+            </w:r>
+          </w:p>
+        </w:tc>
+      </w:tr>
+      <w:tr>
+        <w:tc>
+          <w:tcPr>
+            <w:tcW w:type="dxa" w:w="4320"/>
+          </w:tcPr>
+          <w:p>
+            <w:r>
+              <w:t>RNA splice pipeline (MaxEntScan; 4 features)</w:t>
+            </w:r>
+          </w:p>
+        </w:tc>
+        <w:tc>
+          <w:tcPr>
+            <w:tcW w:type="dxa" w:w="4320"/>
+          </w:tcPr>
+          <w:p>
+            <w:r>
+              <w:t>Done</w:t>
+            </w:r>
+          </w:p>
+        </w:tc>
+      </w:tr>
+      <w:tr>
+        <w:tc>
+          <w:tcPr>
+            <w:tcW w:type="dxa" w:w="4320"/>
+          </w:tcPr>
+          <w:p>
+            <w:r>
+              <w:t>Protein structure pipeline (AlphaFold/UniProt; 4 features)</w:t>
+            </w:r>
+          </w:p>
+        </w:tc>
+        <w:tc>
+          <w:tcPr>
+            <w:tcW w:type="dxa" w:w="4320"/>
+          </w:tcPr>
+          <w:p>
+            <w:r>
+              <w:t>Done</w:t>
+            </w:r>
+          </w:p>
+        </w:tc>
+      </w:tr>
+      <w:tr>
+        <w:tc>
+          <w:tcPr>
+            <w:tcW w:type="dxa" w:w="4320"/>
+          </w:tcPr>
+          <w:p>
+            <w:r>
+              <w:t>FastAPI REST service (/predict, /batch, /health, /gene, /rsid, /info)</w:t>
+            </w:r>
+          </w:p>
+        </w:tc>
+        <w:tc>
+          <w:tcPr>
+            <w:tcW w:type="dxa" w:w="4320"/>
+          </w:tcPr>
+          <w:p>
+            <w:r>
+              <w:t>Done</w:t>
+            </w:r>
+          </w:p>
+        </w:tc>
+      </w:tr>
+      <w:tr>
+        <w:tc>
+          <w:tcPr>
+            <w:tcW w:type="dxa" w:w="4320"/>
+          </w:tcPr>
+          <w:p>
+            <w:r>
+              <w:t>X-API-Key auth + slowapi rate limiting</w:t>
+            </w:r>
+          </w:p>
+        </w:tc>
+        <w:tc>
+          <w:tcPr>
+            <w:tcW w:type="dxa" w:w="4320"/>
+          </w:tcPr>
+          <w:p>
+            <w:r>
+              <w:t>Done</w:t>
+            </w:r>
+          </w:p>
+        </w:tc>
+      </w:tr>
+      <w:tr>
+        <w:tc>
+          <w:tcPr>
+            <w:tcW w:type="dxa" w:w="4320"/>
+          </w:tcPr>
+          <w:p>
+            <w:r>
+              <w:t>Structured JSON logging + Prometheus /metrics</w:t>
+            </w:r>
+          </w:p>
+        </w:tc>
+        <w:tc>
+          <w:tcPr>
+            <w:tcW w:type="dxa" w:w="4320"/>
+          </w:tcPr>
+          <w:p>
+            <w:r>
+              <w:t>Done</w:t>
+            </w:r>
+          </w:p>
+        </w:tc>
+      </w:tr>
+      <w:tr>
+        <w:tc>
+          <w:tcPr>
+            <w:tcW w:type="dxa" w:w="4320"/>
+          </w:tcPr>
+          <w:p>
+            <w:r>
+              <w:t>Multi-stage Dockerfile + docker-compose (api / trainer / monitoring)</w:t>
+            </w:r>
+          </w:p>
+        </w:tc>
+        <w:tc>
+          <w:tcPr>
+            <w:tcW w:type="dxa" w:w="4320"/>
+          </w:tcPr>
+          <w:p>
+            <w:r>
+              <w:t>Done</w:t>
+            </w:r>
+          </w:p>
+        </w:tc>
+      </w:tr>
+      <w:tr>
+        <w:tc>
+          <w:tcPr>
+            <w:tcW w:type="dxa" w:w="4320"/>
+          </w:tcPr>
+          <w:p>
+            <w:r>
+              <w:t>GitHub Actions CI (lockfile check, pytest, docker build)</w:t>
+            </w:r>
+          </w:p>
+        </w:tc>
+        <w:tc>
+          <w:tcPr>
+            <w:tcW w:type="dxa" w:w="4320"/>
+          </w:tcPr>
+          <w:p>
+            <w:r>
+              <w:t>Done</w:t>
+            </w:r>
+          </w:p>
+        </w:tc>
+      </w:tr>
+      <w:tr>
+        <w:tc>
+          <w:tcPr>
+            <w:tcW w:type="dxa" w:w="4320"/>
+          </w:tcPr>
+          <w:p>
+            <w:r>
+              <w:t>Docker image pushed to GHCR</w:t>
+            </w:r>
+          </w:p>
+        </w:tc>
+        <w:tc>
+          <w:tcPr>
+            <w:tcW w:type="dxa" w:w="4320"/>
+          </w:tcPr>
+          <w:p>
+            <w:r>
+              <w:t>Done -- v2.0.0</w:t>
+            </w:r>
+          </w:p>
+        </w:tc>
+      </w:tr>
+      <w:tr>
+        <w:tc>
+          <w:tcPr>
+            <w:tcW w:type="dxa" w:w="4320"/>
+          </w:tcPr>
+          <w:p>
+            <w:r>
+              <w:t>Conformal prediction intervals (scripts/conformal_prediction.py)</w:t>
+            </w:r>
+          </w:p>
+        </w:tc>
+        <w:tc>
+          <w:tcPr>
+            <w:tcW w:type="dxa" w:w="4320"/>
+          </w:tcPr>
+          <w:p>
+            <w:r>
+              <w:t>Done</w:t>
+            </w:r>
+          </w:p>
+        </w:tc>
+      </w:tr>
+      <w:tr>
+        <w:tc>
+          <w:tcPr>
+            <w:tcW w:type="dxa" w:w="4320"/>
+          </w:tcPr>
+          <w:p>
+            <w:r>
+              <w:t>External validation script (scripts/validate_external.py)</w:t>
+            </w:r>
+          </w:p>
+        </w:tc>
+        <w:tc>
+          <w:tcPr>
+            <w:tcW w:type="dxa" w:w="4320"/>
+          </w:tcPr>
+          <w:p>
+            <w:r>
+              <w:t>Done</w:t>
+            </w:r>
+          </w:p>
+        </w:tc>
+      </w:tr>
+      <w:tr>
+        <w:tc>
+          <w:tcPr>
+            <w:tcW w:type="dxa" w:w="4320"/>
+          </w:tcPr>
+          <w:p>
+            <w:r>
+              <w:t>Calibration analysis (scripts/calibration_analysis.py)</w:t>
+            </w:r>
+          </w:p>
+        </w:tc>
+        <w:tc>
+          <w:tcPr>
+            <w:tcW w:type="dxa" w:w="4320"/>
+          </w:tcPr>
+          <w:p>
+            <w:r>
+              <w:t>Done</w:t>
+            </w:r>
+          </w:p>
+        </w:tc>
+      </w:tr>
+      <w:tr>
+        <w:tc>
+          <w:tcPr>
+            <w:tcW w:type="dxa" w:w="4320"/>
+          </w:tcPr>
+          <w:p>
+            <w:r>
+              <w:t>METHODS.md (publication-ready methods section)</w:t>
+            </w:r>
+          </w:p>
+        </w:tc>
+        <w:tc>
+          <w:tcPr>
+            <w:tcW w:type="dxa" w:w="4320"/>
+          </w:tcPr>
+          <w:p>
+            <w:r>
+              <w:t>Done</w:t>
+            </w:r>
+          </w:p>
+        </w:tc>
+      </w:tr>
+      <w:tr>
+        <w:tc>
+          <w:tcPr>
+            <w:tcW w:type="dxa" w:w="4320"/>
+          </w:tcPr>
+          <w:p>
+            <w:r>
+              <w:t>dbSNP index parquet (2.87M ClinVar-matched rs-IDs)</w:t>
+            </w:r>
+          </w:p>
+        </w:tc>
+        <w:tc>
+          <w:tcPr>
+            <w:tcW w:type="dxa" w:w="4320"/>
+          </w:tcPr>
+          <w:p>
+            <w:r>
+              <w:t>Done</w:t>
+            </w:r>
+          </w:p>
+        </w:tc>
+      </w:tr>
+      <w:tr>
+        <w:tc>
+          <w:tcPr>
+            <w:tcW w:type="dxa" w:w="4320"/>
+          </w:tcPr>
+          <w:p>
+            <w:r>
+              <w:t>ESM-2 connector (src/genomic_variant_classifier/data/esm2.py)</w:t>
+            </w:r>
+          </w:p>
+        </w:tc>
+        <w:tc>
+          <w:tcPr>
+            <w:tcW w:type="dxa" w:w="4320"/>
+          </w:tcPr>
+          <w:p>
+            <w:r>
+              <w:t>Done -- ready for retrain</w:t>
+            </w:r>
+          </w:p>
+        </w:tc>
+      </w:tr>
+      <w:tr>
+        <w:tc>
+          <w:tcPr>
+            <w:tcW w:type="dxa" w:w="4320"/>
+          </w:tcPr>
+          <w:p>
+            <w:r>
+              <w:t>MC Dropout / Deep Ensemble uncertainty (src/genomic_variant_classifier/models/mc_dropout.py)</w:t>
+            </w:r>
+          </w:p>
+        </w:tc>
+        <w:tc>
+          <w:tcPr>
+            <w:tcW w:type="dxa" w:w="4320"/>
+          </w:tcPr>
+          <w:p>
+            <w:r>
+              <w:t>Done</w:t>
+            </w:r>
+          </w:p>
+        </w:tc>
+      </w:tr>
+      <w:tr>
+        <w:tc>
+          <w:tcPr>
+            <w:tcW w:type="dxa" w:w="4320"/>
+          </w:tcPr>
+          <w:p>
+            <w:r>
+              <w:t>KAN classifier (src/genomic_variant_classifier/models/kan.py)</w:t>
+            </w:r>
+          </w:p>
+        </w:tc>
+        <w:tc>
+          <w:tcPr>
+            <w:tcW w:type="dxa" w:w="4320"/>
+          </w:tcPr>
+          <w:p>
+            <w:r>
+              <w:t>Done</w:t>
+            </w:r>
+          </w:p>
+        </w:tc>
+      </w:tr>
+      <w:tr>
+        <w:tc>
+          <w:tcPr>
+            <w:tcW w:type="dxa" w:w="4320"/>
+          </w:tcPr>
+          <w:p>
+            <w:r>
+              <w:t>Algorithm benchmark framework (src/genomic_variant_classifier/evaluation/benchmark.py)</w:t>
+            </w:r>
+          </w:p>
+        </w:tc>
+        <w:tc>
+          <w:tcPr>
+            <w:tcW w:type="dxa" w:w="4320"/>
+          </w:tcPr>
+          <w:p>
+            <w:r>
+              <w:t>Done</w:t>
+            </w:r>
+          </w:p>
+        </w:tc>
+      </w:tr>
+      <w:tr>
+        <w:tc>
+          <w:tcPr>
+            <w:tcW w:type="dxa" w:w="4320"/>
+          </w:tcPr>
+          <w:p>
+            <w:r>
+              <w:t>Model retrain incorporating Phase 4 features</w:t>
+            </w:r>
+          </w:p>
+        </w:tc>
+        <w:tc>
+          <w:tcPr>
+            <w:tcW w:type="dxa" w:w="4320"/>
+          </w:tcPr>
+          <w:p>
+            <w:r>
+              <w:t>Pending data + compute</w:t>
+            </w:r>
+          </w:p>
+        </w:tc>
+      </w:tr>
+    </w:tbl>
     <w:p>
       <w:r>
         <w:t>---</w:t>
@@ -1076,26 +2470,123 @@
         <w:t>3A -- Population Controls</w:t>
       </w:r>
     </w:p>
-    <w:p>
-      <w:r>
-        <w:t>| Source                      | Data           | Status                                          |</w:t>
-      </w:r>
-    </w:p>
-    <w:p>
-      <w:r>
-        <w:t>| --------------------------- | -------------- | ----------------------------------------------- |</w:t>
-      </w:r>
-    </w:p>
-    <w:p>
-      <w:r>
-        <w:t>| 1000 Genomes Project (IGSR) | 2,504 WGS      | data/external/1000genomes/ empty -- pending   |</w:t>
-      </w:r>
-    </w:p>
-    <w:p>
-      <w:r>
-        <w:t>| gnomAD v4.1 exomes          | ~730M variants | Done (filtered parquet)                         |</w:t>
-      </w:r>
-    </w:p>
+    <w:tbl>
+      <w:tblPr>
+        <w:tblStyle w:val="TableGrid"/>
+        <w:tblW w:type="auto" w:w="0"/>
+        <w:tblLook w:firstColumn="1" w:firstRow="1" w:lastColumn="0" w:lastRow="0" w:noHBand="0" w:noVBand="1" w:val="04A0"/>
+      </w:tblPr>
+      <w:tblGrid>
+        <w:gridCol w:w="2880"/>
+        <w:gridCol w:w="2880"/>
+        <w:gridCol w:w="2880"/>
+      </w:tblGrid>
+      <w:tr>
+        <w:tc>
+          <w:tcPr>
+            <w:tcW w:type="dxa" w:w="2880"/>
+          </w:tcPr>
+          <w:p>
+            <w:r>
+              <w:rPr>
+                <w:b/>
+              </w:rPr>
+              <w:t>Source</w:t>
+            </w:r>
+          </w:p>
+        </w:tc>
+        <w:tc>
+          <w:tcPr>
+            <w:tcW w:type="dxa" w:w="2880"/>
+          </w:tcPr>
+          <w:p>
+            <w:r>
+              <w:rPr>
+                <w:b/>
+              </w:rPr>
+              <w:t>Data</w:t>
+            </w:r>
+          </w:p>
+        </w:tc>
+        <w:tc>
+          <w:tcPr>
+            <w:tcW w:type="dxa" w:w="2880"/>
+          </w:tcPr>
+          <w:p>
+            <w:r>
+              <w:rPr>
+                <w:b/>
+              </w:rPr>
+              <w:t>Status</w:t>
+            </w:r>
+          </w:p>
+        </w:tc>
+      </w:tr>
+      <w:tr>
+        <w:tc>
+          <w:tcPr>
+            <w:tcW w:type="dxa" w:w="2880"/>
+          </w:tcPr>
+          <w:p>
+            <w:r>
+              <w:t>1000 Genomes Project (IGSR)</w:t>
+            </w:r>
+          </w:p>
+        </w:tc>
+        <w:tc>
+          <w:tcPr>
+            <w:tcW w:type="dxa" w:w="2880"/>
+          </w:tcPr>
+          <w:p>
+            <w:r>
+              <w:t>2,504 WGS</w:t>
+            </w:r>
+          </w:p>
+        </w:tc>
+        <w:tc>
+          <w:tcPr>
+            <w:tcW w:type="dxa" w:w="2880"/>
+          </w:tcPr>
+          <w:p>
+            <w:r>
+              <w:t>data/external/1000genomes/ empty -- pending</w:t>
+            </w:r>
+          </w:p>
+        </w:tc>
+      </w:tr>
+      <w:tr>
+        <w:tc>
+          <w:tcPr>
+            <w:tcW w:type="dxa" w:w="2880"/>
+          </w:tcPr>
+          <w:p>
+            <w:r>
+              <w:t>gnomAD v4.1 exomes</w:t>
+            </w:r>
+          </w:p>
+        </w:tc>
+        <w:tc>
+          <w:tcPr>
+            <w:tcW w:type="dxa" w:w="2880"/>
+          </w:tcPr>
+          <w:p>
+            <w:r>
+              <w:t>~730M variants</w:t>
+            </w:r>
+          </w:p>
+        </w:tc>
+        <w:tc>
+          <w:tcPr>
+            <w:tcW w:type="dxa" w:w="2880"/>
+          </w:tcPr>
+          <w:p>
+            <w:r>
+              <w:t>Done (filtered parquet)</w:t>
+            </w:r>
+          </w:p>
+        </w:tc>
+      </w:tr>
+    </w:tbl>
     <w:p>
       <w:r>
         <w:t>population_1kg_af added to PHASE_4_FEATURES; pending data download.</w:t>
@@ -1114,41 +2605,283 @@
         <w:t>Apply for these in parallel -- each takes 2-8 weeks for approval.</w:t>
       </w:r>
     </w:p>
-    <w:p>
-      <w:r>
-        <w:t>| Source                          | Data                                    | Application                      | Priority    |</w:t>
-      </w:r>
-    </w:p>
-    <w:p>
-      <w:r>
-        <w:t>| ------------------------------- | --------------------------------------- | -------------------------------- | ----------- |</w:t>
-      </w:r>
-    </w:p>
-    <w:p>
-      <w:r>
-        <w:t>| dbGaP / NCBI                    | TOPMed (300K WGS), CMG rare disease     | eRA Commons + institutional      | High        |</w:t>
-      </w:r>
-    </w:p>
-    <w:p>
-      <w:r>
-        <w:t>| EGA                             | European cancer + rare disease WGS      | Data Access Agreement            | High        |</w:t>
-      </w:r>
-    </w:p>
-    <w:p>
-      <w:r>
-        <w:t>| CMG (Centers for Mendelian Genomics) | High-quality rare disease trios    | Via dbGaP / AnVIL                | High        |</w:t>
-      </w:r>
-    </w:p>
-    <w:p>
-      <w:r>
-        <w:t>| UK Biobank                      | 470K WES + 200K WGS                     | Formal application               | Medium-high |</w:t>
-      </w:r>
-    </w:p>
-    <w:p>
-      <w:r>
-        <w:t>| All of Us                       | 250K+ WGS diverse ancestry              | Researcher Workbench (free)      | Medium      |</w:t>
-      </w:r>
-    </w:p>
+    <w:tbl>
+      <w:tblPr>
+        <w:tblStyle w:val="TableGrid"/>
+        <w:tblW w:type="auto" w:w="0"/>
+        <w:tblLook w:firstColumn="1" w:firstRow="1" w:lastColumn="0" w:lastRow="0" w:noHBand="0" w:noVBand="1" w:val="04A0"/>
+      </w:tblPr>
+      <w:tblGrid>
+        <w:gridCol w:w="2160"/>
+        <w:gridCol w:w="2160"/>
+        <w:gridCol w:w="2160"/>
+        <w:gridCol w:w="2160"/>
+      </w:tblGrid>
+      <w:tr>
+        <w:tc>
+          <w:tcPr>
+            <w:tcW w:type="dxa" w:w="2160"/>
+          </w:tcPr>
+          <w:p>
+            <w:r>
+              <w:rPr>
+                <w:b/>
+              </w:rPr>
+              <w:t>Source</w:t>
+            </w:r>
+          </w:p>
+        </w:tc>
+        <w:tc>
+          <w:tcPr>
+            <w:tcW w:type="dxa" w:w="2160"/>
+          </w:tcPr>
+          <w:p>
+            <w:r>
+              <w:rPr>
+                <w:b/>
+              </w:rPr>
+              <w:t>Data</w:t>
+            </w:r>
+          </w:p>
+        </w:tc>
+        <w:tc>
+          <w:tcPr>
+            <w:tcW w:type="dxa" w:w="2160"/>
+          </w:tcPr>
+          <w:p>
+            <w:r>
+              <w:rPr>
+                <w:b/>
+              </w:rPr>
+              <w:t>Application</w:t>
+            </w:r>
+          </w:p>
+        </w:tc>
+        <w:tc>
+          <w:tcPr>
+            <w:tcW w:type="dxa" w:w="2160"/>
+          </w:tcPr>
+          <w:p>
+            <w:r>
+              <w:rPr>
+                <w:b/>
+              </w:rPr>
+              <w:t>Priority</w:t>
+            </w:r>
+          </w:p>
+        </w:tc>
+      </w:tr>
+      <w:tr>
+        <w:tc>
+          <w:tcPr>
+            <w:tcW w:type="dxa" w:w="2160"/>
+          </w:tcPr>
+          <w:p>
+            <w:r>
+              <w:t>dbGaP / NCBI</w:t>
+            </w:r>
+          </w:p>
+        </w:tc>
+        <w:tc>
+          <w:tcPr>
+            <w:tcW w:type="dxa" w:w="2160"/>
+          </w:tcPr>
+          <w:p>
+            <w:r>
+              <w:t>TOPMed (300K WGS), CMG rare disease</w:t>
+            </w:r>
+          </w:p>
+        </w:tc>
+        <w:tc>
+          <w:tcPr>
+            <w:tcW w:type="dxa" w:w="2160"/>
+          </w:tcPr>
+          <w:p>
+            <w:r>
+              <w:t>eRA Commons + institutional</w:t>
+            </w:r>
+          </w:p>
+        </w:tc>
+        <w:tc>
+          <w:tcPr>
+            <w:tcW w:type="dxa" w:w="2160"/>
+          </w:tcPr>
+          <w:p>
+            <w:r>
+              <w:t>High</w:t>
+            </w:r>
+          </w:p>
+        </w:tc>
+      </w:tr>
+      <w:tr>
+        <w:tc>
+          <w:tcPr>
+            <w:tcW w:type="dxa" w:w="2160"/>
+          </w:tcPr>
+          <w:p>
+            <w:r>
+              <w:t>EGA</w:t>
+            </w:r>
+          </w:p>
+        </w:tc>
+        <w:tc>
+          <w:tcPr>
+            <w:tcW w:type="dxa" w:w="2160"/>
+          </w:tcPr>
+          <w:p>
+            <w:r>
+              <w:t>European cancer + rare disease WGS</w:t>
+            </w:r>
+          </w:p>
+        </w:tc>
+        <w:tc>
+          <w:tcPr>
+            <w:tcW w:type="dxa" w:w="2160"/>
+          </w:tcPr>
+          <w:p>
+            <w:r>
+              <w:t>Data Access Agreement</w:t>
+            </w:r>
+          </w:p>
+        </w:tc>
+        <w:tc>
+          <w:tcPr>
+            <w:tcW w:type="dxa" w:w="2160"/>
+          </w:tcPr>
+          <w:p>
+            <w:r>
+              <w:t>High</w:t>
+            </w:r>
+          </w:p>
+        </w:tc>
+      </w:tr>
+      <w:tr>
+        <w:tc>
+          <w:tcPr>
+            <w:tcW w:type="dxa" w:w="2160"/>
+          </w:tcPr>
+          <w:p>
+            <w:r>
+              <w:t>CMG (Centers for Mendelian Genomics)</w:t>
+            </w:r>
+          </w:p>
+        </w:tc>
+        <w:tc>
+          <w:tcPr>
+            <w:tcW w:type="dxa" w:w="2160"/>
+          </w:tcPr>
+          <w:p>
+            <w:r>
+              <w:t>High-quality rare disease trios</w:t>
+            </w:r>
+          </w:p>
+        </w:tc>
+        <w:tc>
+          <w:tcPr>
+            <w:tcW w:type="dxa" w:w="2160"/>
+          </w:tcPr>
+          <w:p>
+            <w:r>
+              <w:t>Via dbGaP / AnVIL</w:t>
+            </w:r>
+          </w:p>
+        </w:tc>
+        <w:tc>
+          <w:tcPr>
+            <w:tcW w:type="dxa" w:w="2160"/>
+          </w:tcPr>
+          <w:p>
+            <w:r>
+              <w:t>High</w:t>
+            </w:r>
+          </w:p>
+        </w:tc>
+      </w:tr>
+      <w:tr>
+        <w:tc>
+          <w:tcPr>
+            <w:tcW w:type="dxa" w:w="2160"/>
+          </w:tcPr>
+          <w:p>
+            <w:r>
+              <w:t>UK Biobank</w:t>
+            </w:r>
+          </w:p>
+        </w:tc>
+        <w:tc>
+          <w:tcPr>
+            <w:tcW w:type="dxa" w:w="2160"/>
+          </w:tcPr>
+          <w:p>
+            <w:r>
+              <w:t>470K WES + 200K WGS</w:t>
+            </w:r>
+          </w:p>
+        </w:tc>
+        <w:tc>
+          <w:tcPr>
+            <w:tcW w:type="dxa" w:w="2160"/>
+          </w:tcPr>
+          <w:p>
+            <w:r>
+              <w:t>Formal application</w:t>
+            </w:r>
+          </w:p>
+        </w:tc>
+        <w:tc>
+          <w:tcPr>
+            <w:tcW w:type="dxa" w:w="2160"/>
+          </w:tcPr>
+          <w:p>
+            <w:r>
+              <w:t>Medium-high</w:t>
+            </w:r>
+          </w:p>
+        </w:tc>
+      </w:tr>
+      <w:tr>
+        <w:tc>
+          <w:tcPr>
+            <w:tcW w:type="dxa" w:w="2160"/>
+          </w:tcPr>
+          <w:p>
+            <w:r>
+              <w:t>All of Us</w:t>
+            </w:r>
+          </w:p>
+        </w:tc>
+        <w:tc>
+          <w:tcPr>
+            <w:tcW w:type="dxa" w:w="2160"/>
+          </w:tcPr>
+          <w:p>
+            <w:r>
+              <w:t>250K+ WGS diverse ancestry</w:t>
+            </w:r>
+          </w:p>
+        </w:tc>
+        <w:tc>
+          <w:tcPr>
+            <w:tcW w:type="dxa" w:w="2160"/>
+          </w:tcPr>
+          <w:p>
+            <w:r>
+              <w:t>Researcher Workbench (free)</w:t>
+            </w:r>
+          </w:p>
+        </w:tc>
+        <w:tc>
+          <w:tcPr>
+            <w:tcW w:type="dxa" w:w="2160"/>
+          </w:tcPr>
+          <w:p>
+            <w:r>
+              <w:t>Medium</w:t>
+            </w:r>
+          </w:p>
+        </w:tc>
+      </w:tr>
+    </w:tbl>
     <w:p>
       <w:pPr>
         <w:pStyle w:val="Heading3"/>
@@ -1157,31 +2890,199 @@
         <w:t>3C -- Pending Downloads</w:t>
       </w:r>
     </w:p>
-    <w:p>
-      <w:r>
-        <w:t>| File                    | Size     | Source                              | Status  |</w:t>
-      </w:r>
-    </w:p>
-    <w:p>
-      <w:r>
-        <w:t>| ----------------------- | -------- | ----------------------------------- | ------- |</w:t>
-      </w:r>
-    </w:p>
-    <w:p>
-      <w:r>
-        <w:t>| dbNSFP4.7a.zip          | ~30 GB   | Google Drive (registration required) | Pending |</w:t>
-      </w:r>
-    </w:p>
-    <w:p>
-      <w:r>
-        <w:t>| 1000G VCF chr*.vcf.gz   | ~100 GB  | IGSR portal (free)                  | Pending |</w:t>
-      </w:r>
-    </w:p>
-    <w:p>
-      <w:r>
-        <w:t>| SpliceAI scored VCF     | 27 GB    | On Drive                            | Done    |</w:t>
-      </w:r>
-    </w:p>
+    <w:tbl>
+      <w:tblPr>
+        <w:tblStyle w:val="TableGrid"/>
+        <w:tblW w:type="auto" w:w="0"/>
+        <w:tblLook w:firstColumn="1" w:firstRow="1" w:lastColumn="0" w:lastRow="0" w:noHBand="0" w:noVBand="1" w:val="04A0"/>
+      </w:tblPr>
+      <w:tblGrid>
+        <w:gridCol w:w="2160"/>
+        <w:gridCol w:w="2160"/>
+        <w:gridCol w:w="2160"/>
+        <w:gridCol w:w="2160"/>
+      </w:tblGrid>
+      <w:tr>
+        <w:tc>
+          <w:tcPr>
+            <w:tcW w:type="dxa" w:w="2160"/>
+          </w:tcPr>
+          <w:p>
+            <w:r>
+              <w:rPr>
+                <w:b/>
+              </w:rPr>
+              <w:t>File</w:t>
+            </w:r>
+          </w:p>
+        </w:tc>
+        <w:tc>
+          <w:tcPr>
+            <w:tcW w:type="dxa" w:w="2160"/>
+          </w:tcPr>
+          <w:p>
+            <w:r>
+              <w:rPr>
+                <w:b/>
+              </w:rPr>
+              <w:t>Size</w:t>
+            </w:r>
+          </w:p>
+        </w:tc>
+        <w:tc>
+          <w:tcPr>
+            <w:tcW w:type="dxa" w:w="2160"/>
+          </w:tcPr>
+          <w:p>
+            <w:r>
+              <w:rPr>
+                <w:b/>
+              </w:rPr>
+              <w:t>Source</w:t>
+            </w:r>
+          </w:p>
+        </w:tc>
+        <w:tc>
+          <w:tcPr>
+            <w:tcW w:type="dxa" w:w="2160"/>
+          </w:tcPr>
+          <w:p>
+            <w:r>
+              <w:rPr>
+                <w:b/>
+              </w:rPr>
+              <w:t>Status</w:t>
+            </w:r>
+          </w:p>
+        </w:tc>
+      </w:tr>
+      <w:tr>
+        <w:tc>
+          <w:tcPr>
+            <w:tcW w:type="dxa" w:w="2160"/>
+          </w:tcPr>
+          <w:p>
+            <w:r>
+              <w:t>dbNSFP4.7a.zip</w:t>
+            </w:r>
+          </w:p>
+        </w:tc>
+        <w:tc>
+          <w:tcPr>
+            <w:tcW w:type="dxa" w:w="2160"/>
+          </w:tcPr>
+          <w:p>
+            <w:r>
+              <w:t>~30 GB</w:t>
+            </w:r>
+          </w:p>
+        </w:tc>
+        <w:tc>
+          <w:tcPr>
+            <w:tcW w:type="dxa" w:w="2160"/>
+          </w:tcPr>
+          <w:p>
+            <w:r>
+              <w:t>Google Drive (registration required)</w:t>
+            </w:r>
+          </w:p>
+        </w:tc>
+        <w:tc>
+          <w:tcPr>
+            <w:tcW w:type="dxa" w:w="2160"/>
+          </w:tcPr>
+          <w:p>
+            <w:r>
+              <w:t>Pending</w:t>
+            </w:r>
+          </w:p>
+        </w:tc>
+      </w:tr>
+      <w:tr>
+        <w:tc>
+          <w:tcPr>
+            <w:tcW w:type="dxa" w:w="2160"/>
+          </w:tcPr>
+          <w:p>
+            <w:r>
+              <w:t>1000G VCF chr*.vcf.gz</w:t>
+            </w:r>
+          </w:p>
+        </w:tc>
+        <w:tc>
+          <w:tcPr>
+            <w:tcW w:type="dxa" w:w="2160"/>
+          </w:tcPr>
+          <w:p>
+            <w:r>
+              <w:t>~100 GB</w:t>
+            </w:r>
+          </w:p>
+        </w:tc>
+        <w:tc>
+          <w:tcPr>
+            <w:tcW w:type="dxa" w:w="2160"/>
+          </w:tcPr>
+          <w:p>
+            <w:r>
+              <w:t>IGSR portal (free)</w:t>
+            </w:r>
+          </w:p>
+        </w:tc>
+        <w:tc>
+          <w:tcPr>
+            <w:tcW w:type="dxa" w:w="2160"/>
+          </w:tcPr>
+          <w:p>
+            <w:r>
+              <w:t>Pending</w:t>
+            </w:r>
+          </w:p>
+        </w:tc>
+      </w:tr>
+      <w:tr>
+        <w:tc>
+          <w:tcPr>
+            <w:tcW w:type="dxa" w:w="2160"/>
+          </w:tcPr>
+          <w:p>
+            <w:r>
+              <w:t>SpliceAI scored VCF</w:t>
+            </w:r>
+          </w:p>
+        </w:tc>
+        <w:tc>
+          <w:tcPr>
+            <w:tcW w:type="dxa" w:w="2160"/>
+          </w:tcPr>
+          <w:p>
+            <w:r>
+              <w:t>27 GB</w:t>
+            </w:r>
+          </w:p>
+        </w:tc>
+        <w:tc>
+          <w:tcPr>
+            <w:tcW w:type="dxa" w:w="2160"/>
+          </w:tcPr>
+          <w:p>
+            <w:r>
+              <w:t>On Drive</w:t>
+            </w:r>
+          </w:p>
+        </w:tc>
+        <w:tc>
+          <w:tcPr>
+            <w:tcW w:type="dxa" w:w="2160"/>
+          </w:tcPr>
+          <w:p>
+            <w:r>
+              <w:t>Done</w:t>
+            </w:r>
+          </w:p>
+        </w:tc>
+      </w:tr>
+    </w:tbl>
     <w:p>
       <w:r>
         <w:t>---</w:t>
@@ -1284,46 +3185,251 @@
         <w:t>Complexity Reference</w:t>
       </w:r>
     </w:p>
-    <w:p>
-      <w:r>
-        <w:t>| Algorithm                | Training           | Genomic scale                  |</w:t>
-      </w:r>
-    </w:p>
-    <w:p>
-      <w:r>
-        <w:t>| ------------------------ | ------------------ | ------------------------------ |</w:t>
-      </w:r>
-    </w:p>
-    <w:p>
-      <w:r>
-        <w:t>| GBTs (XGBoost/LightGBM)  | O(I\*n\*d\*log n)  | Excellent                      |</w:t>
-      </w:r>
-    </w:p>
-    <w:p>
-      <w:r>
-        <w:t>| MLP / KAN                | O(n\*L\*H^2[\*G])  | Good                           |</w:t>
-      </w:r>
-    </w:p>
-    <w:p>
-      <w:r>
-        <w:t>| ESM-2 (frozen inference) | N/A                | Excellent                      |</w:t>
-      </w:r>
-    </w:p>
-    <w:p>
-      <w:r>
-        <w:t>| GNN (sparse PPI)         | O(G\*(V+E)\*d)     | Excellent -- independent of n  |</w:t>
-      </w:r>
-    </w:p>
-    <w:p>
-      <w:r>
-        <w:t>| Deep Ensemble (M members)| O(M \* base)       | Good                           |</w:t>
-      </w:r>
-    </w:p>
-    <w:p>
-      <w:r>
-        <w:t>| SVM (RBF)                | O(n^2)             | INFEASIBLE above ~100K samples |</w:t>
-      </w:r>
-    </w:p>
+    <w:tbl>
+      <w:tblPr>
+        <w:tblStyle w:val="TableGrid"/>
+        <w:tblW w:type="auto" w:w="0"/>
+        <w:tblLook w:firstColumn="1" w:firstRow="1" w:lastColumn="0" w:lastRow="0" w:noHBand="0" w:noVBand="1" w:val="04A0"/>
+      </w:tblPr>
+      <w:tblGrid>
+        <w:gridCol w:w="2880"/>
+        <w:gridCol w:w="2880"/>
+        <w:gridCol w:w="2880"/>
+      </w:tblGrid>
+      <w:tr>
+        <w:tc>
+          <w:tcPr>
+            <w:tcW w:type="dxa" w:w="2880"/>
+          </w:tcPr>
+          <w:p>
+            <w:r>
+              <w:rPr>
+                <w:b/>
+              </w:rPr>
+              <w:t>Algorithm</w:t>
+            </w:r>
+          </w:p>
+        </w:tc>
+        <w:tc>
+          <w:tcPr>
+            <w:tcW w:type="dxa" w:w="2880"/>
+          </w:tcPr>
+          <w:p>
+            <w:r>
+              <w:rPr>
+                <w:b/>
+              </w:rPr>
+              <w:t>Training</w:t>
+            </w:r>
+          </w:p>
+        </w:tc>
+        <w:tc>
+          <w:tcPr>
+            <w:tcW w:type="dxa" w:w="2880"/>
+          </w:tcPr>
+          <w:p>
+            <w:r>
+              <w:rPr>
+                <w:b/>
+              </w:rPr>
+              <w:t>Genomic scale</w:t>
+            </w:r>
+          </w:p>
+        </w:tc>
+      </w:tr>
+      <w:tr>
+        <w:tc>
+          <w:tcPr>
+            <w:tcW w:type="dxa" w:w="2880"/>
+          </w:tcPr>
+          <w:p>
+            <w:r>
+              <w:t>GBTs (XGBoost/LightGBM)</w:t>
+            </w:r>
+          </w:p>
+        </w:tc>
+        <w:tc>
+          <w:tcPr>
+            <w:tcW w:type="dxa" w:w="2880"/>
+          </w:tcPr>
+          <w:p>
+            <w:r>
+              <w:t>O(I\*n\*d\*log n)</w:t>
+            </w:r>
+          </w:p>
+        </w:tc>
+        <w:tc>
+          <w:tcPr>
+            <w:tcW w:type="dxa" w:w="2880"/>
+          </w:tcPr>
+          <w:p>
+            <w:r>
+              <w:t>Excellent</w:t>
+            </w:r>
+          </w:p>
+        </w:tc>
+      </w:tr>
+      <w:tr>
+        <w:tc>
+          <w:tcPr>
+            <w:tcW w:type="dxa" w:w="2880"/>
+          </w:tcPr>
+          <w:p>
+            <w:r>
+              <w:t>MLP / KAN</w:t>
+            </w:r>
+          </w:p>
+        </w:tc>
+        <w:tc>
+          <w:tcPr>
+            <w:tcW w:type="dxa" w:w="2880"/>
+          </w:tcPr>
+          <w:p>
+            <w:r>
+              <w:t>O(n\*L\*H^2[\*G])</w:t>
+            </w:r>
+          </w:p>
+        </w:tc>
+        <w:tc>
+          <w:tcPr>
+            <w:tcW w:type="dxa" w:w="2880"/>
+          </w:tcPr>
+          <w:p>
+            <w:r>
+              <w:t>Good</w:t>
+            </w:r>
+          </w:p>
+        </w:tc>
+      </w:tr>
+      <w:tr>
+        <w:tc>
+          <w:tcPr>
+            <w:tcW w:type="dxa" w:w="2880"/>
+          </w:tcPr>
+          <w:p>
+            <w:r>
+              <w:t>ESM-2 (frozen inference)</w:t>
+            </w:r>
+          </w:p>
+        </w:tc>
+        <w:tc>
+          <w:tcPr>
+            <w:tcW w:type="dxa" w:w="2880"/>
+          </w:tcPr>
+          <w:p>
+            <w:r>
+              <w:t>N/A</w:t>
+            </w:r>
+          </w:p>
+        </w:tc>
+        <w:tc>
+          <w:tcPr>
+            <w:tcW w:type="dxa" w:w="2880"/>
+          </w:tcPr>
+          <w:p>
+            <w:r>
+              <w:t>Excellent</w:t>
+            </w:r>
+          </w:p>
+        </w:tc>
+      </w:tr>
+      <w:tr>
+        <w:tc>
+          <w:tcPr>
+            <w:tcW w:type="dxa" w:w="2880"/>
+          </w:tcPr>
+          <w:p>
+            <w:r>
+              <w:t>GNN (sparse PPI)</w:t>
+            </w:r>
+          </w:p>
+        </w:tc>
+        <w:tc>
+          <w:tcPr>
+            <w:tcW w:type="dxa" w:w="2880"/>
+          </w:tcPr>
+          <w:p>
+            <w:r>
+              <w:t>O(G\*(V+E)\*d)</w:t>
+            </w:r>
+          </w:p>
+        </w:tc>
+        <w:tc>
+          <w:tcPr>
+            <w:tcW w:type="dxa" w:w="2880"/>
+          </w:tcPr>
+          <w:p>
+            <w:r>
+              <w:t>Excellent -- independent of n</w:t>
+            </w:r>
+          </w:p>
+        </w:tc>
+      </w:tr>
+      <w:tr>
+        <w:tc>
+          <w:tcPr>
+            <w:tcW w:type="dxa" w:w="2880"/>
+          </w:tcPr>
+          <w:p>
+            <w:r>
+              <w:t>Deep Ensemble (M members)</w:t>
+            </w:r>
+          </w:p>
+        </w:tc>
+        <w:tc>
+          <w:tcPr>
+            <w:tcW w:type="dxa" w:w="2880"/>
+          </w:tcPr>
+          <w:p>
+            <w:r>
+              <w:t>O(M \* base)</w:t>
+            </w:r>
+          </w:p>
+        </w:tc>
+        <w:tc>
+          <w:tcPr>
+            <w:tcW w:type="dxa" w:w="2880"/>
+          </w:tcPr>
+          <w:p>
+            <w:r>
+              <w:t>Good</w:t>
+            </w:r>
+          </w:p>
+        </w:tc>
+      </w:tr>
+      <w:tr>
+        <w:tc>
+          <w:tcPr>
+            <w:tcW w:type="dxa" w:w="2880"/>
+          </w:tcPr>
+          <w:p>
+            <w:r>
+              <w:t>SVM (RBF)</w:t>
+            </w:r>
+          </w:p>
+        </w:tc>
+        <w:tc>
+          <w:tcPr>
+            <w:tcW w:type="dxa" w:w="2880"/>
+          </w:tcPr>
+          <w:p>
+            <w:r>
+              <w:t>O(n^2)</w:t>
+            </w:r>
+          </w:p>
+        </w:tc>
+        <w:tc>
+          <w:tcPr>
+            <w:tcW w:type="dxa" w:w="2880"/>
+          </w:tcPr>
+          <w:p>
+            <w:r>
+              <w:t>INFEASIBLE above ~100K samples</w:t>
+            </w:r>
+          </w:p>
+        </w:tc>
+      </w:tr>
+    </w:tbl>
     <w:p>
       <w:r>
         <w:t>SVM is excluded from all production runs (n &gt; 100K).</w:t>
@@ -1492,6 +3598,199 @@
       </w:r>
     </w:p>
     <w:p>
+      <w:r>
+        <w:t>Delivered 2026-06-14 (6a05481) -- schema agent ACTIVATED + generic enabler:</w:t>
+      </w:r>
+    </w:p>
+    <w:p>
+      <w:r>
+        <w:t>SchemaDriftMonitorAgent.from_default_baseline loads the SchemaDriftAgent detector from the canonical</w:t>
+      </w:r>
+    </w:p>
+    <w:p>
+      <w:r>
+        <w:t>baseline (data/reference/schema/schema_baseline.json; same path as run_schema_drift_check.py +</w:t>
+      </w:r>
+    </w:p>
+    <w:p>
+      <w:r>
+        <w:t>build_schema_baseline.py), and Orchestrator now prefers from_default_baseline(state) when the class</w:t>
+      </w:r>
+    </w:p>
+    <w:p>
+      <w:r>
+        <w:t>defines it (else cls(state)). The schema agent runs active detection once a matrix is supplied</w:t>
+      </w:r>
+    </w:p>
+    <w:p>
+      <w:r>
+        <w:t>(arg -&gt; GVC_SCHEMA_CURRENT_MATRIX env); it is no longer awaiting its *baseline*, only its run-time</w:t>
+      </w:r>
+    </w:p>
+    <w:p>
+      <w:r>
+        <w:t>*matrix*. The orchestrator hook is the single generic enabler the other seven reuse -- each just defines</w:t>
+      </w:r>
+    </w:p>
+    <w:p>
+      <w:r>
+        <w:t>from_default_baseline. Buildability split for the seven: BUILDABLE NOW (no trained model) =</w:t>
+      </w:r>
+    </w:p>
+    <w:p>
+      <w:r>
+        <w:t>LabelShift (reference label distribution from cohort labels), Infrastructure (pinned packages + DAG hash),</w:t>
+      </w:r>
+    </w:p>
+    <w:p>
+      <w:r>
+        <w:t>likely AnnotationPolicy + AdversarialSubmission (config/heuristic references); RUN-17-DEPENDENT (need</w:t>
+      </w:r>
+    </w:p>
+    <w:p>
+      <w:r>
+        <w:t>predictions) = Concept (NannyML CBPE AUROC + BBSE), Calibration (per-class posteriors + ECE),</w:t>
+      </w:r>
+    </w:p>
+    <w:p>
+      <w:r>
+        <w:t>FairnessSubgroup (per-subgroup predictions). Verified end-to-end: test_schema_drift_baseline.py</w:t>
+      </w:r>
+    </w:p>
+    <w:p>
+      <w:r>
+        <w:t>(5 tests -- green/red/awaiting/env/bare), suite 1009.</w:t>
+      </w:r>
+    </w:p>
+    <w:p>
+      <w:r>
+        <w:t>**Delivered 2026-06-14 (continued) -- drift-baseline campaign + FeatureCoverageSentinel (c0dec47, a7abca0,</w:t>
+      </w:r>
+    </w:p>
+    <w:p>
+      <w:r>
+        <w:t>469a7b6, e4f96df, e61a2dc, 8206673, 376aa2e):** the buildability split above is resolved. ACTIVE NOW</w:t>
+      </w:r>
+    </w:p>
+    <w:p>
+      <w:r>
+        <w:t>(model-free / config-threshold): Infrastructure (a7abca0), AnnotationPolicy + AdversarialSubmission</w:t>
+      </w:r>
+    </w:p>
+    <w:p>
+      <w:r>
+        <w:t>(469a7b6), plus Schema. MACHINERY-READY (real baseline at Run-17): LabelShift (c0dec47). A NINTH drift</w:t>
+      </w:r>
+    </w:p>
+    <w:p>
+      <w:r>
+        <w:t>agent, FeatureCoverageSentinel, was built/tested/wired/activated against the split-health audit reference</w:t>
+      </w:r>
+    </w:p>
+    <w:p>
+      <w:r>
+        <w:t>(54/42/96): feature_health shared module (e4f96df), detector (e61a2dc), builder + monitor (8206673),</w:t>
+      </w:r>
+    </w:p>
+    <w:p>
+      <w:r>
+        <w:t>orchestrator wiring + the drift pipeline (376aa2e). REMAINING (RUN-17-DEPENDENT, need model predictions):</w:t>
+      </w:r>
+    </w:p>
+    <w:p>
+      <w:r>
+        <w:t>Concept (NannyML CBPE + BBSE), Calibration (per-class posteriors + ECE), FairnessSubgroup (per-subgroup</w:t>
+      </w:r>
+    </w:p>
+    <w:p>
+      <w:r>
+        <w:t>predictions) -- machinery next. Suite 1009 -&gt; 1063.</w:t>
+      </w:r>
+    </w:p>
+    <w:p>
+      <w:r>
+        <w:t>Delivered 2026-06-14 (trio) -- Concept + Calibration + FairnessSubgroup activated (19fb2a0): the three</w:t>
+      </w:r>
+    </w:p>
+    <w:p>
+      <w:r>
+        <w:t>RUN-17-DEPENDENT detectors gained detector from_baseline + monitor from_default_baseline (same pattern as</w:t>
+      </w:r>
+    </w:p>
+    <w:p>
+      <w:r>
+        <w:t>Schema/LabelShift/FeatureCoverage; orchestrator hook 6a05481 routes them). Builders: build_concept_baseline.py</w:t>
+      </w:r>
+    </w:p>
+    <w:p>
+      <w:r>
+        <w:t>(thin writer for the two CBPE scalars), build_calibration_baseline.py (computes baseline_ece via the detector's</w:t>
+      </w:r>
+    </w:p>
+    <w:p>
+      <w:r>
+        <w:t>OWN detect() -&gt; single code path), build_fairness_baseline.py (p_train_per_stratum from reference predictions +</w:t>
+      </w:r>
+    </w:p>
+    <w:p>
+      <w:r>
+        <w:t>axes). 20 tests; suite 1063 -&gt; 1083. DRIFT SET NOW 8 of 8 WIRED + FeatureCoverageSentinel (9th): 5 ACTIVE,</w:t>
+      </w:r>
+    </w:p>
+    <w:p>
+      <w:r>
+        <w:t>4 machinery-complete (LabelShift + the trio) awaiting Run-17 model artifacts. FairnessSubgroup PHASE_2 stubs</w:t>
+      </w:r>
+    </w:p>
+    <w:p>
+      <w:r>
+        <w:t>unchanged + documented (per-stratum AUROC proxy; max_dpd_change=0.0 pinned by test_dpd_stub_is_zero).</w:t>
+      </w:r>
+    </w:p>
+    <w:p>
+      <w:pPr>
+        <w:pStyle w:val="ListBullet"/>
+      </w:pPr>
+      <w:r>
+        <w:t>Test-gate finding (2026-06-14): flaky pre-existing warning inflates the count. Two back-to-back</w:t>
+      </w:r>
+    </w:p>
+    <w:p>
+      <w:r>
+        <w:t>pytest -q runs gave 41 then 141 warnings. The +100 is a benign, FLAKY sklearn UserWarning</w:t>
+      </w:r>
+    </w:p>
+    <w:p>
+      <w:r>
+        <w:t>(sklearn.utils.parallel.delayed ... parallel.py:144) from test_correctness_harness.py:</w:t>
+      </w:r>
+    </w:p>
+    <w:p>
+      <w:r>
+        <w:t>run_correctness_harness builds EnsembleConfig(skip_svm=...) with the default n_jobs=-1, so the Stage-1</w:t>
+      </w:r>
+    </w:p>
+    <w:p>
+      <w:r>
+        <w:t>smoke fits the tiny slice via loky Parallel; loky emits the warning per worker dispatch (0..~100). NOT a</w:t>
+      </w:r>
+    </w:p>
+    <w:p>
+      <w:r>
+        <w:t>regression; no pass/fail impact. The DETERMINISTIC baseline stays 41. Proposed fix: pass n_jobs=1 into</w:t>
+      </w:r>
+    </w:p>
+    <w:p>
+      <w:r>
+        <w:t>the harness smoke's EnsembleConfig (tiny-slice parallelism is pointless) -&gt; deterministic + faster + no</w:t>
+      </w:r>
+    </w:p>
+    <w:p>
+      <w:r>
+        <w:t>loky warning. Low-risk, single-line. FIXED 2026-06-14 (fe2289d) -- both back-to-back pytest -q runs now stable at 1083 passed / 6 skipped / 41 warnings (the +100 parallel.delayed block gone); the 5 test_correctness_harness stages still pass.</w:t>
+      </w:r>
+    </w:p>
+    <w:p>
       <w:pPr>
         <w:pStyle w:val="Heading3"/>
       </w:pPr>
@@ -1514,7 +3813,12 @@
     </w:p>
     <w:p>
       <w:r>
-        <w:t>the four framework agents).</w:t>
+        <w:t>the four framework agents). **[RESOLVED 2026-06-14 (376aa2e):</w:t>
+      </w:r>
+    </w:p>
+    <w:p>
+      <w:r>
+        <w:t>PIPELINE_DEFINITIONS["drift"] now lists all 9 drift agents; reachable via --pipeline drift.]**</w:t>
       </w:r>
     </w:p>
     <w:p>
@@ -1561,17 +3865,22 @@
         <w:pStyle w:val="ListBullet"/>
       </w:pPr>
       <w:r>
-        <w:t>[ ] Pipeline-wire the drift agents. Add a drift key to PIPELINE_DEFINITIONS listing the</w:t>
-      </w:r>
-    </w:p>
-    <w:p>
-      <w:r>
-        <w:t>eight MonitorAgents, reachable via run_agents.py --pipeline drift. They are registered but</w:t>
-      </w:r>
-    </w:p>
-    <w:p>
-      <w:r>
-        <w:t>currently unreachable from any CLI path.</w:t>
+        <w:t>[x] Pipeline-wire the drift agents -- DONE 2026-06-14 (376aa2e). PIPELINE_DEFINITIONS["drift"]</w:t>
+      </w:r>
+    </w:p>
+    <w:p>
+      <w:r>
+        <w:t>now lists all NINE drift MonitorAgents (the eight + FeatureCoverageSentinelMonitorAgent), reachable via</w:t>
+      </w:r>
+    </w:p>
+    <w:p>
+      <w:r>
+        <w:t>run_agents.py --pipeline drift (run_agents builds --pipeline choices from PIPELINE_DEFINITIONS.keys()).</w:t>
+      </w:r>
+    </w:p>
+    <w:p>
+      <w:r>
+        <w:t>Verified live: the dry-run drift pipeline runs all 9 agents.</w:t>
       </w:r>
     </w:p>
     <w:p>
@@ -1579,7 +3888,7 @@
         <w:pStyle w:val="ListBullet"/>
       </w:pPr>
       <w:r>
-        <w:t>[ ] Fix drift_monitor.yml. Repoint the stale outputs/phase2_with_gnomad/splits/ -&gt;</w:t>
+        <w:t>[x] Fix drift_monitor.yml -- DONE 2026-06-14 (partial; path + honest GDrive skip). Stale outputs/phase2_with_gnomad/splits/ -&gt; outputs/run15_rerun_report/full/splits/ (6 occurrences); GDrive stub no longer fabricates a 'credentials loaded' message (the skip is logged). REMAINING: a real rclone/gdown fetch (still a placeholder). Original note: Repoint the stale outputs/phase2_with_gnomad/splits/ -&gt;</w:t>
       </w:r>
     </w:p>
     <w:p>
@@ -1597,7 +3906,7 @@
         <w:pStyle w:val="ListBullet"/>
       </w:pPr>
       <w:r>
-        <w:t>[ ] Add the schema gate as a drift_monitor.yml step. Run scripts/run_schema_drift_check.py</w:t>
+        <w:t>[x] Add the schema gate as a drift_monitor.yml step -- DONE 2026-06-14. A GUARDED step runs scripts/run_schema_drift_check.py --matrix .../X_train.parquet (exit 0/2/3), skipping honestly when baseline/matrix are absent. REMAINING: tighten to gate-the-job on exit-2 (currently continue-on-error, matching the job's notify-not-fail design). Original note: Run scripts/run_schema_drift_check.py</w:t>
       </w:r>
     </w:p>
     <w:p>
@@ -1630,6 +3939,103 @@
     </w:p>
     <w:p>
       <w:pPr>
+        <w:pStyle w:val="ListBullet"/>
+      </w:pPr>
+      <w:r>
+        <w:t>Delivered 2026-06-14 -- ReclassificationSentinel (10th drift agent). clinvar_tracker-backed label-drift</w:t>
+      </w:r>
+    </w:p>
+    <w:p>
+      <w:r>
+        <w:t>sentinel (b6e5958 detector / 9662569 monitor + reference builder / 0c6c049 wiring); 17 tests. DRIFT SET NOW</w:t>
+      </w:r>
+    </w:p>
+    <w:p>
+      <w:r>
+        <w:t>10 of 10 WIRED. Run-17-gated: the (variant_id, split) reference (build_reclassification_reference.py against</w:t>
+      </w:r>
+    </w:p>
+    <w:p>
+      <w:r>
+        <w:t>the real splits) + the OLD/NEW ClinVar release parquets.</w:t>
+      </w:r>
+    </w:p>
+    <w:p>
+      <w:pPr>
+        <w:pStyle w:val="ListBullet"/>
+      </w:pPr>
+      <w:r>
+        <w:t>Reconcile finding (a) -- pandera effectively required. The agent-layer drift pipeline cannot construct</w:t>
+      </w:r>
+    </w:p>
+    <w:p>
+      <w:r>
+        <w:t>SchemaDriftMonitorAgent.from_default_baseline without pandera (from_baseline imports it), despite the</w:t>
+      </w:r>
+    </w:p>
+    <w:p>
+      <w:r>
+        <w:t>"optional dep" docstring. No functional gap (the monthly job uses run_drift_monitor.py), but graceful</w:t>
+      </w:r>
+    </w:p>
+    <w:p>
+      <w:r>
+        <w:t>from_baseline/detect degradation is a decision for this reconcile work. CI tests guard it with</w:t>
+      </w:r>
+    </w:p>
+    <w:p>
+      <w:r>
+        <w:t>importorskip("pandera") (5a6b0d0); see INCIDENT_2026-06-11 + its 2026-06-14 recurrence.</w:t>
+      </w:r>
+    </w:p>
+    <w:p>
+      <w:pPr>
+        <w:pStyle w:val="ListBullet"/>
+      </w:pPr>
+      <w:r>
+        <w:t>Reconcile finding (b) -- legacy meta_TEST mislabel. run_drift_monitor.run_label_drift reads</w:t>
+      </w:r>
+    </w:p>
+    <w:p>
+      <w:r>
+        <w:t>meta_TEST.parquet and assigns those ids to training_variant_ids, so its flip_rate_training is the TEST-set</w:t>
+      </w:r>
+    </w:p>
+    <w:p>
+      <w:r>
+        <w:t>rate. The new ReclassificationSentinel does per-split extraction correctly; consolidate the two.</w:t>
+      </w:r>
+    </w:p>
+    <w:p>
+      <w:pPr>
+        <w:pStyle w:val="ListBullet"/>
+      </w:pPr>
+      <w:r>
+        <w:t>Infra note (2026-06-14). The repo's data/ was a Windows Junction -&gt; G:\My Drive\...\data (Google Drive</w:t>
+      </w:r>
+    </w:p>
+    <w:p>
+      <w:r>
+        <w:t>for Desktop) and dangled when G: was unmounted, failing 20 tests via the fail-loud guard. Restored via</w:t>
+      </w:r>
+    </w:p>
+    <w:p>
+      <w:r>
+        <w:t>git checkout -- data/ -&gt; data/ is now a PLAIN LOCAL dir (see INCIDENT_2026-06-14_data-junction-dangling).</w:t>
+      </w:r>
+    </w:p>
+    <w:p>
+      <w:r>
+        <w:t>Large untracked assets remain on G: -- re-hydrate before any real run. Recommend local data//outputs/ +</w:t>
+      </w:r>
+    </w:p>
+    <w:p>
+      <w:r>
+        <w:t>rclone genvarcla: for durability, NOT a live G: junction. Check outputs/ for the same dangling condition.</w:t>
+      </w:r>
+    </w:p>
+    <w:p>
+      <w:pPr>
         <w:pStyle w:val="Heading3"/>
       </w:pPr>
       <w:r>
@@ -1976,7 +4382,7 @@
     </w:p>
     <w:p>
       <w:r>
-        <w:t>post-Run-16 X_train. Target = EXPECTED_TABULAR_FEATURE_COUNT (now 81: +esm2_llr +maxentscan_delta</w:t>
+        <w:t>post-Run-16 X_train. Target = EXPECTED_TABULAR_FEATURE_COUNT (now 82: +esm2_llr +maxentscan_delta +hetero_gnn_score</w:t>
       </w:r>
     </w:p>
     <w:p>
@@ -2353,12 +4759,12 @@
         <w:pStyle w:val="ListBullet"/>
       </w:pPr>
       <w:r>
-        <w:t>Track A: 1000 Genomes AF -- build_1kg_parquet.py + --kg-path + validate AF-fill;</w:t>
-      </w:r>
-    </w:p>
-    <w:p>
-      <w:r>
-        <w:t>resolve af_1kg_* per-population stubs (wire or formally retire).</w:t>
+        <w:t>Track A: 1000 Genomes AF -- build_1kg_parquet.py + --kg &lt;per-superpop AF parquet&gt; + validate AF-fill (fill_population_af, a0ce407);</w:t>
+      </w:r>
+    </w:p>
+    <w:p>
+      <w:r>
+        <w:t>af_1kg_* per-population columns WIRED 2026-06-13 (a0ce407); activation = per-superpopulation AF parquet via --kg.</w:t>
       </w:r>
     </w:p>
     <w:p>
@@ -2382,6 +4788,327 @@
     <w:p>
       <w:r>
         <w:t>integrity verification before Run 17 trains.</w:t>
+      </w:r>
+    </w:p>
+    <w:p>
+      <w:pPr>
+        <w:pStyle w:val="Heading2"/>
+      </w:pPr>
+      <w:r>
+        <w:t>2026-06-14 (continued) -- data-source registry, freshness monitor, dead-agent audit, proposed-agent roadmap</w:t>
+      </w:r>
+    </w:p>
+    <w:p>
+      <w:pPr>
+        <w:pStyle w:val="Heading3"/>
+      </w:pPr>
+      <w:r>
+        <w:t>Delivered (wired + healthy)</w:t>
+      </w:r>
+    </w:p>
+    <w:p>
+      <w:pPr>
+        <w:pStyle w:val="ListBullet"/>
+      </w:pPr>
+      <w:r>
+        <w:t>monitoring/registry.py: single source of truth, 24 sources (11 ACTIVE, 7 probeable). FinnGen R12-&gt;R14 (embargo).</w:t>
+      </w:r>
+    </w:p>
+    <w:p>
+      <w:pPr>
+        <w:pStyle w:val="ListBullet"/>
+      </w:pPr>
+      <w:r>
+        <w:t>DatabaseFreshnessMonitorAgent: registry-driven HITL freshness over ALL DBs; 'database_monitor' pipeline +</w:t>
+      </w:r>
+    </w:p>
+    <w:p>
+      <w:r>
+        <w:t>'full' + weekly workflow + documented FRESHNESS report. Supersedes DataFreshnessAgent's 4-source polling.</w:t>
+      </w:r>
+    </w:p>
+    <w:p>
+      <w:pPr>
+        <w:pStyle w:val="ListBullet"/>
+      </w:pPr>
+      <w:r>
+        <w:t>Dead-agent audit closed: both gcloud-dataproc dead paths neutralized; InterpretabilityAgent tested; dead dep</w:t>
+      </w:r>
+    </w:p>
+    <w:p>
+      <w:r>
+        <w:t>dropped. 'all' pipeline + cadence semantics documented. No dead agents.</w:t>
+      </w:r>
+    </w:p>
+    <w:p>
+      <w:pPr>
+        <w:pStyle w:val="Heading3"/>
+      </w:pPr>
+      <w:r>
+        <w:t>Proposed agents (Phase D/E -- assessed 2026-06-14, NOT yet built; awaiting go-ahead) -- priority order:</w:t>
+      </w:r>
+    </w:p>
+    <w:p>
+      <w:pPr>
+        <w:pStyle w:val="ListNumber"/>
+      </w:pPr>
+      <w:r>
+        <w:t>ModelInsightsAgent (HIGH value, LOW risk, read-only): post-run, ingest each base model's OOF + metrics</w:t>
+      </w:r>
+    </w:p>
+    <w:p>
+      <w:r>
+        <w:t>(AUROC/AUPRC/MCC/Brier/calibration) + SHAP + the per-model algorithm comparison; produce a DOCUMENTED per-model</w:t>
+      </w:r>
+    </w:p>
+    <w:p>
+      <w:r>
+        <w:t>comparison report, alert significant findings, FLAG leakage/over-fit (e.g. suspiciously high AUROC -&gt;</w:t>
+      </w:r>
+    </w:p>
+    <w:p>
+      <w:r>
+        <w:t>n_pathogenic_in_gene-style memorization). GUARDRAIL: diagnostics + integrity flags only; does NOT auto-tune</w:t>
+      </w:r>
+    </w:p>
+    <w:p>
+      <w:r>
+        <w:t>toward higher AUROC (scientific-integrity-over-metrics). Reuses evaluator.py + shap_utils + metrics glossary.</w:t>
+      </w:r>
+    </w:p>
+    <w:p>
+      <w:pPr>
+        <w:pStyle w:val="ListNumber"/>
+      </w:pPr>
+      <w:r>
+        <w:t>DataReadinessAgent (HIGH value, MED risk): pre-run, orchestrate the existing audits (feature-health, smoke</w:t>
+      </w:r>
+    </w:p>
+    <w:p>
+      <w:r>
+        <w:t>population, schema-drift, FeatureCoverageSentinel) + freshness monitor + critical_assets() into ONE documented</w:t>
+      </w:r>
+    </w:p>
+    <w:p>
+      <w:r>
+        <w:t>pre-run readiness gate; HITL-block a run if data is stale/degenerate/silent-stubbed. INVOKES + VERIFIES +</w:t>
+      </w:r>
+    </w:p>
+    <w:p>
+      <w:r>
+        <w:t>DOCUMENTS real_data_prep.py (no silent data mutation).</w:t>
+      </w:r>
+    </w:p>
+    <w:p>
+      <w:pPr>
+        <w:pStyle w:val="ListNumber"/>
+      </w:pPr>
+      <w:r>
+        <w:t>GpuOrchestratorAgent / FinOps (HIGH value, HIGH risk): cross-platform (Vast.ai + RunPod) preflight + optimal</w:t>
+      </w:r>
+    </w:p>
+    <w:p>
+      <w:r>
+        <w:t>instance selection ($/hr x reliability x dlperf x mem) + run init + auto-terminate + billing report. RunPod is</w:t>
+      </w:r>
+    </w:p>
+    <w:p>
+      <w:r>
+        <w:t>NET-NEW (zero code today). COST-SAFETY: HITL-approve before provisioning (real money); budget caps;</w:t>
+      </w:r>
+    </w:p>
+    <w:p>
+      <w:r>
+        <w:t>confirm-on-terminate; never auto-spend. Build LAST + most carefully.</w:t>
+      </w:r>
+    </w:p>
+    <w:p>
+      <w:pPr>
+        <w:pStyle w:val="ListNumber"/>
+      </w:pPr>
+      <w:r>
+        <w:t>AgentOpsMonitor (meta): ONE FLAT heartbeat/last-run/error-rate monitor over agent_state.json (alerts on</w:t>
+      </w:r>
+    </w:p>
+    <w:p>
+      <w:r>
+        <w:t>staleness/error/conflict/perf-drift); monitors itself too. NOT recursive (no agent-of-agent tower).</w:t>
+      </w:r>
+    </w:p>
+    <w:p>
+      <w:pPr>
+        <w:pStyle w:val="Heading2"/>
+      </w:pPr>
+      <w:r>
+        <w:t>Proposed-agent roadmap -- update 2026-06-14</w:t>
+      </w:r>
+    </w:p>
+    <w:p>
+      <w:pPr>
+        <w:pStyle w:val="ListBullet"/>
+      </w:pPr>
+      <w:r>
+        <w:t>[DONE] ModelInsightsAgent (was: proposed #1, HIGH value / LOW risk). Shipped read-only per-model comparison +</w:t>
+      </w:r>
+    </w:p>
+    <w:p>
+      <w:r>
+        <w:t>integrity monitor over run OOF. Next proposed agents remain: DataReadinessAgent (#2, pre-run gate orchestrating</w:t>
+      </w:r>
+    </w:p>
+    <w:p>
+      <w:r>
+        <w:t>existing audits), GpuOrchestratorAgent/FinOps (#3, cross-platform Vast.ai+RunPod, cost-safety HITL, build LAST),</w:t>
+      </w:r>
+    </w:p>
+    <w:p>
+      <w:r>
+        <w:t>AgentOpsMonitor (#4, flat heartbeat/error-rate meta-monitor over agent_state.json).</w:t>
+      </w:r>
+    </w:p>
+    <w:p>
+      <w:pPr>
+        <w:pStyle w:val="Heading2"/>
+      </w:pPr>
+      <w:r>
+        <w:t>Proposed-agent roadmap -- update 2026-06-14</w:t>
+      </w:r>
+    </w:p>
+    <w:p>
+      <w:pPr>
+        <w:pStyle w:val="ListBullet"/>
+      </w:pPr>
+      <w:r>
+        <w:t>[DONE] DataReadinessAgent (was: proposed #2). Shipped verify-only pre-run readiness gate (assets + feature</w:t>
+      </w:r>
+    </w:p>
+    <w:p>
+      <w:r>
+        <w:t>health -&gt; GO/NO_GO, HITL override). Remaining: AgentOpsMonitor (#4, flat heartbeat/error-rate meta-monitor over</w:t>
+      </w:r>
+    </w:p>
+    <w:p>
+      <w:r>
+        <w:t>agent_state.json -- LOWER risk, recommended next) and GpuOrchestratorAgent/FinOps (#3, cross-platform</w:t>
+      </w:r>
+    </w:p>
+    <w:p>
+      <w:r>
+        <w:t>Vast.ai+RunPod, cost-safety HITL -- HIGHEST risk, build LAST). Optional follow-up for DataReadinessAgent:</w:t>
+      </w:r>
+    </w:p>
+    <w:p>
+      <w:r>
+        <w:t>active-invocation mode (shell out to smoke_all_models / preflight_gate with HITL) if desired.</w:t>
+      </w:r>
+    </w:p>
+    <w:p>
+      <w:pPr>
+        <w:pStyle w:val="Heading2"/>
+      </w:pPr>
+      <w:r>
+        <w:t>Proposed-agent roadmap -- update 2026-06-14</w:t>
+      </w:r>
+    </w:p>
+    <w:p>
+      <w:pPr>
+        <w:pStyle w:val="ListBullet"/>
+      </w:pPr>
+      <w:r>
+        <w:t>[DONE] AgentOpsMonitorAgent (was: proposed #4). Shipped flat heartbeat/backlog/flags meta-monitor. Only</w:t>
+      </w:r>
+    </w:p>
+    <w:p>
+      <w:r>
+        <w:t>GpuOrchestratorAgent/FinOps (#3) remains: cross-platform Vast.ai+RunPod preflight + optimal instance selection</w:t>
+      </w:r>
+    </w:p>
+    <w:p>
+      <w:pPr>
+        <w:pStyle w:val="ListBullet"/>
+      </w:pPr>
+      <w:r>
+        <w:t>auto-terminate + billing -- HIGHEST risk (provisions paid infra), build LAST and only behind cost-safety</w:t>
+      </w:r>
+    </w:p>
+    <w:p>
+      <w:r>
+        <w:t>guardrails (HITL-approve before spend, budget caps, confirm-on-terminate, never auto-spend). Recommend a design</w:t>
+      </w:r>
+    </w:p>
+    <w:p>
+      <w:r>
+        <w:t>review before building it.</w:t>
+      </w:r>
+    </w:p>
+    <w:p>
+      <w:pPr>
+        <w:pStyle w:val="ListBullet"/>
+      </w:pPr>
+      <w:r>
+        <w:t>Optional follow-up (enables AgentOpsMonitor error-rate/perf-drift): add orchestrator run-telemetry to a new</w:t>
+      </w:r>
+    </w:p>
+    <w:p>
+      <w:r>
+        <w:t>'agent_runs' state section (per-run status/duration/error), then extend the ops detector.</w:t>
+      </w:r>
+    </w:p>
+    <w:p>
+      <w:pPr>
+        <w:pStyle w:val="Heading2"/>
+      </w:pPr>
+      <w:r>
+        <w:t>Proposed-agent roadmap -- update 2026-06-14</w:t>
+      </w:r>
+    </w:p>
+    <w:p>
+      <w:pPr>
+        <w:pStyle w:val="ListBullet"/>
+      </w:pPr>
+      <w:r>
+        <w:t>[DONE] agent_runs telemetry follow-up: AgentOpsMonitor error-rate + perf-drift now backed by real</w:t>
+      </w:r>
+    </w:p>
+    <w:p>
+      <w:r>
+        <w:t>orchestrator-recorded telemetry (was the documented gap). Only GpuOrchestratorAgent/FinOps (#3) remains --</w:t>
+      </w:r>
+    </w:p>
+    <w:p>
+      <w:r>
+        <w:t>highest risk (provisions paid infra); recommend a design review before building (ground the existing Vast.ai</w:t>
+      </w:r>
+    </w:p>
+    <w:p>
+      <w:r>
+        <w:t>workflow + RunPod gap + cost-safety guardrails: HITL-approve before spend, budget caps, confirm-on-terminate).</w:t>
+      </w:r>
+    </w:p>
+    <w:p>
+      <w:pPr>
+        <w:pStyle w:val="Heading2"/>
+      </w:pPr>
+      <w:r>
+        <w:t>Proposed-agent roadmap -- update 2026-06-14</w:t>
+      </w:r>
+    </w:p>
+    <w:p>
+      <w:pPr>
+        <w:pStyle w:val="ListBullet"/>
+      </w:pPr>
+      <w:r>
+        <w:t>GpuOrchestratorAgent/FinOps (#3): DESIGN REVIEW landed (docs/design/GPU_FINOPS_DESIGN.md). Decision pending --</w:t>
+      </w:r>
+    </w:p>
+    <w:p>
+      <w:r>
+        <w:t>recommend-only/emit-only advisor (zero spend, reuses launch_run16.pick_offer) recommended as the first slice;</w:t>
+      </w:r>
+    </w:p>
+    <w:p>
+      <w:r>
+        <w:t>autonomous provisioning gated behind a separate sign-off. No money-adjacent code until confirmed.</w:t>
       </w:r>
     </w:p>
     <w:sectPr>

</xml_diff>